<commit_message>
Step-by-step script: add cross-validated confusion matrices (PCA-LDA, PLS-DA) with sensitivity/specificity
Co-Authored-By: Claude Opus 5.5 <noreply@anthropic.com>
Claude-Session: https://claude.ai/code/session_01L8hQ8e5u5KmaH4dD9snyRw
</commit_message>
<xml_diff>
--- a/Acacia_PCA_LDA_Explained_Code.docx
+++ b/Acacia_PCA_LDA_Explained_Code.docx
@@ -47,7 +47,7 @@
         <w:spacing w:after="40"/>
       </w:pPr>
       <w:r>
-        <w:t>4. Run the file. Data are read from C:\Users\Hira Aman\Downloads\CODE 005 and the figure opens in a window. Fig_PCA_LDA_large.png / .tiff, the score tables PCA_LDA_scores_fingerprint.csv / PCA_LDA_scores_CH.csv and PCA_LDA_summary.txt are saved in CODE 005\RESULTS.</w:t>
+        <w:t>4. Run the file. Data are read from C:\Users\Hira Aman\Downloads\CODE 005 and both figures open in windows. Fig_PCA_LDA_large.png / .tiff, Fig_ConfusionMatrices.png / .tiff, CV_accuracy.csv, the score tables PCA_LDA_scores_fingerprint.csv / PCA_LDA_scores_CH.csv and PCA_LDA_summary.txt are saved in CODE 005\RESULTS.</w:t>
       </w:r>
     </w:p>
     <w:p>
@@ -182,6 +182,32 @@
           <w:sz w:val="15"/>
           <w:noProof/>
         </w:rPr>
+        <w:t># and a second figure with the cross-validated confusion matrices (PCA-LDA and</w:t>
+      </w:r>
+    </w:p>
+    <w:p>
+      <w:pPr>
+        <w:spacing w:before="0" w:after="0" w:line="240" w:lineRule="auto"/>
+      </w:pPr>
+      <w:r>
+        <w:rPr>
+          <w:rFonts w:ascii="Consolas" w:hAnsi="Consolas" w:eastAsia="Consolas" w:cs="Consolas"/>
+          <w:sz w:val="15"/>
+          <w:noProof/>
+        </w:rPr>
+        <w:t># PLS-DA, fingerprint and CH-stretching) - STEP 5.</w:t>
+      </w:r>
+    </w:p>
+    <w:p>
+      <w:pPr>
+        <w:spacing w:before="0" w:after="0" w:line="240" w:lineRule="auto"/>
+      </w:pPr>
+      <w:r>
+        <w:rPr>
+          <w:rFonts w:ascii="Consolas" w:hAnsi="Consolas" w:eastAsia="Consolas" w:cs="Consolas"/>
+          <w:sz w:val="15"/>
+          <w:noProof/>
+        </w:rPr>
         <w:t>#</w:t>
       </w:r>
     </w:p>
@@ -403,6 +429,32 @@
           <w:sz w:val="15"/>
           <w:noProof/>
         </w:rPr>
+        <w:t>#   Fig_ConfusionMatrices.png / .tiff    cross-validated confusion matrices (600 dpi)</w:t>
+      </w:r>
+    </w:p>
+    <w:p>
+      <w:pPr>
+        <w:spacing w:before="0" w:after="0" w:line="240" w:lineRule="auto"/>
+      </w:pPr>
+      <w:r>
+        <w:rPr>
+          <w:rFonts w:ascii="Consolas" w:hAnsi="Consolas" w:eastAsia="Consolas" w:cs="Consolas"/>
+          <w:sz w:val="15"/>
+          <w:noProof/>
+        </w:rPr>
+        <w:t>#   CV_accuracy.csv                      accuracy, sensitivity, specificity</w:t>
+      </w:r>
+    </w:p>
+    <w:p>
+      <w:pPr>
+        <w:spacing w:before="0" w:after="0" w:line="240" w:lineRule="auto"/>
+      </w:pPr>
+      <w:r>
+        <w:rPr>
+          <w:rFonts w:ascii="Consolas" w:hAnsi="Consolas" w:eastAsia="Consolas" w:cs="Consolas"/>
+          <w:sz w:val="15"/>
+          <w:noProof/>
+        </w:rPr>
         <w:t>#   PCA_LDA_summary.txt                  all numbers printed by the script</w:t>
       </w:r>
     </w:p>
@@ -622,6 +674,58 @@
           <w:sz w:val="15"/>
           <w:noProof/>
         </w:rPr>
+        <w:t>from sklearn.cross_decomposition import PLSRegression</w:t>
+      </w:r>
+    </w:p>
+    <w:p>
+      <w:pPr>
+        <w:spacing w:before="0" w:after="0" w:line="240" w:lineRule="auto"/>
+      </w:pPr>
+      <w:r>
+        <w:rPr>
+          <w:rFonts w:ascii="Consolas" w:hAnsi="Consolas" w:eastAsia="Consolas" w:cs="Consolas"/>
+          <w:sz w:val="15"/>
+          <w:noProof/>
+        </w:rPr>
+        <w:t>from sklearn.preprocessing import StandardScaler</w:t>
+      </w:r>
+    </w:p>
+    <w:p>
+      <w:pPr>
+        <w:spacing w:before="0" w:after="0" w:line="240" w:lineRule="auto"/>
+      </w:pPr>
+      <w:r>
+        <w:rPr>
+          <w:rFonts w:ascii="Consolas" w:hAnsi="Consolas" w:eastAsia="Consolas" w:cs="Consolas"/>
+          <w:sz w:val="15"/>
+          <w:noProof/>
+        </w:rPr>
+        <w:t>from sklearn.model_selection import StratifiedGroupKFold</w:t>
+      </w:r>
+    </w:p>
+    <w:p>
+      <w:pPr>
+        <w:spacing w:before="0" w:after="0" w:line="240" w:lineRule="auto"/>
+      </w:pPr>
+      <w:r>
+        <w:rPr>
+          <w:rFonts w:ascii="Consolas" w:hAnsi="Consolas" w:eastAsia="Consolas" w:cs="Consolas"/>
+          <w:sz w:val="15"/>
+          <w:noProof/>
+        </w:rPr>
+        <w:t>from sklearn.metrics import confusion_matrix</w:t>
+      </w:r>
+    </w:p>
+    <w:p>
+      <w:pPr>
+        <w:spacing w:before="0" w:after="0" w:line="240" w:lineRule="auto"/>
+      </w:pPr>
+      <w:r>
+        <w:rPr>
+          <w:rFonts w:ascii="Consolas" w:hAnsi="Consolas" w:eastAsia="Consolas" w:cs="Consolas"/>
+          <w:sz w:val="15"/>
+          <w:noProof/>
+        </w:rPr>
       </w:r>
     </w:p>
     <w:p>
@@ -841,6 +945,19 @@
           <w:sz w:val="15"/>
           <w:noProof/>
         </w:rPr>
+        <w:t>CV_SEED = 0                                 # random split of the sites into 5 folds</w:t>
+      </w:r>
+    </w:p>
+    <w:p>
+      <w:pPr>
+        <w:spacing w:before="0" w:after="0" w:line="240" w:lineRule="auto"/>
+      </w:pPr>
+      <w:r>
+        <w:rPr>
+          <w:rFonts w:ascii="Consolas" w:hAnsi="Consolas" w:eastAsia="Consolas" w:cs="Consolas"/>
+          <w:sz w:val="15"/>
+          <w:noProof/>
+        </w:rPr>
         <w:t># spectral windows: raw range read, 2 cm-1 grid, region used in PCA</w:t>
       </w:r>
     </w:p>
@@ -3807,6 +3924,1116 @@
           <w:noProof/>
         </w:rPr>
         <w:t>fig.savefig(OUTPUT_DIR / 'Fig_PCA_LDA_large.tiff', dpi=600, pil_kwargs={'compression': 'tiff_lzw'})</w:t>
+      </w:r>
+    </w:p>
+    <w:p>
+      <w:pPr>
+        <w:spacing w:before="0" w:after="0" w:line="240" w:lineRule="auto"/>
+      </w:pPr>
+      <w:r>
+        <w:rPr>
+          <w:rFonts w:ascii="Consolas" w:hAnsi="Consolas" w:eastAsia="Consolas" w:cs="Consolas"/>
+          <w:sz w:val="15"/>
+          <w:noProof/>
+        </w:rPr>
+      </w:r>
+    </w:p>
+    <w:p>
+      <w:pPr>
+        <w:spacing w:before="0" w:after="0" w:line="240" w:lineRule="auto"/>
+      </w:pPr>
+      <w:r>
+        <w:rPr>
+          <w:rFonts w:ascii="Consolas" w:hAnsi="Consolas" w:eastAsia="Consolas" w:cs="Consolas"/>
+          <w:sz w:val="15"/>
+          <w:noProof/>
+        </w:rPr>
+      </w:r>
+    </w:p>
+    <w:p>
+      <w:pPr>
+        <w:spacing w:before="0" w:after="0" w:line="240" w:lineRule="auto"/>
+      </w:pPr>
+      <w:r>
+        <w:rPr>
+          <w:rFonts w:ascii="Consolas" w:hAnsi="Consolas" w:eastAsia="Consolas" w:cs="Consolas"/>
+          <w:sz w:val="15"/>
+          <w:noProof/>
+        </w:rPr>
+        <w:t># ============================================================================</w:t>
+      </w:r>
+    </w:p>
+    <w:p>
+      <w:pPr>
+        <w:spacing w:before="0" w:after="0" w:line="240" w:lineRule="auto"/>
+      </w:pPr>
+      <w:r>
+        <w:rPr>
+          <w:rFonts w:ascii="Consolas" w:hAnsi="Consolas" w:eastAsia="Consolas" w:cs="Consolas"/>
+          <w:sz w:val="15"/>
+          <w:noProof/>
+        </w:rPr>
+        <w:t># STEP 5 - cross-validated classification and confusion matrices</w:t>
+      </w:r>
+    </w:p>
+    <w:p>
+      <w:pPr>
+        <w:spacing w:before="0" w:after="0" w:line="240" w:lineRule="auto"/>
+      </w:pPr>
+      <w:r>
+        <w:rPr>
+          <w:rFonts w:ascii="Consolas" w:hAnsi="Consolas" w:eastAsia="Consolas" w:cs="Consolas"/>
+          <w:sz w:val="15"/>
+          <w:noProof/>
+        </w:rPr>
+        <w:t># ============================================================================</w:t>
+      </w:r>
+    </w:p>
+    <w:p>
+      <w:pPr>
+        <w:spacing w:before="0" w:after="0" w:line="240" w:lineRule="auto"/>
+      </w:pPr>
+      <w:r>
+        <w:rPr>
+          <w:rFonts w:ascii="Consolas" w:hAnsi="Consolas" w:eastAsia="Consolas" w:cs="Consolas"/>
+          <w:sz w:val="15"/>
+          <w:noProof/>
+        </w:rPr>
+        <w:t># Panels b and d only SHOW the separation (LDA fitted on all spectra). Whether</w:t>
+      </w:r>
+    </w:p>
+    <w:p>
+      <w:pPr>
+        <w:spacing w:before="0" w:after="0" w:line="240" w:lineRule="auto"/>
+      </w:pPr>
+      <w:r>
+        <w:rPr>
+          <w:rFonts w:ascii="Consolas" w:hAnsi="Consolas" w:eastAsia="Consolas" w:cs="Consolas"/>
+          <w:sz w:val="15"/>
+          <w:noProof/>
+        </w:rPr>
+        <w:t># a NEW spectrum can be classified correctly is tested by cross-validation:</w:t>
+      </w:r>
+    </w:p>
+    <w:p>
+      <w:pPr>
+        <w:spacing w:before="0" w:after="0" w:line="240" w:lineRule="auto"/>
+      </w:pPr>
+      <w:r>
+        <w:rPr>
+          <w:rFonts w:ascii="Consolas" w:hAnsi="Consolas" w:eastAsia="Consolas" w:cs="Consolas"/>
+          <w:sz w:val="15"/>
+          <w:noProof/>
+        </w:rPr>
+        <w:t>#   - the 12 sites (6 EV, 6 NV) are split into 5 folds; all 20 spectra of a site</w:t>
+      </w:r>
+    </w:p>
+    <w:p>
+      <w:pPr>
+        <w:spacing w:before="0" w:after="0" w:line="240" w:lineRule="auto"/>
+      </w:pPr>
+      <w:r>
+        <w:rPr>
+          <w:rFonts w:ascii="Consolas" w:hAnsi="Consolas" w:eastAsia="Consolas" w:cs="Consolas"/>
+          <w:sz w:val="15"/>
+          <w:noProof/>
+        </w:rPr>
+        <w:t>#     always stay together, so a site is never in training and test at once</w:t>
+      </w:r>
+    </w:p>
+    <w:p>
+      <w:pPr>
+        <w:spacing w:before="0" w:after="0" w:line="240" w:lineRule="auto"/>
+      </w:pPr>
+      <w:r>
+        <w:rPr>
+          <w:rFonts w:ascii="Consolas" w:hAnsi="Consolas" w:eastAsia="Consolas" w:cs="Consolas"/>
+          <w:sz w:val="15"/>
+          <w:noProof/>
+        </w:rPr>
+        <w:t>#   - the model is trained on 4 folds and predicts the spectra of the 5th fold;</w:t>
+      </w:r>
+    </w:p>
+    <w:p>
+      <w:pPr>
+        <w:spacing w:before="0" w:after="0" w:line="240" w:lineRule="auto"/>
+      </w:pPr>
+      <w:r>
+        <w:rPr>
+          <w:rFonts w:ascii="Consolas" w:hAnsi="Consolas" w:eastAsia="Consolas" w:cs="Consolas"/>
+          <w:sz w:val="15"/>
+          <w:noProof/>
+        </w:rPr>
+        <w:t>#     repeated 5 times, so every spectrum is predicted once, by a model that</w:t>
+      </w:r>
+    </w:p>
+    <w:p>
+      <w:pPr>
+        <w:spacing w:before="0" w:after="0" w:line="240" w:lineRule="auto"/>
+      </w:pPr>
+      <w:r>
+        <w:rPr>
+          <w:rFonts w:ascii="Consolas" w:hAnsi="Consolas" w:eastAsia="Consolas" w:cs="Consolas"/>
+          <w:sz w:val="15"/>
+          <w:noProof/>
+        </w:rPr>
+        <w:t>#     never saw its site</w:t>
+      </w:r>
+    </w:p>
+    <w:p>
+      <w:pPr>
+        <w:spacing w:before="0" w:after="0" w:line="240" w:lineRule="auto"/>
+      </w:pPr>
+      <w:r>
+        <w:rPr>
+          <w:rFonts w:ascii="Consolas" w:hAnsi="Consolas" w:eastAsia="Consolas" w:cs="Consolas"/>
+          <w:sz w:val="15"/>
+          <w:noProof/>
+        </w:rPr>
+        <w:t>#   PCA-LDA: PCA scores of all spectra (unsupervised, no labels), LDA trained on</w:t>
+      </w:r>
+    </w:p>
+    <w:p>
+      <w:pPr>
+        <w:spacing w:before="0" w:after="0" w:line="240" w:lineRule="auto"/>
+      </w:pPr>
+      <w:r>
+        <w:rPr>
+          <w:rFonts w:ascii="Consolas" w:hAnsi="Consolas" w:eastAsia="Consolas" w:cs="Consolas"/>
+          <w:sz w:val="15"/>
+          <w:noProof/>
+        </w:rPr>
+        <w:t>#            the training folds only (as in Acacia_EV_NV_Analysis.py)</w:t>
+      </w:r>
+    </w:p>
+    <w:p>
+      <w:pPr>
+        <w:spacing w:before="0" w:after="0" w:line="240" w:lineRule="auto"/>
+      </w:pPr>
+      <w:r>
+        <w:rPr>
+          <w:rFonts w:ascii="Consolas" w:hAnsi="Consolas" w:eastAsia="Consolas" w:cs="Consolas"/>
+          <w:sz w:val="15"/>
+          <w:noProof/>
+        </w:rPr>
+        <w:t>#   PLS-DA : autoscaling + PLS (5 latent variables) trained on the training folds</w:t>
+      </w:r>
+    </w:p>
+    <w:p>
+      <w:pPr>
+        <w:spacing w:before="0" w:after="0" w:line="240" w:lineRule="auto"/>
+      </w:pPr>
+      <w:r>
+        <w:rPr>
+          <w:rFonts w:ascii="Consolas" w:hAnsi="Consolas" w:eastAsia="Consolas" w:cs="Consolas"/>
+          <w:sz w:val="15"/>
+          <w:noProof/>
+        </w:rPr>
+        <w:t>#            only; predicted value &gt; 0.5 = NV</w:t>
+      </w:r>
+    </w:p>
+    <w:p>
+      <w:pPr>
+        <w:spacing w:before="0" w:after="0" w:line="240" w:lineRule="auto"/>
+      </w:pPr>
+      <w:r>
+        <w:rPr>
+          <w:rFonts w:ascii="Consolas" w:hAnsi="Consolas" w:eastAsia="Consolas" w:cs="Consolas"/>
+          <w:sz w:val="15"/>
+          <w:noProof/>
+        </w:rPr>
+        <w:t># Confusion matrix: rows = true group, columns = predicted group.</w:t>
+      </w:r>
+    </w:p>
+    <w:p>
+      <w:pPr>
+        <w:spacing w:before="0" w:after="0" w:line="240" w:lineRule="auto"/>
+      </w:pPr>
+      <w:r>
+        <w:rPr>
+          <w:rFonts w:ascii="Consolas" w:hAnsi="Consolas" w:eastAsia="Consolas" w:cs="Consolas"/>
+          <w:sz w:val="15"/>
+          <w:noProof/>
+        </w:rPr>
+        <w:t>#   sensitivity = NVs correctly called NV, specificity = EVs correctly called EV</w:t>
+      </w:r>
+    </w:p>
+    <w:p>
+      <w:pPr>
+        <w:spacing w:before="0" w:after="0" w:line="240" w:lineRule="auto"/>
+      </w:pPr>
+      <w:r>
+        <w:rPr>
+          <w:rFonts w:ascii="Consolas" w:hAnsi="Consolas" w:eastAsia="Consolas" w:cs="Consolas"/>
+          <w:sz w:val="15"/>
+          <w:noProof/>
+        </w:rPr>
+        <w:t>#   (NV is taken as the "positive" class)</w:t>
+      </w:r>
+    </w:p>
+    <w:p>
+      <w:pPr>
+        <w:spacing w:before="0" w:after="0" w:line="240" w:lineRule="auto"/>
+      </w:pPr>
+      <w:r>
+        <w:rPr>
+          <w:rFonts w:ascii="Consolas" w:hAnsi="Consolas" w:eastAsia="Consolas" w:cs="Consolas"/>
+          <w:sz w:val="15"/>
+          <w:noProof/>
+        </w:rPr>
+        <w:t>folds = list(StratifiedGroupKFold(n_splits=5, shuffle=True, random_state=CV_SEED)</w:t>
+      </w:r>
+    </w:p>
+    <w:p>
+      <w:pPr>
+        <w:spacing w:before="0" w:after="0" w:line="240" w:lineRule="auto"/>
+      </w:pPr>
+      <w:r>
+        <w:rPr>
+          <w:rFonts w:ascii="Consolas" w:hAnsi="Consolas" w:eastAsia="Consolas" w:cs="Consolas"/>
+          <w:sz w:val="15"/>
+          <w:noProof/>
+        </w:rPr>
+        <w:t xml:space="preserve">             .split(np.zeros(len(y)), y, sites))</w:t>
+      </w:r>
+    </w:p>
+    <w:p>
+      <w:pPr>
+        <w:spacing w:before="0" w:after="0" w:line="240" w:lineRule="auto"/>
+      </w:pPr>
+      <w:r>
+        <w:rPr>
+          <w:rFonts w:ascii="Consolas" w:hAnsi="Consolas" w:eastAsia="Consolas" w:cs="Consolas"/>
+          <w:sz w:val="15"/>
+          <w:noProof/>
+        </w:rPr>
+      </w:r>
+    </w:p>
+    <w:p>
+      <w:pPr>
+        <w:spacing w:before="0" w:after="0" w:line="240" w:lineRule="auto"/>
+      </w:pPr>
+      <w:r>
+        <w:rPr>
+          <w:rFonts w:ascii="Consolas" w:hAnsi="Consolas" w:eastAsia="Consolas" w:cs="Consolas"/>
+          <w:sz w:val="15"/>
+          <w:noProof/>
+        </w:rPr>
+      </w:r>
+    </w:p>
+    <w:p>
+      <w:pPr>
+        <w:spacing w:before="0" w:after="0" w:line="240" w:lineRule="auto"/>
+      </w:pPr>
+      <w:r>
+        <w:rPr>
+          <w:rFonts w:ascii="Consolas" w:hAnsi="Consolas" w:eastAsia="Consolas" w:cs="Consolas"/>
+          <w:sz w:val="15"/>
+          <w:noProof/>
+        </w:rPr>
+        <w:t>def cv_pca_lda(X, refit=False):</w:t>
+      </w:r>
+    </w:p>
+    <w:p>
+      <w:pPr>
+        <w:spacing w:before="0" w:after="0" w:line="240" w:lineRule="auto"/>
+      </w:pPr>
+      <w:r>
+        <w:rPr>
+          <w:rFonts w:ascii="Consolas" w:hAnsi="Consolas" w:eastAsia="Consolas" w:cs="Consolas"/>
+          <w:sz w:val="15"/>
+          <w:noProof/>
+        </w:rPr>
+        <w:t xml:space="preserve">    """refit=True: PCA is also re-fitted inside each training fold (stricter check)."""</w:t>
+      </w:r>
+    </w:p>
+    <w:p>
+      <w:pPr>
+        <w:spacing w:before="0" w:after="0" w:line="240" w:lineRule="auto"/>
+      </w:pPr>
+      <w:r>
+        <w:rPr>
+          <w:rFonts w:ascii="Consolas" w:hAnsi="Consolas" w:eastAsia="Consolas" w:cs="Consolas"/>
+          <w:sz w:val="15"/>
+          <w:noProof/>
+        </w:rPr>
+        <w:t xml:space="preserve">    T = PCA(n_components=N_COMP, svd_solver='full').fit_transform(X)</w:t>
+      </w:r>
+    </w:p>
+    <w:p>
+      <w:pPr>
+        <w:spacing w:before="0" w:after="0" w:line="240" w:lineRule="auto"/>
+      </w:pPr>
+      <w:r>
+        <w:rPr>
+          <w:rFonts w:ascii="Consolas" w:hAnsi="Consolas" w:eastAsia="Consolas" w:cs="Consolas"/>
+          <w:sz w:val="15"/>
+          <w:noProof/>
+        </w:rPr>
+        <w:t xml:space="preserve">    pred = np.empty(len(y), int)</w:t>
+      </w:r>
+    </w:p>
+    <w:p>
+      <w:pPr>
+        <w:spacing w:before="0" w:after="0" w:line="240" w:lineRule="auto"/>
+      </w:pPr>
+      <w:r>
+        <w:rPr>
+          <w:rFonts w:ascii="Consolas" w:hAnsi="Consolas" w:eastAsia="Consolas" w:cs="Consolas"/>
+          <w:sz w:val="15"/>
+          <w:noProof/>
+        </w:rPr>
+        <w:t xml:space="preserve">    for tr, te in folds:</w:t>
+      </w:r>
+    </w:p>
+    <w:p>
+      <w:pPr>
+        <w:spacing w:before="0" w:after="0" w:line="240" w:lineRule="auto"/>
+      </w:pPr>
+      <w:r>
+        <w:rPr>
+          <w:rFonts w:ascii="Consolas" w:hAnsi="Consolas" w:eastAsia="Consolas" w:cs="Consolas"/>
+          <w:sz w:val="15"/>
+          <w:noProof/>
+        </w:rPr>
+        <w:t xml:space="preserve">        if refit:</w:t>
+      </w:r>
+    </w:p>
+    <w:p>
+      <w:pPr>
+        <w:spacing w:before="0" w:after="0" w:line="240" w:lineRule="auto"/>
+      </w:pPr>
+      <w:r>
+        <w:rPr>
+          <w:rFonts w:ascii="Consolas" w:hAnsi="Consolas" w:eastAsia="Consolas" w:cs="Consolas"/>
+          <w:sz w:val="15"/>
+          <w:noProof/>
+        </w:rPr>
+        <w:t xml:space="preserve">            pca_f = PCA(n_components=N_COMP, svd_solver='full').fit(X[tr])</w:t>
+      </w:r>
+    </w:p>
+    <w:p>
+      <w:pPr>
+        <w:spacing w:before="0" w:after="0" w:line="240" w:lineRule="auto"/>
+      </w:pPr>
+      <w:r>
+        <w:rPr>
+          <w:rFonts w:ascii="Consolas" w:hAnsi="Consolas" w:eastAsia="Consolas" w:cs="Consolas"/>
+          <w:sz w:val="15"/>
+          <w:noProof/>
+        </w:rPr>
+        <w:t xml:space="preserve">            Ttr, Tte = pca_f.transform(X[tr]), pca_f.transform(X[te])</w:t>
+      </w:r>
+    </w:p>
+    <w:p>
+      <w:pPr>
+        <w:spacing w:before="0" w:after="0" w:line="240" w:lineRule="auto"/>
+      </w:pPr>
+      <w:r>
+        <w:rPr>
+          <w:rFonts w:ascii="Consolas" w:hAnsi="Consolas" w:eastAsia="Consolas" w:cs="Consolas"/>
+          <w:sz w:val="15"/>
+          <w:noProof/>
+        </w:rPr>
+        <w:t xml:space="preserve">        else:</w:t>
+      </w:r>
+    </w:p>
+    <w:p>
+      <w:pPr>
+        <w:spacing w:before="0" w:after="0" w:line="240" w:lineRule="auto"/>
+      </w:pPr>
+      <w:r>
+        <w:rPr>
+          <w:rFonts w:ascii="Consolas" w:hAnsi="Consolas" w:eastAsia="Consolas" w:cs="Consolas"/>
+          <w:sz w:val="15"/>
+          <w:noProof/>
+        </w:rPr>
+        <w:t xml:space="preserve">            Ttr, Tte = T[tr], T[te]</w:t>
+      </w:r>
+    </w:p>
+    <w:p>
+      <w:pPr>
+        <w:spacing w:before="0" w:after="0" w:line="240" w:lineRule="auto"/>
+      </w:pPr>
+      <w:r>
+        <w:rPr>
+          <w:rFonts w:ascii="Consolas" w:hAnsi="Consolas" w:eastAsia="Consolas" w:cs="Consolas"/>
+          <w:sz w:val="15"/>
+          <w:noProof/>
+        </w:rPr>
+        <w:t xml:space="preserve">        pred[te] = LinearDiscriminantAnalysis().fit(Ttr, y[tr]).predict(Tte)</w:t>
+      </w:r>
+    </w:p>
+    <w:p>
+      <w:pPr>
+        <w:spacing w:before="0" w:after="0" w:line="240" w:lineRule="auto"/>
+      </w:pPr>
+      <w:r>
+        <w:rPr>
+          <w:rFonts w:ascii="Consolas" w:hAnsi="Consolas" w:eastAsia="Consolas" w:cs="Consolas"/>
+          <w:sz w:val="15"/>
+          <w:noProof/>
+        </w:rPr>
+        <w:t xml:space="preserve">    return pred</w:t>
+      </w:r>
+    </w:p>
+    <w:p>
+      <w:pPr>
+        <w:spacing w:before="0" w:after="0" w:line="240" w:lineRule="auto"/>
+      </w:pPr>
+      <w:r>
+        <w:rPr>
+          <w:rFonts w:ascii="Consolas" w:hAnsi="Consolas" w:eastAsia="Consolas" w:cs="Consolas"/>
+          <w:sz w:val="15"/>
+          <w:noProof/>
+        </w:rPr>
+      </w:r>
+    </w:p>
+    <w:p>
+      <w:pPr>
+        <w:spacing w:before="0" w:after="0" w:line="240" w:lineRule="auto"/>
+      </w:pPr>
+      <w:r>
+        <w:rPr>
+          <w:rFonts w:ascii="Consolas" w:hAnsi="Consolas" w:eastAsia="Consolas" w:cs="Consolas"/>
+          <w:sz w:val="15"/>
+          <w:noProof/>
+        </w:rPr>
+      </w:r>
+    </w:p>
+    <w:p>
+      <w:pPr>
+        <w:spacing w:before="0" w:after="0" w:line="240" w:lineRule="auto"/>
+      </w:pPr>
+      <w:r>
+        <w:rPr>
+          <w:rFonts w:ascii="Consolas" w:hAnsi="Consolas" w:eastAsia="Consolas" w:cs="Consolas"/>
+          <w:sz w:val="15"/>
+          <w:noProof/>
+        </w:rPr>
+        <w:t>def cv_plsda(X):</w:t>
+      </w:r>
+    </w:p>
+    <w:p>
+      <w:pPr>
+        <w:spacing w:before="0" w:after="0" w:line="240" w:lineRule="auto"/>
+      </w:pPr>
+      <w:r>
+        <w:rPr>
+          <w:rFonts w:ascii="Consolas" w:hAnsi="Consolas" w:eastAsia="Consolas" w:cs="Consolas"/>
+          <w:sz w:val="15"/>
+          <w:noProof/>
+        </w:rPr>
+        <w:t xml:space="preserve">    pred = np.empty(len(y), int)</w:t>
+      </w:r>
+    </w:p>
+    <w:p>
+      <w:pPr>
+        <w:spacing w:before="0" w:after="0" w:line="240" w:lineRule="auto"/>
+      </w:pPr>
+      <w:r>
+        <w:rPr>
+          <w:rFonts w:ascii="Consolas" w:hAnsi="Consolas" w:eastAsia="Consolas" w:cs="Consolas"/>
+          <w:sz w:val="15"/>
+          <w:noProof/>
+        </w:rPr>
+        <w:t xml:space="preserve">    for tr, te in folds:</w:t>
+      </w:r>
+    </w:p>
+    <w:p>
+      <w:pPr>
+        <w:spacing w:before="0" w:after="0" w:line="240" w:lineRule="auto"/>
+      </w:pPr>
+      <w:r>
+        <w:rPr>
+          <w:rFonts w:ascii="Consolas" w:hAnsi="Consolas" w:eastAsia="Consolas" w:cs="Consolas"/>
+          <w:sz w:val="15"/>
+          <w:noProof/>
+        </w:rPr>
+        <w:t xml:space="preserve">        sc = StandardScaler().fit(X[tr])</w:t>
+      </w:r>
+    </w:p>
+    <w:p>
+      <w:pPr>
+        <w:spacing w:before="0" w:after="0" w:line="240" w:lineRule="auto"/>
+      </w:pPr>
+      <w:r>
+        <w:rPr>
+          <w:rFonts w:ascii="Consolas" w:hAnsi="Consolas" w:eastAsia="Consolas" w:cs="Consolas"/>
+          <w:sz w:val="15"/>
+          <w:noProof/>
+        </w:rPr>
+        <w:t xml:space="preserve">        pls = PLSRegression(n_components=N_COMP, scale=False).fit(sc.transform(X[tr]), y[tr])</w:t>
+      </w:r>
+    </w:p>
+    <w:p>
+      <w:pPr>
+        <w:spacing w:before="0" w:after="0" w:line="240" w:lineRule="auto"/>
+      </w:pPr>
+      <w:r>
+        <w:rPr>
+          <w:rFonts w:ascii="Consolas" w:hAnsi="Consolas" w:eastAsia="Consolas" w:cs="Consolas"/>
+          <w:sz w:val="15"/>
+          <w:noProof/>
+        </w:rPr>
+        <w:t xml:space="preserve">        pred[te] = (pls.predict(sc.transform(X[te])).ravel() &gt; 0.5).astype(int)</w:t>
+      </w:r>
+    </w:p>
+    <w:p>
+      <w:pPr>
+        <w:spacing w:before="0" w:after="0" w:line="240" w:lineRule="auto"/>
+      </w:pPr>
+      <w:r>
+        <w:rPr>
+          <w:rFonts w:ascii="Consolas" w:hAnsi="Consolas" w:eastAsia="Consolas" w:cs="Consolas"/>
+          <w:sz w:val="15"/>
+          <w:noProof/>
+        </w:rPr>
+        <w:t xml:space="preserve">    return pred</w:t>
+      </w:r>
+    </w:p>
+    <w:p>
+      <w:pPr>
+        <w:spacing w:before="0" w:after="0" w:line="240" w:lineRule="auto"/>
+      </w:pPr>
+      <w:r>
+        <w:rPr>
+          <w:rFonts w:ascii="Consolas" w:hAnsi="Consolas" w:eastAsia="Consolas" w:cs="Consolas"/>
+          <w:sz w:val="15"/>
+          <w:noProof/>
+        </w:rPr>
+      </w:r>
+    </w:p>
+    <w:p>
+      <w:pPr>
+        <w:spacing w:before="0" w:after="0" w:line="240" w:lineRule="auto"/>
+      </w:pPr>
+      <w:r>
+        <w:rPr>
+          <w:rFonts w:ascii="Consolas" w:hAnsi="Consolas" w:eastAsia="Consolas" w:cs="Consolas"/>
+          <w:sz w:val="15"/>
+          <w:noProof/>
+        </w:rPr>
+      </w:r>
+    </w:p>
+    <w:p>
+      <w:pPr>
+        <w:spacing w:before="0" w:after="0" w:line="240" w:lineRule="auto"/>
+      </w:pPr>
+      <w:r>
+        <w:rPr>
+          <w:rFonts w:ascii="Consolas" w:hAnsi="Consolas" w:eastAsia="Consolas" w:cs="Consolas"/>
+          <w:sz w:val="15"/>
+          <w:noProof/>
+        </w:rPr>
+        <w:t>report('\nSTEP 5 - cross-validation (5 folds, whole sites left out)')</w:t>
+      </w:r>
+    </w:p>
+    <w:p>
+      <w:pPr>
+        <w:spacing w:before="0" w:after="0" w:line="240" w:lineRule="auto"/>
+      </w:pPr>
+      <w:r>
+        <w:rPr>
+          <w:rFonts w:ascii="Consolas" w:hAnsi="Consolas" w:eastAsia="Consolas" w:cs="Consolas"/>
+          <w:sz w:val="15"/>
+          <w:noProof/>
+        </w:rPr>
+        <w:t>for k, (tr, te) in enumerate(folds, 1):</w:t>
+      </w:r>
+    </w:p>
+    <w:p>
+      <w:pPr>
+        <w:spacing w:before="0" w:after="0" w:line="240" w:lineRule="auto"/>
+      </w:pPr>
+      <w:r>
+        <w:rPr>
+          <w:rFonts w:ascii="Consolas" w:hAnsi="Consolas" w:eastAsia="Consolas" w:cs="Consolas"/>
+          <w:sz w:val="15"/>
+          <w:noProof/>
+        </w:rPr>
+        <w:t xml:space="preserve">    report(f'  fold {k}: test sites ' + ', '.join(sorted(set(sites[te]))))</w:t>
+      </w:r>
+    </w:p>
+    <w:p>
+      <w:pPr>
+        <w:spacing w:before="0" w:after="0" w:line="240" w:lineRule="auto"/>
+      </w:pPr>
+      <w:r>
+        <w:rPr>
+          <w:rFonts w:ascii="Consolas" w:hAnsi="Consolas" w:eastAsia="Consolas" w:cs="Consolas"/>
+          <w:sz w:val="15"/>
+          <w:noProof/>
+        </w:rPr>
+        <w:t>cv_rows = []</w:t>
+      </w:r>
+    </w:p>
+    <w:p>
+      <w:pPr>
+        <w:spacing w:before="0" w:after="0" w:line="240" w:lineRule="auto"/>
+      </w:pPr>
+      <w:r>
+        <w:rPr>
+          <w:rFonts w:ascii="Consolas" w:hAnsi="Consolas" w:eastAsia="Consolas" w:cs="Consolas"/>
+          <w:sz w:val="15"/>
+          <w:noProof/>
+        </w:rPr>
+        <w:t>fig2, axs2 = plt.subplots(2, 2, figsize=(8, 7.6))</w:t>
+      </w:r>
+    </w:p>
+    <w:p>
+      <w:pPr>
+        <w:spacing w:before="0" w:after="0" w:line="240" w:lineRule="auto"/>
+      </w:pPr>
+      <w:r>
+        <w:rPr>
+          <w:rFonts w:ascii="Consolas" w:hAnsi="Consolas" w:eastAsia="Consolas" w:cs="Consolas"/>
+          <w:sz w:val="15"/>
+          <w:noProof/>
+        </w:rPr>
+        <w:t>letters = iter('abcd')</w:t>
+      </w:r>
+    </w:p>
+    <w:p>
+      <w:pPr>
+        <w:spacing w:before="0" w:after="0" w:line="240" w:lineRule="auto"/>
+      </w:pPr>
+      <w:r>
+        <w:rPr>
+          <w:rFonts w:ascii="Consolas" w:hAnsi="Consolas" w:eastAsia="Consolas" w:cs="Consolas"/>
+          <w:sz w:val="15"/>
+          <w:noProof/>
+        </w:rPr>
+        <w:t>for row, w in enumerate(['fingerprint', 'ch']):</w:t>
+      </w:r>
+    </w:p>
+    <w:p>
+      <w:pPr>
+        <w:spacing w:before="0" w:after="0" w:line="240" w:lineRule="auto"/>
+      </w:pPr>
+      <w:r>
+        <w:rPr>
+          <w:rFonts w:ascii="Consolas" w:hAnsi="Consolas" w:eastAsia="Consolas" w:cs="Consolas"/>
+          <w:sz w:val="15"/>
+          <w:noProof/>
+        </w:rPr>
+        <w:t xml:space="preserve">    X = data[w]</w:t>
+      </w:r>
+    </w:p>
+    <w:p>
+      <w:pPr>
+        <w:spacing w:before="0" w:after="0" w:line="240" w:lineRule="auto"/>
+      </w:pPr>
+      <w:r>
+        <w:rPr>
+          <w:rFonts w:ascii="Consolas" w:hAnsi="Consolas" w:eastAsia="Consolas" w:cs="Consolas"/>
+          <w:sz w:val="15"/>
+          <w:noProof/>
+        </w:rPr>
+        <w:t xml:space="preserve">    strict = (cv_pca_lda(X, refit=True) == y).mean() * 100</w:t>
+      </w:r>
+    </w:p>
+    <w:p>
+      <w:pPr>
+        <w:spacing w:before="0" w:after="0" w:line="240" w:lineRule="auto"/>
+      </w:pPr>
+      <w:r>
+        <w:rPr>
+          <w:rFonts w:ascii="Consolas" w:hAnsi="Consolas" w:eastAsia="Consolas" w:cs="Consolas"/>
+          <w:sz w:val="15"/>
+          <w:noProof/>
+        </w:rPr>
+        <w:t xml:space="preserve">    for col, (model, pred) in enumerate([('PCA-LDA', cv_pca_lda(X)), ('PLS-DA', cv_plsda(X))]):</w:t>
+      </w:r>
+    </w:p>
+    <w:p>
+      <w:pPr>
+        <w:spacing w:before="0" w:after="0" w:line="240" w:lineRule="auto"/>
+      </w:pPr>
+      <w:r>
+        <w:rPr>
+          <w:rFonts w:ascii="Consolas" w:hAnsi="Consolas" w:eastAsia="Consolas" w:cs="Consolas"/>
+          <w:sz w:val="15"/>
+          <w:noProof/>
+        </w:rPr>
+        <w:t xml:space="preserve">        cm = confusion_matrix(y, pred)</w:t>
+      </w:r>
+    </w:p>
+    <w:p>
+      <w:pPr>
+        <w:spacing w:before="0" w:after="0" w:line="240" w:lineRule="auto"/>
+      </w:pPr>
+      <w:r>
+        <w:rPr>
+          <w:rFonts w:ascii="Consolas" w:hAnsi="Consolas" w:eastAsia="Consolas" w:cs="Consolas"/>
+          <w:sz w:val="15"/>
+          <w:noProof/>
+        </w:rPr>
+        <w:t xml:space="preserve">        acc = (pred == y).mean() * 100</w:t>
+      </w:r>
+    </w:p>
+    <w:p>
+      <w:pPr>
+        <w:spacing w:before="0" w:after="0" w:line="240" w:lineRule="auto"/>
+      </w:pPr>
+      <w:r>
+        <w:rPr>
+          <w:rFonts w:ascii="Consolas" w:hAnsi="Consolas" w:eastAsia="Consolas" w:cs="Consolas"/>
+          <w:sz w:val="15"/>
+          <w:noProof/>
+        </w:rPr>
+        <w:t xml:space="preserve">        sens, spec = cm[1, 1] / cm[1].sum() * 100, cm[0, 0] / cm[0].sum() * 100</w:t>
+      </w:r>
+    </w:p>
+    <w:p>
+      <w:pPr>
+        <w:spacing w:before="0" w:after="0" w:line="240" w:lineRule="auto"/>
+      </w:pPr>
+      <w:r>
+        <w:rPr>
+          <w:rFonts w:ascii="Consolas" w:hAnsi="Consolas" w:eastAsia="Consolas" w:cs="Consolas"/>
+          <w:sz w:val="15"/>
+          <w:noProof/>
+        </w:rPr>
+        <w:t xml:space="preserve">        cv_rows.append({'Region': TITLES[w].replace('$^{-1}$', '-1'), 'Model': model,</w:t>
+      </w:r>
+    </w:p>
+    <w:p>
+      <w:pPr>
+        <w:spacing w:before="0" w:after="0" w:line="240" w:lineRule="auto"/>
+      </w:pPr>
+      <w:r>
+        <w:rPr>
+          <w:rFonts w:ascii="Consolas" w:hAnsi="Consolas" w:eastAsia="Consolas" w:cs="Consolas"/>
+          <w:sz w:val="15"/>
+          <w:noProof/>
+        </w:rPr>
+        <w:t xml:space="preserve">                        'Accuracy (%)': round(acc, 1), 'Sensitivity NV (%)': round(sens, 1),</w:t>
+      </w:r>
+    </w:p>
+    <w:p>
+      <w:pPr>
+        <w:spacing w:before="0" w:after="0" w:line="240" w:lineRule="auto"/>
+      </w:pPr>
+      <w:r>
+        <w:rPr>
+          <w:rFonts w:ascii="Consolas" w:hAnsi="Consolas" w:eastAsia="Consolas" w:cs="Consolas"/>
+          <w:sz w:val="15"/>
+          <w:noProof/>
+        </w:rPr>
+        <w:t xml:space="preserve">                        'Specificity EV (%)': round(spec, 1),</w:t>
+      </w:r>
+    </w:p>
+    <w:p>
+      <w:pPr>
+        <w:spacing w:before="0" w:after="0" w:line="240" w:lineRule="auto"/>
+      </w:pPr>
+      <w:r>
+        <w:rPr>
+          <w:rFonts w:ascii="Consolas" w:hAnsi="Consolas" w:eastAsia="Consolas" w:cs="Consolas"/>
+          <w:sz w:val="15"/>
+          <w:noProof/>
+        </w:rPr>
+        <w:t xml:space="preserve">                        'EV correct': f'{cm[0, 0]}/{cm[0].sum()}',</w:t>
+      </w:r>
+    </w:p>
+    <w:p>
+      <w:pPr>
+        <w:spacing w:before="0" w:after="0" w:line="240" w:lineRule="auto"/>
+      </w:pPr>
+      <w:r>
+        <w:rPr>
+          <w:rFonts w:ascii="Consolas" w:hAnsi="Consolas" w:eastAsia="Consolas" w:cs="Consolas"/>
+          <w:sz w:val="15"/>
+          <w:noProof/>
+        </w:rPr>
+        <w:t xml:space="preserve">                        'NV correct': f'{cm[1, 1]}/{cm[1].sum()}'})</w:t>
+      </w:r>
+    </w:p>
+    <w:p>
+      <w:pPr>
+        <w:spacing w:before="0" w:after="0" w:line="240" w:lineRule="auto"/>
+      </w:pPr>
+      <w:r>
+        <w:rPr>
+          <w:rFonts w:ascii="Consolas" w:hAnsi="Consolas" w:eastAsia="Consolas" w:cs="Consolas"/>
+          <w:sz w:val="15"/>
+          <w:noProof/>
+        </w:rPr>
+        <w:t xml:space="preserve">        report(f'  {w:11s} {model}: accuracy {acc:.1f} %, sensitivity {sens:.1f} %, '</w:t>
+      </w:r>
+    </w:p>
+    <w:p>
+      <w:pPr>
+        <w:spacing w:before="0" w:after="0" w:line="240" w:lineRule="auto"/>
+      </w:pPr>
+      <w:r>
+        <w:rPr>
+          <w:rFonts w:ascii="Consolas" w:hAnsi="Consolas" w:eastAsia="Consolas" w:cs="Consolas"/>
+          <w:sz w:val="15"/>
+          <w:noProof/>
+        </w:rPr>
+        <w:t xml:space="preserve">               f'specificity {spec:.1f} %  (EV {cm[0, 0]}/120, NV {cm[1, 1]}/120)')</w:t>
+      </w:r>
+    </w:p>
+    <w:p>
+      <w:pPr>
+        <w:spacing w:before="0" w:after="0" w:line="240" w:lineRule="auto"/>
+      </w:pPr>
+      <w:r>
+        <w:rPr>
+          <w:rFonts w:ascii="Consolas" w:hAnsi="Consolas" w:eastAsia="Consolas" w:cs="Consolas"/>
+          <w:sz w:val="15"/>
+          <w:noProof/>
+        </w:rPr>
+        <w:t xml:space="preserve">        ax = axs2[row, col]</w:t>
+      </w:r>
+    </w:p>
+    <w:p>
+      <w:pPr>
+        <w:spacing w:before="0" w:after="0" w:line="240" w:lineRule="auto"/>
+      </w:pPr>
+      <w:r>
+        <w:rPr>
+          <w:rFonts w:ascii="Consolas" w:hAnsi="Consolas" w:eastAsia="Consolas" w:cs="Consolas"/>
+          <w:sz w:val="15"/>
+          <w:noProof/>
+        </w:rPr>
+        <w:t xml:space="preserve">        ax.imshow(cm, cmap='Blues', vmin=0, vmax=120)</w:t>
+      </w:r>
+    </w:p>
+    <w:p>
+      <w:pPr>
+        <w:spacing w:before="0" w:after="0" w:line="240" w:lineRule="auto"/>
+      </w:pPr>
+      <w:r>
+        <w:rPr>
+          <w:rFonts w:ascii="Consolas" w:hAnsi="Consolas" w:eastAsia="Consolas" w:cs="Consolas"/>
+          <w:sz w:val="15"/>
+          <w:noProof/>
+        </w:rPr>
+        <w:t xml:space="preserve">        for i in range(2):</w:t>
+      </w:r>
+    </w:p>
+    <w:p>
+      <w:pPr>
+        <w:spacing w:before="0" w:after="0" w:line="240" w:lineRule="auto"/>
+      </w:pPr>
+      <w:r>
+        <w:rPr>
+          <w:rFonts w:ascii="Consolas" w:hAnsi="Consolas" w:eastAsia="Consolas" w:cs="Consolas"/>
+          <w:sz w:val="15"/>
+          <w:noProof/>
+        </w:rPr>
+        <w:t xml:space="preserve">            for j in range(2):</w:t>
+      </w:r>
+    </w:p>
+    <w:p>
+      <w:pPr>
+        <w:spacing w:before="0" w:after="0" w:line="240" w:lineRule="auto"/>
+      </w:pPr>
+      <w:r>
+        <w:rPr>
+          <w:rFonts w:ascii="Consolas" w:hAnsi="Consolas" w:eastAsia="Consolas" w:cs="Consolas"/>
+          <w:sz w:val="15"/>
+          <w:noProof/>
+        </w:rPr>
+        <w:t xml:space="preserve">                ax.text(j, i, f'{cm[i, j]}\n({cm[i, j] / cm[i].sum() * 100:.1f}%)', ha='center',</w:t>
+      </w:r>
+    </w:p>
+    <w:p>
+      <w:pPr>
+        <w:spacing w:before="0" w:after="0" w:line="240" w:lineRule="auto"/>
+      </w:pPr>
+      <w:r>
+        <w:rPr>
+          <w:rFonts w:ascii="Consolas" w:hAnsi="Consolas" w:eastAsia="Consolas" w:cs="Consolas"/>
+          <w:sz w:val="15"/>
+          <w:noProof/>
+        </w:rPr>
+        <w:t xml:space="preserve">                        va='center', fontsize=13, color='white' if cm[i, j] &gt; 60 else 'black')</w:t>
+      </w:r>
+    </w:p>
+    <w:p>
+      <w:pPr>
+        <w:spacing w:before="0" w:after="0" w:line="240" w:lineRule="auto"/>
+      </w:pPr>
+      <w:r>
+        <w:rPr>
+          <w:rFonts w:ascii="Consolas" w:hAnsi="Consolas" w:eastAsia="Consolas" w:cs="Consolas"/>
+          <w:sz w:val="15"/>
+          <w:noProof/>
+        </w:rPr>
+        <w:t xml:space="preserve">        ax.set_xticks([0, 1])</w:t>
+      </w:r>
+    </w:p>
+    <w:p>
+      <w:pPr>
+        <w:spacing w:before="0" w:after="0" w:line="240" w:lineRule="auto"/>
+      </w:pPr>
+      <w:r>
+        <w:rPr>
+          <w:rFonts w:ascii="Consolas" w:hAnsi="Consolas" w:eastAsia="Consolas" w:cs="Consolas"/>
+          <w:sz w:val="15"/>
+          <w:noProof/>
+        </w:rPr>
+        <w:t xml:space="preserve">        ax.set_xticklabels(['EVs', 'NVs'])</w:t>
+      </w:r>
+    </w:p>
+    <w:p>
+      <w:pPr>
+        <w:spacing w:before="0" w:after="0" w:line="240" w:lineRule="auto"/>
+      </w:pPr>
+      <w:r>
+        <w:rPr>
+          <w:rFonts w:ascii="Consolas" w:hAnsi="Consolas" w:eastAsia="Consolas" w:cs="Consolas"/>
+          <w:sz w:val="15"/>
+          <w:noProof/>
+        </w:rPr>
+        <w:t xml:space="preserve">        ax.set_yticks([0, 1])</w:t>
+      </w:r>
+    </w:p>
+    <w:p>
+      <w:pPr>
+        <w:spacing w:before="0" w:after="0" w:line="240" w:lineRule="auto"/>
+      </w:pPr>
+      <w:r>
+        <w:rPr>
+          <w:rFonts w:ascii="Consolas" w:hAnsi="Consolas" w:eastAsia="Consolas" w:cs="Consolas"/>
+          <w:sz w:val="15"/>
+          <w:noProof/>
+        </w:rPr>
+        <w:t xml:space="preserve">        ax.set_yticklabels(['EVs', 'NVs'])</w:t>
+      </w:r>
+    </w:p>
+    <w:p>
+      <w:pPr>
+        <w:spacing w:before="0" w:after="0" w:line="240" w:lineRule="auto"/>
+      </w:pPr>
+      <w:r>
+        <w:rPr>
+          <w:rFonts w:ascii="Consolas" w:hAnsi="Consolas" w:eastAsia="Consolas" w:cs="Consolas"/>
+          <w:sz w:val="15"/>
+          <w:noProof/>
+        </w:rPr>
+        <w:t xml:space="preserve">        ax.set_xlabel('Predicted')</w:t>
+      </w:r>
+    </w:p>
+    <w:p>
+      <w:pPr>
+        <w:spacing w:before="0" w:after="0" w:line="240" w:lineRule="auto"/>
+      </w:pPr>
+      <w:r>
+        <w:rPr>
+          <w:rFonts w:ascii="Consolas" w:hAnsi="Consolas" w:eastAsia="Consolas" w:cs="Consolas"/>
+          <w:sz w:val="15"/>
+          <w:noProof/>
+        </w:rPr>
+        <w:t xml:space="preserve">        ax.set_ylabel('True')</w:t>
+      </w:r>
+    </w:p>
+    <w:p>
+      <w:pPr>
+        <w:spacing w:before="0" w:after="0" w:line="240" w:lineRule="auto"/>
+      </w:pPr>
+      <w:r>
+        <w:rPr>
+          <w:rFonts w:ascii="Consolas" w:hAnsi="Consolas" w:eastAsia="Consolas" w:cs="Consolas"/>
+          <w:sz w:val="15"/>
+          <w:noProof/>
+        </w:rPr>
+        <w:t xml:space="preserve">        ax.set_title(f'{model} - {"Fingerprint" if w == "fingerprint" else "CH-stretching"}\n'</w:t>
+      </w:r>
+    </w:p>
+    <w:p>
+      <w:pPr>
+        <w:spacing w:before="0" w:after="0" w:line="240" w:lineRule="auto"/>
+      </w:pPr>
+      <w:r>
+        <w:rPr>
+          <w:rFonts w:ascii="Consolas" w:hAnsi="Consolas" w:eastAsia="Consolas" w:cs="Consolas"/>
+          <w:sz w:val="15"/>
+          <w:noProof/>
+        </w:rPr>
+        <w:t xml:space="preserve">                     f'accuracy {acc:.1f}%', fontsize=12)</w:t>
+      </w:r>
+    </w:p>
+    <w:p>
+      <w:pPr>
+        <w:spacing w:before="0" w:after="0" w:line="240" w:lineRule="auto"/>
+      </w:pPr>
+      <w:r>
+        <w:rPr>
+          <w:rFonts w:ascii="Consolas" w:hAnsi="Consolas" w:eastAsia="Consolas" w:cs="Consolas"/>
+          <w:sz w:val="15"/>
+          <w:noProof/>
+        </w:rPr>
+        <w:t xml:space="preserve">        ax.text(-0.32, 1.12, f'({next(letters)})', transform=ax.transAxes, fontsize=14, va='bottom')</w:t>
+      </w:r>
+    </w:p>
+    <w:p>
+      <w:pPr>
+        <w:spacing w:before="0" w:after="0" w:line="240" w:lineRule="auto"/>
+      </w:pPr>
+      <w:r>
+        <w:rPr>
+          <w:rFonts w:ascii="Consolas" w:hAnsi="Consolas" w:eastAsia="Consolas" w:cs="Consolas"/>
+          <w:sz w:val="15"/>
+          <w:noProof/>
+        </w:rPr>
+        <w:t xml:space="preserve">    report(f'  {w:11s} PCA-LDA with PCA re-fitted in each fold (stricter check): {strict:.1f} %')</w:t>
+      </w:r>
+    </w:p>
+    <w:p>
+      <w:pPr>
+        <w:spacing w:before="0" w:after="0" w:line="240" w:lineRule="auto"/>
+      </w:pPr>
+      <w:r>
+        <w:rPr>
+          <w:rFonts w:ascii="Consolas" w:hAnsi="Consolas" w:eastAsia="Consolas" w:cs="Consolas"/>
+          <w:sz w:val="15"/>
+          <w:noProof/>
+        </w:rPr>
+        <w:t>pd.DataFrame(cv_rows).to_csv(OUTPUT_DIR / 'CV_accuracy.csv', index=False)</w:t>
+      </w:r>
+    </w:p>
+    <w:p>
+      <w:pPr>
+        <w:spacing w:before="0" w:after="0" w:line="240" w:lineRule="auto"/>
+      </w:pPr>
+      <w:r>
+        <w:rPr>
+          <w:rFonts w:ascii="Consolas" w:hAnsi="Consolas" w:eastAsia="Consolas" w:cs="Consolas"/>
+          <w:sz w:val="15"/>
+          <w:noProof/>
+        </w:rPr>
+        <w:t>fig2.tight_layout()</w:t>
+      </w:r>
+    </w:p>
+    <w:p>
+      <w:pPr>
+        <w:spacing w:before="0" w:after="0" w:line="240" w:lineRule="auto"/>
+      </w:pPr>
+      <w:r>
+        <w:rPr>
+          <w:rFonts w:ascii="Consolas" w:hAnsi="Consolas" w:eastAsia="Consolas" w:cs="Consolas"/>
+          <w:sz w:val="15"/>
+          <w:noProof/>
+        </w:rPr>
+        <w:t>fig2.savefig(OUTPUT_DIR / 'Fig_ConfusionMatrices.png', dpi=600)</w:t>
+      </w:r>
+    </w:p>
+    <w:p>
+      <w:pPr>
+        <w:spacing w:before="0" w:after="0" w:line="240" w:lineRule="auto"/>
+      </w:pPr>
+      <w:r>
+        <w:rPr>
+          <w:rFonts w:ascii="Consolas" w:hAnsi="Consolas" w:eastAsia="Consolas" w:cs="Consolas"/>
+          <w:sz w:val="15"/>
+          <w:noProof/>
+        </w:rPr>
+        <w:t>fig2.savefig(OUTPUT_DIR / 'Fig_ConfusionMatrices.tiff', dpi=600, pil_kwargs={'compression': 'tiff_lzw'})</w:t>
       </w:r>
     </w:p>
     <w:p>

</xml_diff>

<commit_message>
Step-by-step script: save under a new name when Windows cannot overwrite an open figure file
Co-Authored-By: Claude Opus 5.5 <noreply@anthropic.com>
Claude-Session: https://claude.ai/code/session_01L8hQ8e5u5KmaH4dD9snyRw
</commit_message>
<xml_diff>
--- a/Acacia_PCA_LDA_Explained_Code.docx
+++ b/Acacia_PCA_LDA_Explained_Code.docx
@@ -1163,6 +1163,225 @@
           <w:sz w:val="15"/>
           <w:noProof/>
         </w:rPr>
+        <w:t>def save_figure(fig_, name):</w:t>
+      </w:r>
+    </w:p>
+    <w:p>
+      <w:pPr>
+        <w:spacing w:before="0" w:after="0" w:line="240" w:lineRule="auto"/>
+      </w:pPr>
+      <w:r>
+        <w:rPr>
+          <w:rFonts w:ascii="Consolas" w:hAnsi="Consolas" w:eastAsia="Consolas" w:cs="Consolas"/>
+          <w:sz w:val="15"/>
+          <w:noProof/>
+        </w:rPr>
+        <w:t xml:space="preserve">    """Save PNG + TIFF (600 dpi). If Windows refuses to overwrite a file (usually</w:t>
+      </w:r>
+    </w:p>
+    <w:p>
+      <w:pPr>
+        <w:spacing w:before="0" w:after="0" w:line="240" w:lineRule="auto"/>
+      </w:pPr>
+      <w:r>
+        <w:rPr>
+          <w:rFonts w:ascii="Consolas" w:hAnsi="Consolas" w:eastAsia="Consolas" w:cs="Consolas"/>
+          <w:sz w:val="15"/>
+          <w:noProof/>
+        </w:rPr>
+        <w:t xml:space="preserve">    because the old image is still open in Photos / PyCharm / another viewer),</w:t>
+      </w:r>
+    </w:p>
+    <w:p>
+      <w:pPr>
+        <w:spacing w:before="0" w:after="0" w:line="240" w:lineRule="auto"/>
+      </w:pPr>
+      <w:r>
+        <w:rPr>
+          <w:rFonts w:ascii="Consolas" w:hAnsi="Consolas" w:eastAsia="Consolas" w:cs="Consolas"/>
+          <w:sz w:val="15"/>
+          <w:noProof/>
+        </w:rPr>
+        <w:t xml:space="preserve">    the figure is saved under a new name instead of stopping the script."""</w:t>
+      </w:r>
+    </w:p>
+    <w:p>
+      <w:pPr>
+        <w:spacing w:before="0" w:after="0" w:line="240" w:lineRule="auto"/>
+      </w:pPr>
+      <w:r>
+        <w:rPr>
+          <w:rFonts w:ascii="Consolas" w:hAnsi="Consolas" w:eastAsia="Consolas" w:cs="Consolas"/>
+          <w:sz w:val="15"/>
+          <w:noProof/>
+        </w:rPr>
+        <w:t xml:space="preserve">    for ext, kw in [('png', {}), ('tiff', {'pil_kwargs': {'compression': 'tiff_lzw'}})]:</w:t>
+      </w:r>
+    </w:p>
+    <w:p>
+      <w:pPr>
+        <w:spacing w:before="0" w:after="0" w:line="240" w:lineRule="auto"/>
+      </w:pPr>
+      <w:r>
+        <w:rPr>
+          <w:rFonts w:ascii="Consolas" w:hAnsi="Consolas" w:eastAsia="Consolas" w:cs="Consolas"/>
+          <w:sz w:val="15"/>
+          <w:noProof/>
+        </w:rPr>
+        <w:t xml:space="preserve">        target = OUTPUT_DIR / f'{name}.{ext}'</w:t>
+      </w:r>
+    </w:p>
+    <w:p>
+      <w:pPr>
+        <w:spacing w:before="0" w:after="0" w:line="240" w:lineRule="auto"/>
+      </w:pPr>
+      <w:r>
+        <w:rPr>
+          <w:rFonts w:ascii="Consolas" w:hAnsi="Consolas" w:eastAsia="Consolas" w:cs="Consolas"/>
+          <w:sz w:val="15"/>
+          <w:noProof/>
+        </w:rPr>
+        <w:t xml:space="preserve">        for k in range(1, 50):</w:t>
+      </w:r>
+    </w:p>
+    <w:p>
+      <w:pPr>
+        <w:spacing w:before="0" w:after="0" w:line="240" w:lineRule="auto"/>
+      </w:pPr>
+      <w:r>
+        <w:rPr>
+          <w:rFonts w:ascii="Consolas" w:hAnsi="Consolas" w:eastAsia="Consolas" w:cs="Consolas"/>
+          <w:sz w:val="15"/>
+          <w:noProof/>
+        </w:rPr>
+        <w:t xml:space="preserve">            try:</w:t>
+      </w:r>
+    </w:p>
+    <w:p>
+      <w:pPr>
+        <w:spacing w:before="0" w:after="0" w:line="240" w:lineRule="auto"/>
+      </w:pPr>
+      <w:r>
+        <w:rPr>
+          <w:rFonts w:ascii="Consolas" w:hAnsi="Consolas" w:eastAsia="Consolas" w:cs="Consolas"/>
+          <w:sz w:val="15"/>
+          <w:noProof/>
+        </w:rPr>
+        <w:t xml:space="preserve">                fig_.savefig(target, dpi=600, **kw)</w:t>
+      </w:r>
+    </w:p>
+    <w:p>
+      <w:pPr>
+        <w:spacing w:before="0" w:after="0" w:line="240" w:lineRule="auto"/>
+      </w:pPr>
+      <w:r>
+        <w:rPr>
+          <w:rFonts w:ascii="Consolas" w:hAnsi="Consolas" w:eastAsia="Consolas" w:cs="Consolas"/>
+          <w:sz w:val="15"/>
+          <w:noProof/>
+        </w:rPr>
+        <w:t xml:space="preserve">                break</w:t>
+      </w:r>
+    </w:p>
+    <w:p>
+      <w:pPr>
+        <w:spacing w:before="0" w:after="0" w:line="240" w:lineRule="auto"/>
+      </w:pPr>
+      <w:r>
+        <w:rPr>
+          <w:rFonts w:ascii="Consolas" w:hAnsi="Consolas" w:eastAsia="Consolas" w:cs="Consolas"/>
+          <w:sz w:val="15"/>
+          <w:noProof/>
+        </w:rPr>
+        <w:t xml:space="preserve">            except OSError as err:</w:t>
+      </w:r>
+    </w:p>
+    <w:p>
+      <w:pPr>
+        <w:spacing w:before="0" w:after="0" w:line="240" w:lineRule="auto"/>
+      </w:pPr>
+      <w:r>
+        <w:rPr>
+          <w:rFonts w:ascii="Consolas" w:hAnsi="Consolas" w:eastAsia="Consolas" w:cs="Consolas"/>
+          <w:sz w:val="15"/>
+          <w:noProof/>
+        </w:rPr>
+        <w:t xml:space="preserve">                print(f'  could not write {target.name} ({err.strerror}) - is it open in '</w:t>
+      </w:r>
+    </w:p>
+    <w:p>
+      <w:pPr>
+        <w:spacing w:before="0" w:after="0" w:line="240" w:lineRule="auto"/>
+      </w:pPr>
+      <w:r>
+        <w:rPr>
+          <w:rFonts w:ascii="Consolas" w:hAnsi="Consolas" w:eastAsia="Consolas" w:cs="Consolas"/>
+          <w:sz w:val="15"/>
+          <w:noProof/>
+        </w:rPr>
+        <w:t xml:space="preserve">                      f'another program? Saving as a new file instead.')</w:t>
+      </w:r>
+    </w:p>
+    <w:p>
+      <w:pPr>
+        <w:spacing w:before="0" w:after="0" w:line="240" w:lineRule="auto"/>
+      </w:pPr>
+      <w:r>
+        <w:rPr>
+          <w:rFonts w:ascii="Consolas" w:hAnsi="Consolas" w:eastAsia="Consolas" w:cs="Consolas"/>
+          <w:sz w:val="15"/>
+          <w:noProof/>
+        </w:rPr>
+        <w:t xml:space="preserve">                target = OUTPUT_DIR / f'{name}_{k}.{ext}'</w:t>
+      </w:r>
+    </w:p>
+    <w:p>
+      <w:pPr>
+        <w:spacing w:before="0" w:after="0" w:line="240" w:lineRule="auto"/>
+      </w:pPr>
+      <w:r>
+        <w:rPr>
+          <w:rFonts w:ascii="Consolas" w:hAnsi="Consolas" w:eastAsia="Consolas" w:cs="Consolas"/>
+          <w:sz w:val="15"/>
+          <w:noProof/>
+        </w:rPr>
+        <w:t xml:space="preserve">        print(f'  saved {target}')</w:t>
+      </w:r>
+    </w:p>
+    <w:p>
+      <w:pPr>
+        <w:spacing w:before="0" w:after="0" w:line="240" w:lineRule="auto"/>
+      </w:pPr>
+      <w:r>
+        <w:rPr>
+          <w:rFonts w:ascii="Consolas" w:hAnsi="Consolas" w:eastAsia="Consolas" w:cs="Consolas"/>
+          <w:sz w:val="15"/>
+          <w:noProof/>
+        </w:rPr>
+      </w:r>
+    </w:p>
+    <w:p>
+      <w:pPr>
+        <w:spacing w:before="0" w:after="0" w:line="240" w:lineRule="auto"/>
+      </w:pPr>
+      <w:r>
+        <w:rPr>
+          <w:rFonts w:ascii="Consolas" w:hAnsi="Consolas" w:eastAsia="Consolas" w:cs="Consolas"/>
+          <w:sz w:val="15"/>
+          <w:noProof/>
+        </w:rPr>
+      </w:r>
+    </w:p>
+    <w:p>
+      <w:pPr>
+        <w:spacing w:before="0" w:after="0" w:line="240" w:lineRule="auto"/>
+      </w:pPr>
+      <w:r>
+        <w:rPr>
+          <w:rFonts w:ascii="Consolas" w:hAnsi="Consolas" w:eastAsia="Consolas" w:cs="Consolas"/>
+          <w:sz w:val="15"/>
+          <w:noProof/>
+        </w:rPr>
         <w:t>def report(*a):</w:t>
       </w:r>
     </w:p>
@@ -3910,20 +4129,7 @@
           <w:sz w:val="15"/>
           <w:noProof/>
         </w:rPr>
-        <w:t>fig.savefig(OUTPUT_DIR / 'Fig_PCA_LDA_large.png', dpi=600)</w:t>
-      </w:r>
-    </w:p>
-    <w:p>
-      <w:pPr>
-        <w:spacing w:before="0" w:after="0" w:line="240" w:lineRule="auto"/>
-      </w:pPr>
-      <w:r>
-        <w:rPr>
-          <w:rFonts w:ascii="Consolas" w:hAnsi="Consolas" w:eastAsia="Consolas" w:cs="Consolas"/>
-          <w:sz w:val="15"/>
-          <w:noProof/>
-        </w:rPr>
-        <w:t>fig.savefig(OUTPUT_DIR / 'Fig_PCA_LDA_large.tiff', dpi=600, pil_kwargs={'compression': 'tiff_lzw'})</w:t>
+        <w:t>save_figure(fig, 'Fig_PCA_LDA_large')</w:t>
       </w:r>
     </w:p>
     <w:p>
@@ -5020,20 +5226,7 @@
           <w:sz w:val="15"/>
           <w:noProof/>
         </w:rPr>
-        <w:t>fig2.savefig(OUTPUT_DIR / 'Fig_ConfusionMatrices.png', dpi=600)</w:t>
-      </w:r>
-    </w:p>
-    <w:p>
-      <w:pPr>
-        <w:spacing w:before="0" w:after="0" w:line="240" w:lineRule="auto"/>
-      </w:pPr>
-      <w:r>
-        <w:rPr>
-          <w:rFonts w:ascii="Consolas" w:hAnsi="Consolas" w:eastAsia="Consolas" w:cs="Consolas"/>
-          <w:sz w:val="15"/>
-          <w:noProof/>
-        </w:rPr>
-        <w:t>fig2.savefig(OUTPUT_DIR / 'Fig_ConfusionMatrices.tiff', dpi=600, pil_kwargs={'compression': 'tiff_lzw'})</w:t>
+        <w:t>save_figure(fig2, 'Fig_ConfusionMatrices')</w:t>
       </w:r>
     </w:p>
     <w:p>

</xml_diff>

<commit_message>
Step-by-step script: PCA loadings, NV-EV difference spectrum, exact permutation test (924 site labelings) and a results text built from the run
Co-Authored-By: Claude Opus 5.5 <noreply@anthropic.com>
Claude-Session: https://claude.ai/code/session_01L8hQ8e5u5KmaH4dD9snyRw
</commit_message>
<xml_diff>
--- a/Acacia_PCA_LDA_Explained_Code.docx
+++ b/Acacia_PCA_LDA_Explained_Code.docx
@@ -7,7 +7,7 @@
         <w:pStyle w:val="Heading1"/>
       </w:pPr>
       <w:r>
-        <w:t>Acacia EVs vs NVs - PCA + LDA figure, step by step (panels a-d)</w:t>
+        <w:t>Acacia EVs vs NVs - PCA, LDA, cross-validation, loadings, difference spectrum, permutation test - step by step</w:t>
       </w:r>
     </w:p>
     <w:p>
@@ -47,7 +47,7 @@
         <w:spacing w:after="40"/>
       </w:pPr>
       <w:r>
-        <w:t>4. Run the file. Data are read from C:\Users\Hira Aman\Downloads\CODE 005 and both figures open in windows. Fig_PCA_LDA_large.png / .tiff, Fig_ConfusionMatrices.png / .tiff, CV_accuracy.csv, the score tables PCA_LDA_scores_fingerprint.csv / PCA_LDA_scores_CH.csv and PCA_LDA_summary.txt are saved in CODE 005\RESULTS.</w:t>
+        <w:t>4. Run the file. Data are read from C:\Users\Hira Aman\Downloads\CODE 005 and all figures open in windows at the end. The run takes a few minutes (STEP 8 repeats the cross-validation 924 times per region; set N_PERM_MODE = "skip" to leave it out). All figures (PNG + TIFF), tables (CSV), PCA_LDA_summary.txt and RESULTS_for_manuscript.txt are saved in CODE 005\RESULTS.</w:t>
       </w:r>
     </w:p>
     <w:p>
@@ -182,20 +182,98 @@
           <w:sz w:val="15"/>
           <w:noProof/>
         </w:rPr>
-        <w:t># and a second figure with the cross-validated confusion matrices (PCA-LDA and</w:t>
-      </w:r>
-    </w:p>
-    <w:p>
-      <w:pPr>
-        <w:spacing w:before="0" w:after="0" w:line="240" w:lineRule="auto"/>
-      </w:pPr>
-      <w:r>
-        <w:rPr>
-          <w:rFonts w:ascii="Consolas" w:hAnsi="Consolas" w:eastAsia="Consolas" w:cs="Consolas"/>
-          <w:sz w:val="15"/>
-          <w:noProof/>
-        </w:rPr>
-        <w:t># PLS-DA, fingerprint and CH-stretching) - STEP 5.</w:t>
+        <w:t># and further figures/tables (all from the same data):</w:t>
+      </w:r>
+    </w:p>
+    <w:p>
+      <w:pPr>
+        <w:spacing w:before="0" w:after="0" w:line="240" w:lineRule="auto"/>
+      </w:pPr>
+      <w:r>
+        <w:rPr>
+          <w:rFonts w:ascii="Consolas" w:hAnsi="Consolas" w:eastAsia="Consolas" w:cs="Consolas"/>
+          <w:sz w:val="15"/>
+          <w:noProof/>
+        </w:rPr>
+        <w:t>#   STEP 5  cross-validated confusion matrices (PCA-LDA and PLS-DA)</w:t>
+      </w:r>
+    </w:p>
+    <w:p>
+      <w:pPr>
+        <w:spacing w:before="0" w:after="0" w:line="240" w:lineRule="auto"/>
+      </w:pPr>
+      <w:r>
+        <w:rPr>
+          <w:rFonts w:ascii="Consolas" w:hAnsi="Consolas" w:eastAsia="Consolas" w:cs="Consolas"/>
+          <w:sz w:val="15"/>
+          <w:noProof/>
+        </w:rPr>
+        <w:t>#   STEP 6  PCA loadings: which bands drive PC1 and PC2</w:t>
+      </w:r>
+    </w:p>
+    <w:p>
+      <w:pPr>
+        <w:spacing w:before="0" w:after="0" w:line="240" w:lineRule="auto"/>
+      </w:pPr>
+      <w:r>
+        <w:rPr>
+          <w:rFonts w:ascii="Consolas" w:hAnsi="Consolas" w:eastAsia="Consolas" w:cs="Consolas"/>
+          <w:sz w:val="15"/>
+          <w:noProof/>
+        </w:rPr>
+        <w:t>#   STEP 7  difference spectrum NV - EV with its site-to-site uncertainty</w:t>
+      </w:r>
+    </w:p>
+    <w:p>
+      <w:pPr>
+        <w:spacing w:before="0" w:after="0" w:line="240" w:lineRule="auto"/>
+      </w:pPr>
+      <w:r>
+        <w:rPr>
+          <w:rFonts w:ascii="Consolas" w:hAnsi="Consolas" w:eastAsia="Consolas" w:cs="Consolas"/>
+          <w:sz w:val="15"/>
+          <w:noProof/>
+        </w:rPr>
+        <w:t>#   STEP 8  exact label-shuffling (permutation) test over all 924 ways of</w:t>
+      </w:r>
+    </w:p>
+    <w:p>
+      <w:pPr>
+        <w:spacing w:before="0" w:after="0" w:line="240" w:lineRule="auto"/>
+      </w:pPr>
+      <w:r>
+        <w:rPr>
+          <w:rFonts w:ascii="Consolas" w:hAnsi="Consolas" w:eastAsia="Consolas" w:cs="Consolas"/>
+          <w:sz w:val="15"/>
+          <w:noProof/>
+        </w:rPr>
+        <w:t>#           calling 6 of the 12 sites "EV"</w:t>
+      </w:r>
+    </w:p>
+    <w:p>
+      <w:pPr>
+        <w:spacing w:before="0" w:after="0" w:line="240" w:lineRule="auto"/>
+      </w:pPr>
+      <w:r>
+        <w:rPr>
+          <w:rFonts w:ascii="Consolas" w:hAnsi="Consolas" w:eastAsia="Consolas" w:cs="Consolas"/>
+          <w:sz w:val="15"/>
+          <w:noProof/>
+        </w:rPr>
+        <w:t>#   STEP 9  RESULTS_for_manuscript.txt: the actual results written as text,</w:t>
+      </w:r>
+    </w:p>
+    <w:p>
+      <w:pPr>
+        <w:spacing w:before="0" w:after="0" w:line="240" w:lineRule="auto"/>
+      </w:pPr>
+      <w:r>
+        <w:rPr>
+          <w:rFonts w:ascii="Consolas" w:hAnsi="Consolas" w:eastAsia="Consolas" w:cs="Consolas"/>
+          <w:sz w:val="15"/>
+          <w:noProof/>
+        </w:rPr>
+        <w:t>#           every number filled in from this run</w:t>
       </w:r>
     </w:p>
     <w:p>
@@ -455,6 +533,58 @@
           <w:sz w:val="15"/>
           <w:noProof/>
         </w:rPr>
+        <w:t>#   Fig_Loadings.png / .tiff             PC1 and PC2 loadings, both regions</w:t>
+      </w:r>
+    </w:p>
+    <w:p>
+      <w:pPr>
+        <w:spacing w:before="0" w:after="0" w:line="240" w:lineRule="auto"/>
+      </w:pPr>
+      <w:r>
+        <w:rPr>
+          <w:rFonts w:ascii="Consolas" w:hAnsi="Consolas" w:eastAsia="Consolas" w:cs="Consolas"/>
+          <w:sz w:val="15"/>
+          <w:noProof/>
+        </w:rPr>
+        <w:t>#   Fig_Difference.png / .tiff           NV - EV difference spectra, both regions</w:t>
+      </w:r>
+    </w:p>
+    <w:p>
+      <w:pPr>
+        <w:spacing w:before="0" w:after="0" w:line="240" w:lineRule="auto"/>
+      </w:pPr>
+      <w:r>
+        <w:rPr>
+          <w:rFonts w:ascii="Consolas" w:hAnsi="Consolas" w:eastAsia="Consolas" w:cs="Consolas"/>
+          <w:sz w:val="15"/>
+          <w:noProof/>
+        </w:rPr>
+        <w:t>#   Fig_Permutation.png / .tiff          shuffled-label accuracies vs real accuracy</w:t>
+      </w:r>
+    </w:p>
+    <w:p>
+      <w:pPr>
+        <w:spacing w:before="0" w:after="0" w:line="240" w:lineRule="auto"/>
+      </w:pPr>
+      <w:r>
+        <w:rPr>
+          <w:rFonts w:ascii="Consolas" w:hAnsi="Consolas" w:eastAsia="Consolas" w:cs="Consolas"/>
+          <w:sz w:val="15"/>
+          <w:noProof/>
+        </w:rPr>
+        <w:t>#   Loadings_main_bands.csv, Difference_main_bands.csv, Permutation_test.csv</w:t>
+      </w:r>
+    </w:p>
+    <w:p>
+      <w:pPr>
+        <w:spacing w:before="0" w:after="0" w:line="240" w:lineRule="auto"/>
+      </w:pPr>
+      <w:r>
+        <w:rPr>
+          <w:rFonts w:ascii="Consolas" w:hAnsi="Consolas" w:eastAsia="Consolas" w:cs="Consolas"/>
+          <w:sz w:val="15"/>
+          <w:noProof/>
+        </w:rPr>
         <w:t>#   PCA_LDA_summary.txt                  all numbers printed by the script</w:t>
       </w:r>
     </w:p>
@@ -468,6 +598,45 @@
           <w:sz w:val="15"/>
           <w:noProof/>
         </w:rPr>
+        <w:t>#   RESULTS_for_manuscript.txt           the results in words (STEP 9)</w:t>
+      </w:r>
+    </w:p>
+    <w:p>
+      <w:pPr>
+        <w:spacing w:before="0" w:after="0" w:line="240" w:lineRule="auto"/>
+      </w:pPr>
+      <w:r>
+        <w:rPr>
+          <w:rFonts w:ascii="Consolas" w:hAnsi="Consolas" w:eastAsia="Consolas" w:cs="Consolas"/>
+          <w:sz w:val="15"/>
+          <w:noProof/>
+        </w:rPr>
+        <w:t># The permutation test (STEP 8) repeats the whole cross-validation 924 times per</w:t>
+      </w:r>
+    </w:p>
+    <w:p>
+      <w:pPr>
+        <w:spacing w:before="0" w:after="0" w:line="240" w:lineRule="auto"/>
+      </w:pPr>
+      <w:r>
+        <w:rPr>
+          <w:rFonts w:ascii="Consolas" w:hAnsi="Consolas" w:eastAsia="Consolas" w:cs="Consolas"/>
+          <w:sz w:val="15"/>
+          <w:noProof/>
+        </w:rPr>
+        <w:t># region and takes several minutes; set N_PERM_MODE = 'skip' below to leave it out.</w:t>
+      </w:r>
+    </w:p>
+    <w:p>
+      <w:pPr>
+        <w:spacing w:before="0" w:after="0" w:line="240" w:lineRule="auto"/>
+      </w:pPr>
+      <w:r>
+        <w:rPr>
+          <w:rFonts w:ascii="Consolas" w:hAnsi="Consolas" w:eastAsia="Consolas" w:cs="Consolas"/>
+          <w:sz w:val="15"/>
+          <w:noProof/>
+        </w:rPr>
         <w:t># =============================================================================</w:t>
       </w:r>
     </w:p>
@@ -726,6 +895,19 @@
           <w:sz w:val="15"/>
           <w:noProof/>
         </w:rPr>
+        <w:t>from itertools import combinations</w:t>
+      </w:r>
+    </w:p>
+    <w:p>
+      <w:pPr>
+        <w:spacing w:before="0" w:after="0" w:line="240" w:lineRule="auto"/>
+      </w:pPr>
+      <w:r>
+        <w:rPr>
+          <w:rFonts w:ascii="Consolas" w:hAnsi="Consolas" w:eastAsia="Consolas" w:cs="Consolas"/>
+          <w:sz w:val="15"/>
+          <w:noProof/>
+        </w:rPr>
       </w:r>
     </w:p>
     <w:p>
@@ -958,6 +1140,19 @@
           <w:sz w:val="15"/>
           <w:noProof/>
         </w:rPr>
+        <w:t>N_PERM_MODE = 'exact'                       # 'exact' = all 924 site labelings, 'skip' = no test</w:t>
+      </w:r>
+    </w:p>
+    <w:p>
+      <w:pPr>
+        <w:spacing w:before="0" w:after="0" w:line="240" w:lineRule="auto"/>
+      </w:pPr>
+      <w:r>
+        <w:rPr>
+          <w:rFonts w:ascii="Consolas" w:hAnsi="Consolas" w:eastAsia="Consolas" w:cs="Consolas"/>
+          <w:sz w:val="15"/>
+          <w:noProof/>
+        </w:rPr>
         <w:t># spectral windows: raw range read, 2 cm-1 grid, region used in PCA</w:t>
       </w:r>
     </w:p>
@@ -2629,6 +2824,19 @@
           <w:sz w:val="15"/>
           <w:noProof/>
         </w:rPr>
+        <w:t>RES = {}                                    # results of every step, used in STEP 9</w:t>
+      </w:r>
+    </w:p>
+    <w:p>
+      <w:pPr>
+        <w:spacing w:before="0" w:after="0" w:line="240" w:lineRule="auto"/>
+      </w:pPr>
+      <w:r>
+        <w:rPr>
+          <w:rFonts w:ascii="Consolas" w:hAnsi="Consolas" w:eastAsia="Consolas" w:cs="Consolas"/>
+          <w:sz w:val="15"/>
+          <w:noProof/>
+        </w:rPr>
         <w:t>for row, w in enumerate(['fingerprint', 'ch']):</w:t>
       </w:r>
     </w:p>
@@ -3043,20 +3251,20 @@
           <w:sz w:val="15"/>
           <w:noProof/>
         </w:rPr>
-        <w:t xml:space="preserve">    # separation; the classification accuracy of the paper comes from the</w:t>
-      </w:r>
-    </w:p>
-    <w:p>
-      <w:pPr>
-        <w:spacing w:before="0" w:after="0" w:line="240" w:lineRule="auto"/>
-      </w:pPr>
-      <w:r>
-        <w:rPr>
-          <w:rFonts w:ascii="Consolas" w:hAnsi="Consolas" w:eastAsia="Consolas" w:cs="Consolas"/>
-          <w:sz w:val="15"/>
-          <w:noProof/>
-        </w:rPr>
-        <w:t xml:space="preserve">    # cross-validation in Acacia_EV_NV_Analysis.py (whole sites left out).</w:t>
+        <w:t xml:space="preserve">    # separation; the classification accuracy comes from the cross-validation</w:t>
+      </w:r>
+    </w:p>
+    <w:p>
+      <w:pPr>
+        <w:spacing w:before="0" w:after="0" w:line="240" w:lineRule="auto"/>
+      </w:pPr>
+      <w:r>
+        <w:rPr>
+          <w:rFonts w:ascii="Consolas" w:hAnsi="Consolas" w:eastAsia="Consolas" w:cs="Consolas"/>
+          <w:sz w:val="15"/>
+          <w:noProof/>
+        </w:rPr>
+        <w:t xml:space="preserve">    # in STEP 5 (whole sites left out).</w:t>
       </w:r>
     </w:p>
     <w:p>
@@ -3431,6 +3639,58 @@
           <w:sz w:val="15"/>
           <w:noProof/>
         </w:rPr>
+        <w:t xml:space="preserve">    load = pca.components_[:2].copy()</w:t>
+      </w:r>
+    </w:p>
+    <w:p>
+      <w:pPr>
+        <w:spacing w:before="0" w:after="0" w:line="240" w:lineRule="auto"/>
+      </w:pPr>
+      <w:r>
+        <w:rPr>
+          <w:rFonts w:ascii="Consolas" w:hAnsi="Consolas" w:eastAsia="Consolas" w:cs="Consolas"/>
+          <w:sz w:val="15"/>
+          <w:noProof/>
+        </w:rPr>
+        <w:t xml:space="preserve">    load[0] *= sign                                          # same orientation as the scores</w:t>
+      </w:r>
+    </w:p>
+    <w:p>
+      <w:pPr>
+        <w:spacing w:before="0" w:after="0" w:line="240" w:lineRule="auto"/>
+      </w:pPr>
+      <w:r>
+        <w:rPr>
+          <w:rFonts w:ascii="Consolas" w:hAnsi="Consolas" w:eastAsia="Consolas" w:cs="Consolas"/>
+          <w:sz w:val="15"/>
+          <w:noProof/>
+        </w:rPr>
+        <w:t xml:space="preserve">    RES[w] = {'var': var, 'p_ld1': p, 'ld_median': {c: np.median(ld[y == c]) for c in (0, 1)},</w:t>
+      </w:r>
+    </w:p>
+    <w:p>
+      <w:pPr>
+        <w:spacing w:before="0" w:after="0" w:line="240" w:lineRule="auto"/>
+      </w:pPr>
+      <w:r>
+        <w:rPr>
+          <w:rFonts w:ascii="Consolas" w:hAnsi="Consolas" w:eastAsia="Consolas" w:cs="Consolas"/>
+          <w:sz w:val="15"/>
+          <w:noProof/>
+        </w:rPr>
+        <w:t xml:space="preserve">              'pc1_mean': {c: T[y == c, 0].mean() for c in (0, 1)}, 'loadings': load}</w:t>
+      </w:r>
+    </w:p>
+    <w:p>
+      <w:pPr>
+        <w:spacing w:before="0" w:after="0" w:line="240" w:lineRule="auto"/>
+      </w:pPr>
+      <w:r>
+        <w:rPr>
+          <w:rFonts w:ascii="Consolas" w:hAnsi="Consolas" w:eastAsia="Consolas" w:cs="Consolas"/>
+          <w:sz w:val="15"/>
+          <w:noProof/>
+        </w:rPr>
       </w:r>
     </w:p>
     <w:p>
@@ -4437,59 +4697,111 @@
           <w:sz w:val="15"/>
           <w:noProof/>
         </w:rPr>
-        <w:t>def cv_pca_lda(X, refit=False):</w:t>
-      </w:r>
-    </w:p>
-    <w:p>
-      <w:pPr>
-        <w:spacing w:before="0" w:after="0" w:line="240" w:lineRule="auto"/>
-      </w:pPr>
-      <w:r>
-        <w:rPr>
-          <w:rFonts w:ascii="Consolas" w:hAnsi="Consolas" w:eastAsia="Consolas" w:cs="Consolas"/>
-          <w:sz w:val="15"/>
-          <w:noProof/>
-        </w:rPr>
-        <w:t xml:space="preserve">    """refit=True: PCA is also re-fitted inside each training fold (stricter check)."""</w:t>
-      </w:r>
-    </w:p>
-    <w:p>
-      <w:pPr>
-        <w:spacing w:before="0" w:after="0" w:line="240" w:lineRule="auto"/>
-      </w:pPr>
-      <w:r>
-        <w:rPr>
-          <w:rFonts w:ascii="Consolas" w:hAnsi="Consolas" w:eastAsia="Consolas" w:cs="Consolas"/>
-          <w:sz w:val="15"/>
-          <w:noProof/>
-        </w:rPr>
-        <w:t xml:space="preserve">    T = PCA(n_components=N_COMP, svd_solver='full').fit_transform(X)</w:t>
-      </w:r>
-    </w:p>
-    <w:p>
-      <w:pPr>
-        <w:spacing w:before="0" w:after="0" w:line="240" w:lineRule="auto"/>
-      </w:pPr>
-      <w:r>
-        <w:rPr>
-          <w:rFonts w:ascii="Consolas" w:hAnsi="Consolas" w:eastAsia="Consolas" w:cs="Consolas"/>
-          <w:sz w:val="15"/>
-          <w:noProof/>
-        </w:rPr>
-        <w:t xml:space="preserve">    pred = np.empty(len(y), int)</w:t>
-      </w:r>
-    </w:p>
-    <w:p>
-      <w:pPr>
-        <w:spacing w:before="0" w:after="0" w:line="240" w:lineRule="auto"/>
-      </w:pPr>
-      <w:r>
-        <w:rPr>
-          <w:rFonts w:ascii="Consolas" w:hAnsi="Consolas" w:eastAsia="Consolas" w:cs="Consolas"/>
-          <w:sz w:val="15"/>
-          <w:noProof/>
-        </w:rPr>
-        <w:t xml:space="preserve">    for tr, te in folds:</w:t>
+        <w:t>def cv_pca_lda(X, refit=False, labels=None, folds_=None, T=None):</w:t>
+      </w:r>
+    </w:p>
+    <w:p>
+      <w:pPr>
+        <w:spacing w:before="0" w:after="0" w:line="240" w:lineRule="auto"/>
+      </w:pPr>
+      <w:r>
+        <w:rPr>
+          <w:rFonts w:ascii="Consolas" w:hAnsi="Consolas" w:eastAsia="Consolas" w:cs="Consolas"/>
+          <w:sz w:val="15"/>
+          <w:noProof/>
+        </w:rPr>
+        <w:t xml:space="preserve">    """refit=True: PCA is also re-fitted inside each training fold (stricter check).</w:t>
+      </w:r>
+    </w:p>
+    <w:p>
+      <w:pPr>
+        <w:spacing w:before="0" w:after="0" w:line="240" w:lineRule="auto"/>
+      </w:pPr>
+      <w:r>
+        <w:rPr>
+          <w:rFonts w:ascii="Consolas" w:hAnsi="Consolas" w:eastAsia="Consolas" w:cs="Consolas"/>
+          <w:sz w:val="15"/>
+          <w:noProof/>
+        </w:rPr>
+        <w:t xml:space="preserve">    labels / folds_ / T are only given in the permutation test (STEP 8)."""</w:t>
+      </w:r>
+    </w:p>
+    <w:p>
+      <w:pPr>
+        <w:spacing w:before="0" w:after="0" w:line="240" w:lineRule="auto"/>
+      </w:pPr>
+      <w:r>
+        <w:rPr>
+          <w:rFonts w:ascii="Consolas" w:hAnsi="Consolas" w:eastAsia="Consolas" w:cs="Consolas"/>
+          <w:sz w:val="15"/>
+          <w:noProof/>
+        </w:rPr>
+        <w:t xml:space="preserve">    labels = y if labels is None else labels</w:t>
+      </w:r>
+    </w:p>
+    <w:p>
+      <w:pPr>
+        <w:spacing w:before="0" w:after="0" w:line="240" w:lineRule="auto"/>
+      </w:pPr>
+      <w:r>
+        <w:rPr>
+          <w:rFonts w:ascii="Consolas" w:hAnsi="Consolas" w:eastAsia="Consolas" w:cs="Consolas"/>
+          <w:sz w:val="15"/>
+          <w:noProof/>
+        </w:rPr>
+        <w:t xml:space="preserve">    folds_ = folds if folds_ is None else folds_</w:t>
+      </w:r>
+    </w:p>
+    <w:p>
+      <w:pPr>
+        <w:spacing w:before="0" w:after="0" w:line="240" w:lineRule="auto"/>
+      </w:pPr>
+      <w:r>
+        <w:rPr>
+          <w:rFonts w:ascii="Consolas" w:hAnsi="Consolas" w:eastAsia="Consolas" w:cs="Consolas"/>
+          <w:sz w:val="15"/>
+          <w:noProof/>
+        </w:rPr>
+        <w:t xml:space="preserve">    if T is None:</w:t>
+      </w:r>
+    </w:p>
+    <w:p>
+      <w:pPr>
+        <w:spacing w:before="0" w:after="0" w:line="240" w:lineRule="auto"/>
+      </w:pPr>
+      <w:r>
+        <w:rPr>
+          <w:rFonts w:ascii="Consolas" w:hAnsi="Consolas" w:eastAsia="Consolas" w:cs="Consolas"/>
+          <w:sz w:val="15"/>
+          <w:noProof/>
+        </w:rPr>
+        <w:t xml:space="preserve">        T = PCA(n_components=N_COMP, svd_solver='full').fit_transform(X)</w:t>
+      </w:r>
+    </w:p>
+    <w:p>
+      <w:pPr>
+        <w:spacing w:before="0" w:after="0" w:line="240" w:lineRule="auto"/>
+      </w:pPr>
+      <w:r>
+        <w:rPr>
+          <w:rFonts w:ascii="Consolas" w:hAnsi="Consolas" w:eastAsia="Consolas" w:cs="Consolas"/>
+          <w:sz w:val="15"/>
+          <w:noProof/>
+        </w:rPr>
+        <w:t xml:space="preserve">    pred = np.empty(len(labels), int)</w:t>
+      </w:r>
+    </w:p>
+    <w:p>
+      <w:pPr>
+        <w:spacing w:before="0" w:after="0" w:line="240" w:lineRule="auto"/>
+      </w:pPr>
+      <w:r>
+        <w:rPr>
+          <w:rFonts w:ascii="Consolas" w:hAnsi="Consolas" w:eastAsia="Consolas" w:cs="Consolas"/>
+          <w:sz w:val="15"/>
+          <w:noProof/>
+        </w:rPr>
+        <w:t xml:space="preserve">    for tr, te in folds_:</w:t>
       </w:r>
     </w:p>
     <w:p>
@@ -4567,7 +4879,7 @@
           <w:sz w:val="15"/>
           <w:noProof/>
         </w:rPr>
-        <w:t xml:space="preserve">        pred[te] = LinearDiscriminantAnalysis().fit(Ttr, y[tr]).predict(Tte)</w:t>
+        <w:t xml:space="preserve">        pred[te] = LinearDiscriminantAnalysis().fit(Ttr, labels[tr]).predict(Tte)</w:t>
       </w:r>
     </w:p>
     <w:p>
@@ -4617,33 +4929,59 @@
           <w:sz w:val="15"/>
           <w:noProof/>
         </w:rPr>
-        <w:t>def cv_plsda(X):</w:t>
-      </w:r>
-    </w:p>
-    <w:p>
-      <w:pPr>
-        <w:spacing w:before="0" w:after="0" w:line="240" w:lineRule="auto"/>
-      </w:pPr>
-      <w:r>
-        <w:rPr>
-          <w:rFonts w:ascii="Consolas" w:hAnsi="Consolas" w:eastAsia="Consolas" w:cs="Consolas"/>
-          <w:sz w:val="15"/>
-          <w:noProof/>
-        </w:rPr>
-        <w:t xml:space="preserve">    pred = np.empty(len(y), int)</w:t>
-      </w:r>
-    </w:p>
-    <w:p>
-      <w:pPr>
-        <w:spacing w:before="0" w:after="0" w:line="240" w:lineRule="auto"/>
-      </w:pPr>
-      <w:r>
-        <w:rPr>
-          <w:rFonts w:ascii="Consolas" w:hAnsi="Consolas" w:eastAsia="Consolas" w:cs="Consolas"/>
-          <w:sz w:val="15"/>
-          <w:noProof/>
-        </w:rPr>
-        <w:t xml:space="preserve">    for tr, te in folds:</w:t>
+        <w:t>def cv_plsda(X, labels=None, folds_=None):</w:t>
+      </w:r>
+    </w:p>
+    <w:p>
+      <w:pPr>
+        <w:spacing w:before="0" w:after="0" w:line="240" w:lineRule="auto"/>
+      </w:pPr>
+      <w:r>
+        <w:rPr>
+          <w:rFonts w:ascii="Consolas" w:hAnsi="Consolas" w:eastAsia="Consolas" w:cs="Consolas"/>
+          <w:sz w:val="15"/>
+          <w:noProof/>
+        </w:rPr>
+        <w:t xml:space="preserve">    labels = y if labels is None else labels</w:t>
+      </w:r>
+    </w:p>
+    <w:p>
+      <w:pPr>
+        <w:spacing w:before="0" w:after="0" w:line="240" w:lineRule="auto"/>
+      </w:pPr>
+      <w:r>
+        <w:rPr>
+          <w:rFonts w:ascii="Consolas" w:hAnsi="Consolas" w:eastAsia="Consolas" w:cs="Consolas"/>
+          <w:sz w:val="15"/>
+          <w:noProof/>
+        </w:rPr>
+        <w:t xml:space="preserve">    folds_ = folds if folds_ is None else folds_</w:t>
+      </w:r>
+    </w:p>
+    <w:p>
+      <w:pPr>
+        <w:spacing w:before="0" w:after="0" w:line="240" w:lineRule="auto"/>
+      </w:pPr>
+      <w:r>
+        <w:rPr>
+          <w:rFonts w:ascii="Consolas" w:hAnsi="Consolas" w:eastAsia="Consolas" w:cs="Consolas"/>
+          <w:sz w:val="15"/>
+          <w:noProof/>
+        </w:rPr>
+        <w:t xml:space="preserve">    pred = np.empty(len(labels), int)</w:t>
+      </w:r>
+    </w:p>
+    <w:p>
+      <w:pPr>
+        <w:spacing w:before="0" w:after="0" w:line="240" w:lineRule="auto"/>
+      </w:pPr>
+      <w:r>
+        <w:rPr>
+          <w:rFonts w:ascii="Consolas" w:hAnsi="Consolas" w:eastAsia="Consolas" w:cs="Consolas"/>
+          <w:sz w:val="15"/>
+          <w:noProof/>
+        </w:rPr>
+        <w:t xml:space="preserve">    for tr, te in folds_:</w:t>
       </w:r>
     </w:p>
     <w:p>
@@ -4669,7 +5007,7 @@
           <w:sz w:val="15"/>
           <w:noProof/>
         </w:rPr>
-        <w:t xml:space="preserve">        pls = PLSRegression(n_components=N_COMP, scale=False).fit(sc.transform(X[tr]), y[tr])</w:t>
+        <w:t xml:space="preserve">        pls = PLSRegression(n_components=N_COMP, scale=False).fit(sc.transform(X[tr]), labels[tr])</w:t>
       </w:r>
     </w:p>
     <w:p>
@@ -4966,6 +5304,19 @@
           <w:sz w:val="15"/>
           <w:noProof/>
         </w:rPr>
+        <w:t xml:space="preserve">        RES[w].setdefault('cv', {})[model] = {'acc': acc, 'sens': sens, 'spec': spec, 'cm': cm}</w:t>
+      </w:r>
+    </w:p>
+    <w:p>
+      <w:pPr>
+        <w:spacing w:before="0" w:after="0" w:line="240" w:lineRule="auto"/>
+      </w:pPr>
+      <w:r>
+        <w:rPr>
+          <w:rFonts w:ascii="Consolas" w:hAnsi="Consolas" w:eastAsia="Consolas" w:cs="Consolas"/>
+          <w:sz w:val="15"/>
+          <w:noProof/>
+        </w:rPr>
         <w:t xml:space="preserve">        report(f'  {w:11s} {model}: accuracy {acc:.1f} %, sensitivity {sens:.1f} %, '</w:t>
       </w:r>
     </w:p>
@@ -5200,6 +5551,19 @@
           <w:sz w:val="15"/>
           <w:noProof/>
         </w:rPr>
+        <w:t xml:space="preserve">    RES[w]['strict'] = strict</w:t>
+      </w:r>
+    </w:p>
+    <w:p>
+      <w:pPr>
+        <w:spacing w:before="0" w:after="0" w:line="240" w:lineRule="auto"/>
+      </w:pPr>
+      <w:r>
+        <w:rPr>
+          <w:rFonts w:ascii="Consolas" w:hAnsi="Consolas" w:eastAsia="Consolas" w:cs="Consolas"/>
+          <w:sz w:val="15"/>
+          <w:noProof/>
+        </w:rPr>
         <w:t>pd.DataFrame(cv_rows).to_csv(OUTPUT_DIR / 'CV_accuracy.csv', index=False)</w:t>
       </w:r>
     </w:p>
@@ -5227,6 +5591,3072 @@
           <w:noProof/>
         </w:rPr>
         <w:t>save_figure(fig2, 'Fig_ConfusionMatrices')</w:t>
+      </w:r>
+    </w:p>
+    <w:p>
+      <w:pPr>
+        <w:spacing w:before="0" w:after="0" w:line="240" w:lineRule="auto"/>
+      </w:pPr>
+      <w:r>
+        <w:rPr>
+          <w:rFonts w:ascii="Consolas" w:hAnsi="Consolas" w:eastAsia="Consolas" w:cs="Consolas"/>
+          <w:sz w:val="15"/>
+          <w:noProof/>
+        </w:rPr>
+      </w:r>
+    </w:p>
+    <w:p>
+      <w:pPr>
+        <w:spacing w:before="0" w:after="0" w:line="240" w:lineRule="auto"/>
+      </w:pPr>
+      <w:r>
+        <w:rPr>
+          <w:rFonts w:ascii="Consolas" w:hAnsi="Consolas" w:eastAsia="Consolas" w:cs="Consolas"/>
+          <w:sz w:val="15"/>
+          <w:noProof/>
+        </w:rPr>
+      </w:r>
+    </w:p>
+    <w:p>
+      <w:pPr>
+        <w:spacing w:before="0" w:after="0" w:line="240" w:lineRule="auto"/>
+      </w:pPr>
+      <w:r>
+        <w:rPr>
+          <w:rFonts w:ascii="Consolas" w:hAnsi="Consolas" w:eastAsia="Consolas" w:cs="Consolas"/>
+          <w:sz w:val="15"/>
+          <w:noProof/>
+        </w:rPr>
+        <w:t>def main_bands(g, curve, n, min_gap=20):</w:t>
+      </w:r>
+    </w:p>
+    <w:p>
+      <w:pPr>
+        <w:spacing w:before="0" w:after="0" w:line="240" w:lineRule="auto"/>
+      </w:pPr>
+      <w:r>
+        <w:rPr>
+          <w:rFonts w:ascii="Consolas" w:hAnsi="Consolas" w:eastAsia="Consolas" w:cs="Consolas"/>
+          <w:sz w:val="15"/>
+          <w:noProof/>
+        </w:rPr>
+        <w:t xml:space="preserve">    """The n largest local extrema (by absolute value) of a curve, at least</w:t>
+      </w:r>
+    </w:p>
+    <w:p>
+      <w:pPr>
+        <w:spacing w:before="0" w:after="0" w:line="240" w:lineRule="auto"/>
+      </w:pPr>
+      <w:r>
+        <w:rPr>
+          <w:rFonts w:ascii="Consolas" w:hAnsi="Consolas" w:eastAsia="Consolas" w:cs="Consolas"/>
+          <w:sz w:val="15"/>
+          <w:noProof/>
+        </w:rPr>
+        <w:t xml:space="preserve">    min_gap cm-1 apart. Returns [(wavenumber, value), ...] sorted by wavenumber."""</w:t>
+      </w:r>
+    </w:p>
+    <w:p>
+      <w:pPr>
+        <w:spacing w:before="0" w:after="0" w:line="240" w:lineRule="auto"/>
+      </w:pPr>
+      <w:r>
+        <w:rPr>
+          <w:rFonts w:ascii="Consolas" w:hAnsi="Consolas" w:eastAsia="Consolas" w:cs="Consolas"/>
+          <w:sz w:val="15"/>
+          <w:noProof/>
+        </w:rPr>
+        <w:t xml:space="preserve">    i = np.flatnonzero((np.abs(curve[1:-1]) &gt;= np.abs(curve[:-2])) &amp;</w:t>
+      </w:r>
+    </w:p>
+    <w:p>
+      <w:pPr>
+        <w:spacing w:before="0" w:after="0" w:line="240" w:lineRule="auto"/>
+      </w:pPr>
+      <w:r>
+        <w:rPr>
+          <w:rFonts w:ascii="Consolas" w:hAnsi="Consolas" w:eastAsia="Consolas" w:cs="Consolas"/>
+          <w:sz w:val="15"/>
+          <w:noProof/>
+        </w:rPr>
+        <w:t xml:space="preserve">                       (np.abs(curve[1:-1]) &gt;= np.abs(curve[2:]))) + 1</w:t>
+      </w:r>
+    </w:p>
+    <w:p>
+      <w:pPr>
+        <w:spacing w:before="0" w:after="0" w:line="240" w:lineRule="auto"/>
+      </w:pPr>
+      <w:r>
+        <w:rPr>
+          <w:rFonts w:ascii="Consolas" w:hAnsi="Consolas" w:eastAsia="Consolas" w:cs="Consolas"/>
+          <w:sz w:val="15"/>
+          <w:noProof/>
+        </w:rPr>
+        <w:t xml:space="preserve">    chosen = []</w:t>
+      </w:r>
+    </w:p>
+    <w:p>
+      <w:pPr>
+        <w:spacing w:before="0" w:after="0" w:line="240" w:lineRule="auto"/>
+      </w:pPr>
+      <w:r>
+        <w:rPr>
+          <w:rFonts w:ascii="Consolas" w:hAnsi="Consolas" w:eastAsia="Consolas" w:cs="Consolas"/>
+          <w:sz w:val="15"/>
+          <w:noProof/>
+        </w:rPr>
+        <w:t xml:space="preserve">    for k in i[np.argsort(-np.abs(curve[i]))]:</w:t>
+      </w:r>
+    </w:p>
+    <w:p>
+      <w:pPr>
+        <w:spacing w:before="0" w:after="0" w:line="240" w:lineRule="auto"/>
+      </w:pPr>
+      <w:r>
+        <w:rPr>
+          <w:rFonts w:ascii="Consolas" w:hAnsi="Consolas" w:eastAsia="Consolas" w:cs="Consolas"/>
+          <w:sz w:val="15"/>
+          <w:noProof/>
+        </w:rPr>
+        <w:t xml:space="preserve">        if all(abs(g[k] - g[j]) &gt;= min_gap for j in chosen):</w:t>
+      </w:r>
+    </w:p>
+    <w:p>
+      <w:pPr>
+        <w:spacing w:before="0" w:after="0" w:line="240" w:lineRule="auto"/>
+      </w:pPr>
+      <w:r>
+        <w:rPr>
+          <w:rFonts w:ascii="Consolas" w:hAnsi="Consolas" w:eastAsia="Consolas" w:cs="Consolas"/>
+          <w:sz w:val="15"/>
+          <w:noProof/>
+        </w:rPr>
+        <w:t xml:space="preserve">            chosen.append(k)</w:t>
+      </w:r>
+    </w:p>
+    <w:p>
+      <w:pPr>
+        <w:spacing w:before="0" w:after="0" w:line="240" w:lineRule="auto"/>
+      </w:pPr>
+      <w:r>
+        <w:rPr>
+          <w:rFonts w:ascii="Consolas" w:hAnsi="Consolas" w:eastAsia="Consolas" w:cs="Consolas"/>
+          <w:sz w:val="15"/>
+          <w:noProof/>
+        </w:rPr>
+        <w:t xml:space="preserve">        if len(chosen) == n:</w:t>
+      </w:r>
+    </w:p>
+    <w:p>
+      <w:pPr>
+        <w:spacing w:before="0" w:after="0" w:line="240" w:lineRule="auto"/>
+      </w:pPr>
+      <w:r>
+        <w:rPr>
+          <w:rFonts w:ascii="Consolas" w:hAnsi="Consolas" w:eastAsia="Consolas" w:cs="Consolas"/>
+          <w:sz w:val="15"/>
+          <w:noProof/>
+        </w:rPr>
+        <w:t xml:space="preserve">            break</w:t>
+      </w:r>
+    </w:p>
+    <w:p>
+      <w:pPr>
+        <w:spacing w:before="0" w:after="0" w:line="240" w:lineRule="auto"/>
+      </w:pPr>
+      <w:r>
+        <w:rPr>
+          <w:rFonts w:ascii="Consolas" w:hAnsi="Consolas" w:eastAsia="Consolas" w:cs="Consolas"/>
+          <w:sz w:val="15"/>
+          <w:noProof/>
+        </w:rPr>
+        <w:t xml:space="preserve">    return [(g[k], curve[k]) for k in sorted(chosen)]</w:t>
+      </w:r>
+    </w:p>
+    <w:p>
+      <w:pPr>
+        <w:spacing w:before="0" w:after="0" w:line="240" w:lineRule="auto"/>
+      </w:pPr>
+      <w:r>
+        <w:rPr>
+          <w:rFonts w:ascii="Consolas" w:hAnsi="Consolas" w:eastAsia="Consolas" w:cs="Consolas"/>
+          <w:sz w:val="15"/>
+          <w:noProof/>
+        </w:rPr>
+      </w:r>
+    </w:p>
+    <w:p>
+      <w:pPr>
+        <w:spacing w:before="0" w:after="0" w:line="240" w:lineRule="auto"/>
+      </w:pPr>
+      <w:r>
+        <w:rPr>
+          <w:rFonts w:ascii="Consolas" w:hAnsi="Consolas" w:eastAsia="Consolas" w:cs="Consolas"/>
+          <w:sz w:val="15"/>
+          <w:noProof/>
+        </w:rPr>
+      </w:r>
+    </w:p>
+    <w:p>
+      <w:pPr>
+        <w:spacing w:before="0" w:after="0" w:line="240" w:lineRule="auto"/>
+      </w:pPr>
+      <w:r>
+        <w:rPr>
+          <w:rFonts w:ascii="Consolas" w:hAnsi="Consolas" w:eastAsia="Consolas" w:cs="Consolas"/>
+          <w:sz w:val="15"/>
+          <w:noProof/>
+        </w:rPr>
+        <w:t>N_BANDS = {'fingerprint': 8, 'ch': 4}       # how many bands are labelled per region</w:t>
+      </w:r>
+    </w:p>
+    <w:p>
+      <w:pPr>
+        <w:spacing w:before="0" w:after="0" w:line="240" w:lineRule="auto"/>
+      </w:pPr>
+      <w:r>
+        <w:rPr>
+          <w:rFonts w:ascii="Consolas" w:hAnsi="Consolas" w:eastAsia="Consolas" w:cs="Consolas"/>
+          <w:sz w:val="15"/>
+          <w:noProof/>
+        </w:rPr>
+      </w:r>
+    </w:p>
+    <w:p>
+      <w:pPr>
+        <w:spacing w:before="0" w:after="0" w:line="240" w:lineRule="auto"/>
+      </w:pPr>
+      <w:r>
+        <w:rPr>
+          <w:rFonts w:ascii="Consolas" w:hAnsi="Consolas" w:eastAsia="Consolas" w:cs="Consolas"/>
+          <w:sz w:val="15"/>
+          <w:noProof/>
+        </w:rPr>
+      </w:r>
+    </w:p>
+    <w:p>
+      <w:pPr>
+        <w:spacing w:before="0" w:after="0" w:line="240" w:lineRule="auto"/>
+      </w:pPr>
+      <w:r>
+        <w:rPr>
+          <w:rFonts w:ascii="Consolas" w:hAnsi="Consolas" w:eastAsia="Consolas" w:cs="Consolas"/>
+          <w:sz w:val="15"/>
+          <w:noProof/>
+        </w:rPr>
+        <w:t># ============================================================================</w:t>
+      </w:r>
+    </w:p>
+    <w:p>
+      <w:pPr>
+        <w:spacing w:before="0" w:after="0" w:line="240" w:lineRule="auto"/>
+      </w:pPr>
+      <w:r>
+        <w:rPr>
+          <w:rFonts w:ascii="Consolas" w:hAnsi="Consolas" w:eastAsia="Consolas" w:cs="Consolas"/>
+          <w:sz w:val="15"/>
+          <w:noProof/>
+        </w:rPr>
+        <w:t># STEP 6 - PCA loadings: which bands make PC1 and PC2</w:t>
+      </w:r>
+    </w:p>
+    <w:p>
+      <w:pPr>
+        <w:spacing w:before="0" w:after="0" w:line="240" w:lineRule="auto"/>
+      </w:pPr>
+      <w:r>
+        <w:rPr>
+          <w:rFonts w:ascii="Consolas" w:hAnsi="Consolas" w:eastAsia="Consolas" w:cs="Consolas"/>
+          <w:sz w:val="15"/>
+          <w:noProof/>
+        </w:rPr>
+        <w:t># ============================================================================</w:t>
+      </w:r>
+    </w:p>
+    <w:p>
+      <w:pPr>
+        <w:spacing w:before="0" w:after="0" w:line="240" w:lineRule="auto"/>
+      </w:pPr>
+      <w:r>
+        <w:rPr>
+          <w:rFonts w:ascii="Consolas" w:hAnsi="Consolas" w:eastAsia="Consolas" w:cs="Consolas"/>
+          <w:sz w:val="15"/>
+          <w:noProof/>
+        </w:rPr>
+        <w:t># A loading tells how much each wavenumber contributes to a PC. A spectrum with</w:t>
+      </w:r>
+    </w:p>
+    <w:p>
+      <w:pPr>
+        <w:spacing w:before="0" w:after="0" w:line="240" w:lineRule="auto"/>
+      </w:pPr>
+      <w:r>
+        <w:rPr>
+          <w:rFonts w:ascii="Consolas" w:hAnsi="Consolas" w:eastAsia="Consolas" w:cs="Consolas"/>
+          <w:sz w:val="15"/>
+          <w:noProof/>
+        </w:rPr>
+        <w:t># a high PC1 score is relatively strong at the bands with positive PC1 loading</w:t>
+      </w:r>
+    </w:p>
+    <w:p>
+      <w:pPr>
+        <w:spacing w:before="0" w:after="0" w:line="240" w:lineRule="auto"/>
+      </w:pPr>
+      <w:r>
+        <w:rPr>
+          <w:rFonts w:ascii="Consolas" w:hAnsi="Consolas" w:eastAsia="Consolas" w:cs="Consolas"/>
+          <w:sz w:val="15"/>
+          <w:noProof/>
+        </w:rPr>
+        <w:t># and weak at the bands with negative loading. Because the group means of the</w:t>
+      </w:r>
+    </w:p>
+    <w:p>
+      <w:pPr>
+        <w:spacing w:before="0" w:after="0" w:line="240" w:lineRule="auto"/>
+      </w:pPr>
+      <w:r>
+        <w:rPr>
+          <w:rFonts w:ascii="Consolas" w:hAnsi="Consolas" w:eastAsia="Consolas" w:cs="Consolas"/>
+          <w:sz w:val="15"/>
+          <w:noProof/>
+        </w:rPr>
+        <w:t># PC1 scores have opposite signs (STEP 2), the PC1 loading shows which bands are</w:t>
+      </w:r>
+    </w:p>
+    <w:p>
+      <w:pPr>
+        <w:spacing w:before="0" w:after="0" w:line="240" w:lineRule="auto"/>
+      </w:pPr>
+      <w:r>
+        <w:rPr>
+          <w:rFonts w:ascii="Consolas" w:hAnsi="Consolas" w:eastAsia="Consolas" w:cs="Consolas"/>
+          <w:sz w:val="15"/>
+          <w:noProof/>
+        </w:rPr>
+        <w:t># relatively stronger in EVs and which in NVs (relative, because of SNV).</w:t>
+      </w:r>
+    </w:p>
+    <w:p>
+      <w:pPr>
+        <w:spacing w:before="0" w:after="0" w:line="240" w:lineRule="auto"/>
+      </w:pPr>
+      <w:r>
+        <w:rPr>
+          <w:rFonts w:ascii="Consolas" w:hAnsi="Consolas" w:eastAsia="Consolas" w:cs="Consolas"/>
+          <w:sz w:val="15"/>
+          <w:noProof/>
+        </w:rPr>
+        <w:t>report('\nSTEP 6 - PCA loadings (largest PC1 bands)')</w:t>
+      </w:r>
+    </w:p>
+    <w:p>
+      <w:pPr>
+        <w:spacing w:before="0" w:after="0" w:line="240" w:lineRule="auto"/>
+      </w:pPr>
+      <w:r>
+        <w:rPr>
+          <w:rFonts w:ascii="Consolas" w:hAnsi="Consolas" w:eastAsia="Consolas" w:cs="Consolas"/>
+          <w:sz w:val="15"/>
+          <w:noProof/>
+        </w:rPr>
+        <w:t>fig3, axs3 = plt.subplots(1, 2, figsize=(12, 4.6), gridspec_kw={'width_ratios': [3, 1.3]})</w:t>
+      </w:r>
+    </w:p>
+    <w:p>
+      <w:pPr>
+        <w:spacing w:before="0" w:after="0" w:line="240" w:lineRule="auto"/>
+      </w:pPr>
+      <w:r>
+        <w:rPr>
+          <w:rFonts w:ascii="Consolas" w:hAnsi="Consolas" w:eastAsia="Consolas" w:cs="Consolas"/>
+          <w:sz w:val="15"/>
+          <w:noProof/>
+        </w:rPr>
+        <w:t>load_rows = []</w:t>
+      </w:r>
+    </w:p>
+    <w:p>
+      <w:pPr>
+        <w:spacing w:before="0" w:after="0" w:line="240" w:lineRule="auto"/>
+      </w:pPr>
+      <w:r>
+        <w:rPr>
+          <w:rFonts w:ascii="Consolas" w:hAnsi="Consolas" w:eastAsia="Consolas" w:cs="Consolas"/>
+          <w:sz w:val="15"/>
+          <w:noProof/>
+        </w:rPr>
+        <w:t>for ax, w, letter in zip(axs3, ['fingerprint', 'ch'], 'ab'):</w:t>
+      </w:r>
+    </w:p>
+    <w:p>
+      <w:pPr>
+        <w:spacing w:before="0" w:after="0" w:line="240" w:lineRule="auto"/>
+      </w:pPr>
+      <w:r>
+        <w:rPr>
+          <w:rFonts w:ascii="Consolas" w:hAnsi="Consolas" w:eastAsia="Consolas" w:cs="Consolas"/>
+          <w:sz w:val="15"/>
+          <w:noProof/>
+        </w:rPr>
+        <w:t xml:space="preserve">    g, L, var = WINDOWS[w]['g'], RES[w]['loadings'], RES[w]['var']</w:t>
+      </w:r>
+    </w:p>
+    <w:p>
+      <w:pPr>
+        <w:spacing w:before="0" w:after="0" w:line="240" w:lineRule="auto"/>
+      </w:pPr>
+      <w:r>
+        <w:rPr>
+          <w:rFonts w:ascii="Consolas" w:hAnsi="Consolas" w:eastAsia="Consolas" w:cs="Consolas"/>
+          <w:sz w:val="15"/>
+          <w:noProof/>
+        </w:rPr>
+        <w:t xml:space="preserve">    hi_group = GROUPS[0] if RES[w]['pc1_mean'][0] &gt; 0 else GROUPS[1]   # group on the PC1 &gt; 0 side</w:t>
+      </w:r>
+    </w:p>
+    <w:p>
+      <w:pPr>
+        <w:spacing w:before="0" w:after="0" w:line="240" w:lineRule="auto"/>
+      </w:pPr>
+      <w:r>
+        <w:rPr>
+          <w:rFonts w:ascii="Consolas" w:hAnsi="Consolas" w:eastAsia="Consolas" w:cs="Consolas"/>
+          <w:sz w:val="15"/>
+          <w:noProof/>
+        </w:rPr>
+        <w:t xml:space="preserve">    lo_group = GROUPS[1] if hi_group == GROUPS[0] else GROUPS[0]</w:t>
+      </w:r>
+    </w:p>
+    <w:p>
+      <w:pPr>
+        <w:spacing w:before="0" w:after="0" w:line="240" w:lineRule="auto"/>
+      </w:pPr>
+      <w:r>
+        <w:rPr>
+          <w:rFonts w:ascii="Consolas" w:hAnsi="Consolas" w:eastAsia="Consolas" w:cs="Consolas"/>
+          <w:sz w:val="15"/>
+          <w:noProof/>
+        </w:rPr>
+        <w:t xml:space="preserve">    ax.axhline(0, color='k', lw=0.6)</w:t>
+      </w:r>
+    </w:p>
+    <w:p>
+      <w:pPr>
+        <w:spacing w:before="0" w:after="0" w:line="240" w:lineRule="auto"/>
+      </w:pPr>
+      <w:r>
+        <w:rPr>
+          <w:rFonts w:ascii="Consolas" w:hAnsi="Consolas" w:eastAsia="Consolas" w:cs="Consolas"/>
+          <w:sz w:val="15"/>
+          <w:noProof/>
+        </w:rPr>
+        <w:t xml:space="preserve">    ax.plot(g, L[0], color='#0B5A7E', lw=1.2, label=f'PC1 ({var[0]:.1f}%)')</w:t>
+      </w:r>
+    </w:p>
+    <w:p>
+      <w:pPr>
+        <w:spacing w:before="0" w:after="0" w:line="240" w:lineRule="auto"/>
+      </w:pPr>
+      <w:r>
+        <w:rPr>
+          <w:rFonts w:ascii="Consolas" w:hAnsi="Consolas" w:eastAsia="Consolas" w:cs="Consolas"/>
+          <w:sz w:val="15"/>
+          <w:noProof/>
+        </w:rPr>
+        <w:t xml:space="preserve">    ax.plot(g, L[1], color='#B5541C', lw=1.0, alpha=0.8, label=f'PC2 ({var[1]:.1f}%)')</w:t>
+      </w:r>
+    </w:p>
+    <w:p>
+      <w:pPr>
+        <w:spacing w:before="0" w:after="0" w:line="240" w:lineRule="auto"/>
+      </w:pPr>
+      <w:r>
+        <w:rPr>
+          <w:rFonts w:ascii="Consolas" w:hAnsi="Consolas" w:eastAsia="Consolas" w:cs="Consolas"/>
+          <w:sz w:val="15"/>
+          <w:noProof/>
+        </w:rPr>
+        <w:t xml:space="preserve">    bands = main_bands(g, L[0], N_BANDS[w])</w:t>
+      </w:r>
+    </w:p>
+    <w:p>
+      <w:pPr>
+        <w:spacing w:before="0" w:after="0" w:line="240" w:lineRule="auto"/>
+      </w:pPr>
+      <w:r>
+        <w:rPr>
+          <w:rFonts w:ascii="Consolas" w:hAnsi="Consolas" w:eastAsia="Consolas" w:cs="Consolas"/>
+          <w:sz w:val="15"/>
+          <w:noProof/>
+        </w:rPr>
+        <w:t xml:space="preserve">    RES[w]['load_bands'] = bands</w:t>
+      </w:r>
+    </w:p>
+    <w:p>
+      <w:pPr>
+        <w:spacing w:before="0" w:after="0" w:line="240" w:lineRule="auto"/>
+      </w:pPr>
+      <w:r>
+        <w:rPr>
+          <w:rFonts w:ascii="Consolas" w:hAnsi="Consolas" w:eastAsia="Consolas" w:cs="Consolas"/>
+          <w:sz w:val="15"/>
+          <w:noProof/>
+        </w:rPr>
+        <w:t xml:space="preserve">    span = np.ptp(np.r_[L[0], L[1]])</w:t>
+      </w:r>
+    </w:p>
+    <w:p>
+      <w:pPr>
+        <w:spacing w:before="0" w:after="0" w:line="240" w:lineRule="auto"/>
+      </w:pPr>
+      <w:r>
+        <w:rPr>
+          <w:rFonts w:ascii="Consolas" w:hAnsi="Consolas" w:eastAsia="Consolas" w:cs="Consolas"/>
+          <w:sz w:val="15"/>
+          <w:noProof/>
+        </w:rPr>
+        <w:t xml:space="preserve">    for wn, v in bands:</w:t>
+      </w:r>
+    </w:p>
+    <w:p>
+      <w:pPr>
+        <w:spacing w:before="0" w:after="0" w:line="240" w:lineRule="auto"/>
+      </w:pPr>
+      <w:r>
+        <w:rPr>
+          <w:rFonts w:ascii="Consolas" w:hAnsi="Consolas" w:eastAsia="Consolas" w:cs="Consolas"/>
+          <w:sz w:val="15"/>
+          <w:noProof/>
+        </w:rPr>
+        <w:t xml:space="preserve">        ax.text(wn, v + (0.03 if v &gt; 0 else -0.03) * span, f'{wn:.0f}', ha='center',</w:t>
+      </w:r>
+    </w:p>
+    <w:p>
+      <w:pPr>
+        <w:spacing w:before="0" w:after="0" w:line="240" w:lineRule="auto"/>
+      </w:pPr>
+      <w:r>
+        <w:rPr>
+          <w:rFonts w:ascii="Consolas" w:hAnsi="Consolas" w:eastAsia="Consolas" w:cs="Consolas"/>
+          <w:sz w:val="15"/>
+          <w:noProof/>
+        </w:rPr>
+        <w:t xml:space="preserve">                va='bottom' if v &gt; 0 else 'top', fontsize=9, rotation=90)</w:t>
+      </w:r>
+    </w:p>
+    <w:p>
+      <w:pPr>
+        <w:spacing w:before="0" w:after="0" w:line="240" w:lineRule="auto"/>
+      </w:pPr>
+      <w:r>
+        <w:rPr>
+          <w:rFonts w:ascii="Consolas" w:hAnsi="Consolas" w:eastAsia="Consolas" w:cs="Consolas"/>
+          <w:sz w:val="15"/>
+          <w:noProof/>
+        </w:rPr>
+        <w:t xml:space="preserve">        load_rows.append({'Region': w, 'Band (cm-1)': round(wn), 'PC1 loading': round(v, 4),</w:t>
+      </w:r>
+    </w:p>
+    <w:p>
+      <w:pPr>
+        <w:spacing w:before="0" w:after="0" w:line="240" w:lineRule="auto"/>
+      </w:pPr>
+      <w:r>
+        <w:rPr>
+          <w:rFonts w:ascii="Consolas" w:hAnsi="Consolas" w:eastAsia="Consolas" w:cs="Consolas"/>
+          <w:sz w:val="15"/>
+          <w:noProof/>
+        </w:rPr>
+        <w:t xml:space="preserve">                          'Relatively stronger in': hi_group if v &gt; 0 else lo_group})</w:t>
+      </w:r>
+    </w:p>
+    <w:p>
+      <w:pPr>
+        <w:spacing w:before="0" w:after="0" w:line="240" w:lineRule="auto"/>
+      </w:pPr>
+      <w:r>
+        <w:rPr>
+          <w:rFonts w:ascii="Consolas" w:hAnsi="Consolas" w:eastAsia="Consolas" w:cs="Consolas"/>
+          <w:sz w:val="15"/>
+          <w:noProof/>
+        </w:rPr>
+        <w:t xml:space="preserve">    report(f'  {w}: PC1 &gt; 0 = {hi_group} side.  Main PC1 bands: ' +</w:t>
+      </w:r>
+    </w:p>
+    <w:p>
+      <w:pPr>
+        <w:spacing w:before="0" w:after="0" w:line="240" w:lineRule="auto"/>
+      </w:pPr>
+      <w:r>
+        <w:rPr>
+          <w:rFonts w:ascii="Consolas" w:hAnsi="Consolas" w:eastAsia="Consolas" w:cs="Consolas"/>
+          <w:sz w:val="15"/>
+          <w:noProof/>
+        </w:rPr>
+        <w:t xml:space="preserve">           ', '.join(f'{wn:.0f} ({"+" if v &gt; 0 else "-"}, {hi_group if v &gt; 0 else lo_group})'</w:t>
+      </w:r>
+    </w:p>
+    <w:p>
+      <w:pPr>
+        <w:spacing w:before="0" w:after="0" w:line="240" w:lineRule="auto"/>
+      </w:pPr>
+      <w:r>
+        <w:rPr>
+          <w:rFonts w:ascii="Consolas" w:hAnsi="Consolas" w:eastAsia="Consolas" w:cs="Consolas"/>
+          <w:sz w:val="15"/>
+          <w:noProof/>
+        </w:rPr>
+        <w:t xml:space="preserve">                     for wn, v in bands))</w:t>
+      </w:r>
+    </w:p>
+    <w:p>
+      <w:pPr>
+        <w:spacing w:before="0" w:after="0" w:line="240" w:lineRule="auto"/>
+      </w:pPr>
+      <w:r>
+        <w:rPr>
+          <w:rFonts w:ascii="Consolas" w:hAnsi="Consolas" w:eastAsia="Consolas" w:cs="Consolas"/>
+          <w:sz w:val="15"/>
+          <w:noProof/>
+        </w:rPr>
+        <w:t xml:space="preserve">    ax.set_xlim(g[0], g[-1])</w:t>
+      </w:r>
+    </w:p>
+    <w:p>
+      <w:pPr>
+        <w:spacing w:before="0" w:after="0" w:line="240" w:lineRule="auto"/>
+      </w:pPr>
+      <w:r>
+        <w:rPr>
+          <w:rFonts w:ascii="Consolas" w:hAnsi="Consolas" w:eastAsia="Consolas" w:cs="Consolas"/>
+          <w:sz w:val="15"/>
+          <w:noProof/>
+        </w:rPr>
+        <w:t xml:space="preserve">    ax.set_ylim(L[:2].min() - 0.18 * span, L[:2].max() + 0.22 * span)</w:t>
+      </w:r>
+    </w:p>
+    <w:p>
+      <w:pPr>
+        <w:spacing w:before="0" w:after="0" w:line="240" w:lineRule="auto"/>
+      </w:pPr>
+      <w:r>
+        <w:rPr>
+          <w:rFonts w:ascii="Consolas" w:hAnsi="Consolas" w:eastAsia="Consolas" w:cs="Consolas"/>
+          <w:sz w:val="15"/>
+          <w:noProof/>
+        </w:rPr>
+        <w:t xml:space="preserve">    ax.set_xlabel('Raman shift (cm$^{-1}$)')</w:t>
+      </w:r>
+    </w:p>
+    <w:p>
+      <w:pPr>
+        <w:spacing w:before="0" w:after="0" w:line="240" w:lineRule="auto"/>
+      </w:pPr>
+      <w:r>
+        <w:rPr>
+          <w:rFonts w:ascii="Consolas" w:hAnsi="Consolas" w:eastAsia="Consolas" w:cs="Consolas"/>
+          <w:sz w:val="15"/>
+          <w:noProof/>
+        </w:rPr>
+        <w:t xml:space="preserve">    ax.set_ylabel('Loading (a.u.)')</w:t>
+      </w:r>
+    </w:p>
+    <w:p>
+      <w:pPr>
+        <w:spacing w:before="0" w:after="0" w:line="240" w:lineRule="auto"/>
+      </w:pPr>
+      <w:r>
+        <w:rPr>
+          <w:rFonts w:ascii="Consolas" w:hAnsi="Consolas" w:eastAsia="Consolas" w:cs="Consolas"/>
+          <w:sz w:val="15"/>
+          <w:noProof/>
+        </w:rPr>
+        <w:t xml:space="preserve">    ax.set_title(f'{TITLES[w]}\nPC1 &gt; 0: {hi_group} side', fontsize=11, loc='left')</w:t>
+      </w:r>
+    </w:p>
+    <w:p>
+      <w:pPr>
+        <w:spacing w:before="0" w:after="0" w:line="240" w:lineRule="auto"/>
+      </w:pPr>
+      <w:r>
+        <w:rPr>
+          <w:rFonts w:ascii="Consolas" w:hAnsi="Consolas" w:eastAsia="Consolas" w:cs="Consolas"/>
+          <w:sz w:val="15"/>
+          <w:noProof/>
+        </w:rPr>
+        <w:t xml:space="preserve">    ax.legend(frameon=False, fontsize=10, loc='lower left')</w:t>
+      </w:r>
+    </w:p>
+    <w:p>
+      <w:pPr>
+        <w:spacing w:before="0" w:after="0" w:line="240" w:lineRule="auto"/>
+      </w:pPr>
+      <w:r>
+        <w:rPr>
+          <w:rFonts w:ascii="Consolas" w:hAnsi="Consolas" w:eastAsia="Consolas" w:cs="Consolas"/>
+          <w:sz w:val="15"/>
+          <w:noProof/>
+        </w:rPr>
+        <w:t xml:space="preserve">    ax.text(-0.10 if w == 'fingerprint' else -0.25, 1.06, f'({letter})', transform=ax.transAxes,</w:t>
+      </w:r>
+    </w:p>
+    <w:p>
+      <w:pPr>
+        <w:spacing w:before="0" w:after="0" w:line="240" w:lineRule="auto"/>
+      </w:pPr>
+      <w:r>
+        <w:rPr>
+          <w:rFonts w:ascii="Consolas" w:hAnsi="Consolas" w:eastAsia="Consolas" w:cs="Consolas"/>
+          <w:sz w:val="15"/>
+          <w:noProof/>
+        </w:rPr>
+        <w:t xml:space="preserve">            fontsize=14, va='bottom')</w:t>
+      </w:r>
+    </w:p>
+    <w:p>
+      <w:pPr>
+        <w:spacing w:before="0" w:after="0" w:line="240" w:lineRule="auto"/>
+      </w:pPr>
+      <w:r>
+        <w:rPr>
+          <w:rFonts w:ascii="Consolas" w:hAnsi="Consolas" w:eastAsia="Consolas" w:cs="Consolas"/>
+          <w:sz w:val="15"/>
+          <w:noProof/>
+        </w:rPr>
+        <w:t>fig3.tight_layout()</w:t>
+      </w:r>
+    </w:p>
+    <w:p>
+      <w:pPr>
+        <w:spacing w:before="0" w:after="0" w:line="240" w:lineRule="auto"/>
+      </w:pPr>
+      <w:r>
+        <w:rPr>
+          <w:rFonts w:ascii="Consolas" w:hAnsi="Consolas" w:eastAsia="Consolas" w:cs="Consolas"/>
+          <w:sz w:val="15"/>
+          <w:noProof/>
+        </w:rPr>
+        <w:t>save_figure(fig3, 'Fig_Loadings')</w:t>
+      </w:r>
+    </w:p>
+    <w:p>
+      <w:pPr>
+        <w:spacing w:before="0" w:after="0" w:line="240" w:lineRule="auto"/>
+      </w:pPr>
+      <w:r>
+        <w:rPr>
+          <w:rFonts w:ascii="Consolas" w:hAnsi="Consolas" w:eastAsia="Consolas" w:cs="Consolas"/>
+          <w:sz w:val="15"/>
+          <w:noProof/>
+        </w:rPr>
+        <w:t>pd.DataFrame(load_rows).to_csv(OUTPUT_DIR / 'Loadings_main_bands.csv', index=False)</w:t>
+      </w:r>
+    </w:p>
+    <w:p>
+      <w:pPr>
+        <w:spacing w:before="0" w:after="0" w:line="240" w:lineRule="auto"/>
+      </w:pPr>
+      <w:r>
+        <w:rPr>
+          <w:rFonts w:ascii="Consolas" w:hAnsi="Consolas" w:eastAsia="Consolas" w:cs="Consolas"/>
+          <w:sz w:val="15"/>
+          <w:noProof/>
+        </w:rPr>
+      </w:r>
+    </w:p>
+    <w:p>
+      <w:pPr>
+        <w:spacing w:before="0" w:after="0" w:line="240" w:lineRule="auto"/>
+      </w:pPr>
+      <w:r>
+        <w:rPr>
+          <w:rFonts w:ascii="Consolas" w:hAnsi="Consolas" w:eastAsia="Consolas" w:cs="Consolas"/>
+          <w:sz w:val="15"/>
+          <w:noProof/>
+        </w:rPr>
+      </w:r>
+    </w:p>
+    <w:p>
+      <w:pPr>
+        <w:spacing w:before="0" w:after="0" w:line="240" w:lineRule="auto"/>
+      </w:pPr>
+      <w:r>
+        <w:rPr>
+          <w:rFonts w:ascii="Consolas" w:hAnsi="Consolas" w:eastAsia="Consolas" w:cs="Consolas"/>
+          <w:sz w:val="15"/>
+          <w:noProof/>
+        </w:rPr>
+        <w:t># ============================================================================</w:t>
+      </w:r>
+    </w:p>
+    <w:p>
+      <w:pPr>
+        <w:spacing w:before="0" w:after="0" w:line="240" w:lineRule="auto"/>
+      </w:pPr>
+      <w:r>
+        <w:rPr>
+          <w:rFonts w:ascii="Consolas" w:hAnsi="Consolas" w:eastAsia="Consolas" w:cs="Consolas"/>
+          <w:sz w:val="15"/>
+          <w:noProof/>
+        </w:rPr>
+        <w:t># STEP 7 - difference spectrum NV - EV</w:t>
+      </w:r>
+    </w:p>
+    <w:p>
+      <w:pPr>
+        <w:spacing w:before="0" w:after="0" w:line="240" w:lineRule="auto"/>
+      </w:pPr>
+      <w:r>
+        <w:rPr>
+          <w:rFonts w:ascii="Consolas" w:hAnsi="Consolas" w:eastAsia="Consolas" w:cs="Consolas"/>
+          <w:sz w:val="15"/>
+          <w:noProof/>
+        </w:rPr>
+        <w:t># ============================================================================</w:t>
+      </w:r>
+    </w:p>
+    <w:p>
+      <w:pPr>
+        <w:spacing w:before="0" w:after="0" w:line="240" w:lineRule="auto"/>
+      </w:pPr>
+      <w:r>
+        <w:rPr>
+          <w:rFonts w:ascii="Consolas" w:hAnsi="Consolas" w:eastAsia="Consolas" w:cs="Consolas"/>
+          <w:sz w:val="15"/>
+          <w:noProof/>
+        </w:rPr>
+        <w:t># 1. mean SNV spectrum of each site (20 spectra)  -&gt; 6 EV and 6 NV site spectra</w:t>
+      </w:r>
+    </w:p>
+    <w:p>
+      <w:pPr>
+        <w:spacing w:before="0" w:after="0" w:line="240" w:lineRule="auto"/>
+      </w:pPr>
+      <w:r>
+        <w:rPr>
+          <w:rFonts w:ascii="Consolas" w:hAnsi="Consolas" w:eastAsia="Consolas" w:cs="Consolas"/>
+          <w:sz w:val="15"/>
+          <w:noProof/>
+        </w:rPr>
+        <w:t># 2. difference = mean of the 6 NV site spectra - mean of the 6 EV site spectra</w:t>
+      </w:r>
+    </w:p>
+    <w:p>
+      <w:pPr>
+        <w:spacing w:before="0" w:after="0" w:line="240" w:lineRule="auto"/>
+      </w:pPr>
+      <w:r>
+        <w:rPr>
+          <w:rFonts w:ascii="Consolas" w:hAnsi="Consolas" w:eastAsia="Consolas" w:cs="Consolas"/>
+          <w:sz w:val="15"/>
+          <w:noProof/>
+        </w:rPr>
+        <w:t># 3. uncertainty from the site-to-site variation: SE = sqrt(SD_EV^2/6 + SD_NV^2/6)</w:t>
+      </w:r>
+    </w:p>
+    <w:p>
+      <w:pPr>
+        <w:spacing w:before="0" w:after="0" w:line="240" w:lineRule="auto"/>
+      </w:pPr>
+      <w:r>
+        <w:rPr>
+          <w:rFonts w:ascii="Consolas" w:hAnsi="Consolas" w:eastAsia="Consolas" w:cs="Consolas"/>
+          <w:sz w:val="15"/>
+          <w:noProof/>
+        </w:rPr>
+        <w:t>#    (SD over the 6 site spectra); the shaded band is difference +/- 2 SE.</w:t>
+      </w:r>
+    </w:p>
+    <w:p>
+      <w:pPr>
+        <w:spacing w:before="0" w:after="0" w:line="240" w:lineRule="auto"/>
+      </w:pPr>
+      <w:r>
+        <w:rPr>
+          <w:rFonts w:ascii="Consolas" w:hAnsi="Consolas" w:eastAsia="Consolas" w:cs="Consolas"/>
+          <w:sz w:val="15"/>
+          <w:noProof/>
+        </w:rPr>
+        <w:t>#    Where the band does not include zero, the difference is consistent</w:t>
+      </w:r>
+    </w:p>
+    <w:p>
+      <w:pPr>
+        <w:spacing w:before="0" w:after="0" w:line="240" w:lineRule="auto"/>
+      </w:pPr>
+      <w:r>
+        <w:rPr>
+          <w:rFonts w:ascii="Consolas" w:hAnsi="Consolas" w:eastAsia="Consolas" w:cs="Consolas"/>
+          <w:sz w:val="15"/>
+          <w:noProof/>
+        </w:rPr>
+        <w:t>#    across sites. Positive = relatively stronger in NVs, negative = in EVs.</w:t>
+      </w:r>
+    </w:p>
+    <w:p>
+      <w:pPr>
+        <w:spacing w:before="0" w:after="0" w:line="240" w:lineRule="auto"/>
+      </w:pPr>
+      <w:r>
+        <w:rPr>
+          <w:rFonts w:ascii="Consolas" w:hAnsi="Consolas" w:eastAsia="Consolas" w:cs="Consolas"/>
+          <w:sz w:val="15"/>
+          <w:noProof/>
+        </w:rPr>
+        <w:t>report('\nSTEP 7 - difference spectrum NV - EV (site means, +/- 2 SE)')</w:t>
+      </w:r>
+    </w:p>
+    <w:p>
+      <w:pPr>
+        <w:spacing w:before="0" w:after="0" w:line="240" w:lineRule="auto"/>
+      </w:pPr>
+      <w:r>
+        <w:rPr>
+          <w:rFonts w:ascii="Consolas" w:hAnsi="Consolas" w:eastAsia="Consolas" w:cs="Consolas"/>
+          <w:sz w:val="15"/>
+          <w:noProof/>
+        </w:rPr>
+        <w:t>fig4, axs4 = plt.subplots(1, 2, figsize=(12, 4.6), gridspec_kw={'width_ratios': [3, 1.3]})</w:t>
+      </w:r>
+    </w:p>
+    <w:p>
+      <w:pPr>
+        <w:spacing w:before="0" w:after="0" w:line="240" w:lineRule="auto"/>
+      </w:pPr>
+      <w:r>
+        <w:rPr>
+          <w:rFonts w:ascii="Consolas" w:hAnsi="Consolas" w:eastAsia="Consolas" w:cs="Consolas"/>
+          <w:sz w:val="15"/>
+          <w:noProof/>
+        </w:rPr>
+        <w:t>diff_rows = []</w:t>
+      </w:r>
+    </w:p>
+    <w:p>
+      <w:pPr>
+        <w:spacing w:before="0" w:after="0" w:line="240" w:lineRule="auto"/>
+      </w:pPr>
+      <w:r>
+        <w:rPr>
+          <w:rFonts w:ascii="Consolas" w:hAnsi="Consolas" w:eastAsia="Consolas" w:cs="Consolas"/>
+          <w:sz w:val="15"/>
+          <w:noProof/>
+        </w:rPr>
+        <w:t>for ax, w, letter in zip(axs4, ['fingerprint', 'ch'], 'ab'):</w:t>
+      </w:r>
+    </w:p>
+    <w:p>
+      <w:pPr>
+        <w:spacing w:before="0" w:after="0" w:line="240" w:lineRule="auto"/>
+      </w:pPr>
+      <w:r>
+        <w:rPr>
+          <w:rFonts w:ascii="Consolas" w:hAnsi="Consolas" w:eastAsia="Consolas" w:cs="Consolas"/>
+          <w:sz w:val="15"/>
+          <w:noProof/>
+        </w:rPr>
+        <w:t xml:space="preserve">    X, g = data[w], WINDOWS[w]['g']</w:t>
+      </w:r>
+    </w:p>
+    <w:p>
+      <w:pPr>
+        <w:spacing w:before="0" w:after="0" w:line="240" w:lineRule="auto"/>
+      </w:pPr>
+      <w:r>
+        <w:rPr>
+          <w:rFonts w:ascii="Consolas" w:hAnsi="Consolas" w:eastAsia="Consolas" w:cs="Consolas"/>
+          <w:sz w:val="15"/>
+          <w:noProof/>
+        </w:rPr>
+        <w:t xml:space="preserve">    S = {c: np.array([X[sites == s].mean(0) for s in sorted(set(sites[y == c]))]) for c in (0, 1)}</w:t>
+      </w:r>
+    </w:p>
+    <w:p>
+      <w:pPr>
+        <w:spacing w:before="0" w:after="0" w:line="240" w:lineRule="auto"/>
+      </w:pPr>
+      <w:r>
+        <w:rPr>
+          <w:rFonts w:ascii="Consolas" w:hAnsi="Consolas" w:eastAsia="Consolas" w:cs="Consolas"/>
+          <w:sz w:val="15"/>
+          <w:noProof/>
+        </w:rPr>
+        <w:t xml:space="preserve">    d = S[1].mean(0) - S[0].mean(0)</w:t>
+      </w:r>
+    </w:p>
+    <w:p>
+      <w:pPr>
+        <w:spacing w:before="0" w:after="0" w:line="240" w:lineRule="auto"/>
+      </w:pPr>
+      <w:r>
+        <w:rPr>
+          <w:rFonts w:ascii="Consolas" w:hAnsi="Consolas" w:eastAsia="Consolas" w:cs="Consolas"/>
+          <w:sz w:val="15"/>
+          <w:noProof/>
+        </w:rPr>
+        <w:t xml:space="preserve">    se = np.sqrt(S[0].var(0, ddof=1) / len(S[0]) + S[1].var(0, ddof=1) / len(S[1]))</w:t>
+      </w:r>
+    </w:p>
+    <w:p>
+      <w:pPr>
+        <w:spacing w:before="0" w:after="0" w:line="240" w:lineRule="auto"/>
+      </w:pPr>
+      <w:r>
+        <w:rPr>
+          <w:rFonts w:ascii="Consolas" w:hAnsi="Consolas" w:eastAsia="Consolas" w:cs="Consolas"/>
+          <w:sz w:val="15"/>
+          <w:noProof/>
+        </w:rPr>
+        <w:t xml:space="preserve">    sig = np.abs(d) &gt; 2 * se</w:t>
+      </w:r>
+    </w:p>
+    <w:p>
+      <w:pPr>
+        <w:spacing w:before="0" w:after="0" w:line="240" w:lineRule="auto"/>
+      </w:pPr>
+      <w:r>
+        <w:rPr>
+          <w:rFonts w:ascii="Consolas" w:hAnsi="Consolas" w:eastAsia="Consolas" w:cs="Consolas"/>
+          <w:sz w:val="15"/>
+          <w:noProof/>
+        </w:rPr>
+        <w:t xml:space="preserve">    ax.axhline(0, color='k', lw=0.6)</w:t>
+      </w:r>
+    </w:p>
+    <w:p>
+      <w:pPr>
+        <w:spacing w:before="0" w:after="0" w:line="240" w:lineRule="auto"/>
+      </w:pPr>
+      <w:r>
+        <w:rPr>
+          <w:rFonts w:ascii="Consolas" w:hAnsi="Consolas" w:eastAsia="Consolas" w:cs="Consolas"/>
+          <w:sz w:val="15"/>
+          <w:noProof/>
+        </w:rPr>
+        <w:t xml:space="preserve">    ax.fill_between(g, d - 2 * se, d + 2 * se, color='0.75', lw=0, label='$\\pm$2 SE (6 + 6 sites)')</w:t>
+      </w:r>
+    </w:p>
+    <w:p>
+      <w:pPr>
+        <w:spacing w:before="0" w:after="0" w:line="240" w:lineRule="auto"/>
+      </w:pPr>
+      <w:r>
+        <w:rPr>
+          <w:rFonts w:ascii="Consolas" w:hAnsi="Consolas" w:eastAsia="Consolas" w:cs="Consolas"/>
+          <w:sz w:val="15"/>
+          <w:noProof/>
+        </w:rPr>
+        <w:t xml:space="preserve">    ax.plot(g, d, color='k', lw=1.0, label='NV $-$ EV')</w:t>
+      </w:r>
+    </w:p>
+    <w:p>
+      <w:pPr>
+        <w:spacing w:before="0" w:after="0" w:line="240" w:lineRule="auto"/>
+      </w:pPr>
+      <w:r>
+        <w:rPr>
+          <w:rFonts w:ascii="Consolas" w:hAnsi="Consolas" w:eastAsia="Consolas" w:cs="Consolas"/>
+          <w:sz w:val="15"/>
+          <w:noProof/>
+        </w:rPr>
+        <w:t xml:space="preserve">    bands = [b for b in main_bands(g, np.where(sig, d, 0), N_BANDS[w]) if b[1] != 0]</w:t>
+      </w:r>
+    </w:p>
+    <w:p>
+      <w:pPr>
+        <w:spacing w:before="0" w:after="0" w:line="240" w:lineRule="auto"/>
+      </w:pPr>
+      <w:r>
+        <w:rPr>
+          <w:rFonts w:ascii="Consolas" w:hAnsi="Consolas" w:eastAsia="Consolas" w:cs="Consolas"/>
+          <w:sz w:val="15"/>
+          <w:noProof/>
+        </w:rPr>
+        <w:t xml:space="preserve">    RES[w]['diff_bands'] = bands</w:t>
+      </w:r>
+    </w:p>
+    <w:p>
+      <w:pPr>
+        <w:spacing w:before="0" w:after="0" w:line="240" w:lineRule="auto"/>
+      </w:pPr>
+      <w:r>
+        <w:rPr>
+          <w:rFonts w:ascii="Consolas" w:hAnsi="Consolas" w:eastAsia="Consolas" w:cs="Consolas"/>
+          <w:sz w:val="15"/>
+          <w:noProof/>
+        </w:rPr>
+        <w:t xml:space="preserve">    RES[w]['diff_sig_frac'] = sig.mean() * 100</w:t>
+      </w:r>
+    </w:p>
+    <w:p>
+      <w:pPr>
+        <w:spacing w:before="0" w:after="0" w:line="240" w:lineRule="auto"/>
+      </w:pPr>
+      <w:r>
+        <w:rPr>
+          <w:rFonts w:ascii="Consolas" w:hAnsi="Consolas" w:eastAsia="Consolas" w:cs="Consolas"/>
+          <w:sz w:val="15"/>
+          <w:noProof/>
+        </w:rPr>
+        <w:t xml:space="preserve">    span = np.ptp(np.r_[d - 2 * se, d + 2 * se])</w:t>
+      </w:r>
+    </w:p>
+    <w:p>
+      <w:pPr>
+        <w:spacing w:before="0" w:after="0" w:line="240" w:lineRule="auto"/>
+      </w:pPr>
+      <w:r>
+        <w:rPr>
+          <w:rFonts w:ascii="Consolas" w:hAnsi="Consolas" w:eastAsia="Consolas" w:cs="Consolas"/>
+          <w:sz w:val="15"/>
+          <w:noProof/>
+        </w:rPr>
+        <w:t xml:space="preserve">    for wn, v in bands:</w:t>
+      </w:r>
+    </w:p>
+    <w:p>
+      <w:pPr>
+        <w:spacing w:before="0" w:after="0" w:line="240" w:lineRule="auto"/>
+      </w:pPr>
+      <w:r>
+        <w:rPr>
+          <w:rFonts w:ascii="Consolas" w:hAnsi="Consolas" w:eastAsia="Consolas" w:cs="Consolas"/>
+          <w:sz w:val="15"/>
+          <w:noProof/>
+        </w:rPr>
+        <w:t xml:space="preserve">        ax.text(wn, v + (0.04 if v &gt; 0 else -0.04) * span, f'{wn:.0f}', ha='center',</w:t>
+      </w:r>
+    </w:p>
+    <w:p>
+      <w:pPr>
+        <w:spacing w:before="0" w:after="0" w:line="240" w:lineRule="auto"/>
+      </w:pPr>
+      <w:r>
+        <w:rPr>
+          <w:rFonts w:ascii="Consolas" w:hAnsi="Consolas" w:eastAsia="Consolas" w:cs="Consolas"/>
+          <w:sz w:val="15"/>
+          <w:noProof/>
+        </w:rPr>
+        <w:t xml:space="preserve">                va='bottom' if v &gt; 0 else 'top', fontsize=9, rotation=90)</w:t>
+      </w:r>
+    </w:p>
+    <w:p>
+      <w:pPr>
+        <w:spacing w:before="0" w:after="0" w:line="240" w:lineRule="auto"/>
+      </w:pPr>
+      <w:r>
+        <w:rPr>
+          <w:rFonts w:ascii="Consolas" w:hAnsi="Consolas" w:eastAsia="Consolas" w:cs="Consolas"/>
+          <w:sz w:val="15"/>
+          <w:noProof/>
+        </w:rPr>
+        <w:t xml:space="preserve">        diff_rows.append({'Region': w, 'Band (cm-1)': round(wn), 'NV - EV (SNV)': round(v, 3),</w:t>
+      </w:r>
+    </w:p>
+    <w:p>
+      <w:pPr>
+        <w:spacing w:before="0" w:after="0" w:line="240" w:lineRule="auto"/>
+      </w:pPr>
+      <w:r>
+        <w:rPr>
+          <w:rFonts w:ascii="Consolas" w:hAnsi="Consolas" w:eastAsia="Consolas" w:cs="Consolas"/>
+          <w:sz w:val="15"/>
+          <w:noProof/>
+        </w:rPr>
+        <w:t xml:space="preserve">                          '2 SE': round(float(np.interp(wn, g, 2 * se)), 3),</w:t>
+      </w:r>
+    </w:p>
+    <w:p>
+      <w:pPr>
+        <w:spacing w:before="0" w:after="0" w:line="240" w:lineRule="auto"/>
+      </w:pPr>
+      <w:r>
+        <w:rPr>
+          <w:rFonts w:ascii="Consolas" w:hAnsi="Consolas" w:eastAsia="Consolas" w:cs="Consolas"/>
+          <w:sz w:val="15"/>
+          <w:noProof/>
+        </w:rPr>
+        <w:t xml:space="preserve">                          'Relatively stronger in': GROUPS[1] if v &gt; 0 else GROUPS[0]})</w:t>
+      </w:r>
+    </w:p>
+    <w:p>
+      <w:pPr>
+        <w:spacing w:before="0" w:after="0" w:line="240" w:lineRule="auto"/>
+      </w:pPr>
+      <w:r>
+        <w:rPr>
+          <w:rFonts w:ascii="Consolas" w:hAnsi="Consolas" w:eastAsia="Consolas" w:cs="Consolas"/>
+          <w:sz w:val="15"/>
+          <w:noProof/>
+        </w:rPr>
+        <w:t xml:space="preserve">    report(f'  {w}: |difference| &gt; 2 SE at {sig.mean() * 100:.0f} % of the wavenumbers. '</w:t>
+      </w:r>
+    </w:p>
+    <w:p>
+      <w:pPr>
+        <w:spacing w:before="0" w:after="0" w:line="240" w:lineRule="auto"/>
+      </w:pPr>
+      <w:r>
+        <w:rPr>
+          <w:rFonts w:ascii="Consolas" w:hAnsi="Consolas" w:eastAsia="Consolas" w:cs="Consolas"/>
+          <w:sz w:val="15"/>
+          <w:noProof/>
+        </w:rPr>
+        <w:t xml:space="preserve">           'Largest consistent differences: ' +</w:t>
+      </w:r>
+    </w:p>
+    <w:p>
+      <w:pPr>
+        <w:spacing w:before="0" w:after="0" w:line="240" w:lineRule="auto"/>
+      </w:pPr>
+      <w:r>
+        <w:rPr>
+          <w:rFonts w:ascii="Consolas" w:hAnsi="Consolas" w:eastAsia="Consolas" w:cs="Consolas"/>
+          <w:sz w:val="15"/>
+          <w:noProof/>
+        </w:rPr>
+        <w:t xml:space="preserve">           ', '.join(f'{wn:.0f} ({"NVs" if v &gt; 0 else "EVs"} higher)' for wn, v in bands))</w:t>
+      </w:r>
+    </w:p>
+    <w:p>
+      <w:pPr>
+        <w:spacing w:before="0" w:after="0" w:line="240" w:lineRule="auto"/>
+      </w:pPr>
+      <w:r>
+        <w:rPr>
+          <w:rFonts w:ascii="Consolas" w:hAnsi="Consolas" w:eastAsia="Consolas" w:cs="Consolas"/>
+          <w:sz w:val="15"/>
+          <w:noProof/>
+        </w:rPr>
+        <w:t xml:space="preserve">    ax.set_xlim(g[0], g[-1])</w:t>
+      </w:r>
+    </w:p>
+    <w:p>
+      <w:pPr>
+        <w:spacing w:before="0" w:after="0" w:line="240" w:lineRule="auto"/>
+      </w:pPr>
+      <w:r>
+        <w:rPr>
+          <w:rFonts w:ascii="Consolas" w:hAnsi="Consolas" w:eastAsia="Consolas" w:cs="Consolas"/>
+          <w:sz w:val="15"/>
+          <w:noProof/>
+        </w:rPr>
+        <w:t xml:space="preserve">    ax.set_ylim((d - 2 * se).min() - 0.15 * span, (d + 2 * se).max() + 0.2 * span)</w:t>
+      </w:r>
+    </w:p>
+    <w:p>
+      <w:pPr>
+        <w:spacing w:before="0" w:after="0" w:line="240" w:lineRule="auto"/>
+      </w:pPr>
+      <w:r>
+        <w:rPr>
+          <w:rFonts w:ascii="Consolas" w:hAnsi="Consolas" w:eastAsia="Consolas" w:cs="Consolas"/>
+          <w:sz w:val="15"/>
+          <w:noProof/>
+        </w:rPr>
+        <w:t xml:space="preserve">    ax.set_xlabel('Raman shift (cm$^{-1}$)')</w:t>
+      </w:r>
+    </w:p>
+    <w:p>
+      <w:pPr>
+        <w:spacing w:before="0" w:after="0" w:line="240" w:lineRule="auto"/>
+      </w:pPr>
+      <w:r>
+        <w:rPr>
+          <w:rFonts w:ascii="Consolas" w:hAnsi="Consolas" w:eastAsia="Consolas" w:cs="Consolas"/>
+          <w:sz w:val="15"/>
+          <w:noProof/>
+        </w:rPr>
+        <w:t xml:space="preserve">    ax.set_ylabel('$\\Delta$ SNV intensity, NV $-$ EV')</w:t>
+      </w:r>
+    </w:p>
+    <w:p>
+      <w:pPr>
+        <w:spacing w:before="0" w:after="0" w:line="240" w:lineRule="auto"/>
+      </w:pPr>
+      <w:r>
+        <w:rPr>
+          <w:rFonts w:ascii="Consolas" w:hAnsi="Consolas" w:eastAsia="Consolas" w:cs="Consolas"/>
+          <w:sz w:val="15"/>
+          <w:noProof/>
+        </w:rPr>
+        <w:t xml:space="preserve">    ax.set_title(TITLES[w], fontsize=11, loc='left')</w:t>
+      </w:r>
+    </w:p>
+    <w:p>
+      <w:pPr>
+        <w:spacing w:before="0" w:after="0" w:line="240" w:lineRule="auto"/>
+      </w:pPr>
+      <w:r>
+        <w:rPr>
+          <w:rFonts w:ascii="Consolas" w:hAnsi="Consolas" w:eastAsia="Consolas" w:cs="Consolas"/>
+          <w:sz w:val="15"/>
+          <w:noProof/>
+        </w:rPr>
+        <w:t xml:space="preserve">    ax.legend(frameon=False, fontsize=10, loc='lower left' if w == 'fingerprint' else 'upper left')</w:t>
+      </w:r>
+    </w:p>
+    <w:p>
+      <w:pPr>
+        <w:spacing w:before="0" w:after="0" w:line="240" w:lineRule="auto"/>
+      </w:pPr>
+      <w:r>
+        <w:rPr>
+          <w:rFonts w:ascii="Consolas" w:hAnsi="Consolas" w:eastAsia="Consolas" w:cs="Consolas"/>
+          <w:sz w:val="15"/>
+          <w:noProof/>
+        </w:rPr>
+        <w:t xml:space="preserve">    ax.text(-0.10 if w == 'fingerprint' else -0.25, 1.06, f'({letter})', transform=ax.transAxes,</w:t>
+      </w:r>
+    </w:p>
+    <w:p>
+      <w:pPr>
+        <w:spacing w:before="0" w:after="0" w:line="240" w:lineRule="auto"/>
+      </w:pPr>
+      <w:r>
+        <w:rPr>
+          <w:rFonts w:ascii="Consolas" w:hAnsi="Consolas" w:eastAsia="Consolas" w:cs="Consolas"/>
+          <w:sz w:val="15"/>
+          <w:noProof/>
+        </w:rPr>
+        <w:t xml:space="preserve">            fontsize=14, va='bottom')</w:t>
+      </w:r>
+    </w:p>
+    <w:p>
+      <w:pPr>
+        <w:spacing w:before="0" w:after="0" w:line="240" w:lineRule="auto"/>
+      </w:pPr>
+      <w:r>
+        <w:rPr>
+          <w:rFonts w:ascii="Consolas" w:hAnsi="Consolas" w:eastAsia="Consolas" w:cs="Consolas"/>
+          <w:sz w:val="15"/>
+          <w:noProof/>
+        </w:rPr>
+        <w:t>fig4.tight_layout()</w:t>
+      </w:r>
+    </w:p>
+    <w:p>
+      <w:pPr>
+        <w:spacing w:before="0" w:after="0" w:line="240" w:lineRule="auto"/>
+      </w:pPr>
+      <w:r>
+        <w:rPr>
+          <w:rFonts w:ascii="Consolas" w:hAnsi="Consolas" w:eastAsia="Consolas" w:cs="Consolas"/>
+          <w:sz w:val="15"/>
+          <w:noProof/>
+        </w:rPr>
+        <w:t>save_figure(fig4, 'Fig_Difference')</w:t>
+      </w:r>
+    </w:p>
+    <w:p>
+      <w:pPr>
+        <w:spacing w:before="0" w:after="0" w:line="240" w:lineRule="auto"/>
+      </w:pPr>
+      <w:r>
+        <w:rPr>
+          <w:rFonts w:ascii="Consolas" w:hAnsi="Consolas" w:eastAsia="Consolas" w:cs="Consolas"/>
+          <w:sz w:val="15"/>
+          <w:noProof/>
+        </w:rPr>
+        <w:t>pd.DataFrame(diff_rows).to_csv(OUTPUT_DIR / 'Difference_main_bands.csv', index=False)</w:t>
+      </w:r>
+    </w:p>
+    <w:p>
+      <w:pPr>
+        <w:spacing w:before="0" w:after="0" w:line="240" w:lineRule="auto"/>
+      </w:pPr>
+      <w:r>
+        <w:rPr>
+          <w:rFonts w:ascii="Consolas" w:hAnsi="Consolas" w:eastAsia="Consolas" w:cs="Consolas"/>
+          <w:sz w:val="15"/>
+          <w:noProof/>
+        </w:rPr>
+      </w:r>
+    </w:p>
+    <w:p>
+      <w:pPr>
+        <w:spacing w:before="0" w:after="0" w:line="240" w:lineRule="auto"/>
+      </w:pPr>
+      <w:r>
+        <w:rPr>
+          <w:rFonts w:ascii="Consolas" w:hAnsi="Consolas" w:eastAsia="Consolas" w:cs="Consolas"/>
+          <w:sz w:val="15"/>
+          <w:noProof/>
+        </w:rPr>
+      </w:r>
+    </w:p>
+    <w:p>
+      <w:pPr>
+        <w:spacing w:before="0" w:after="0" w:line="240" w:lineRule="auto"/>
+      </w:pPr>
+      <w:r>
+        <w:rPr>
+          <w:rFonts w:ascii="Consolas" w:hAnsi="Consolas" w:eastAsia="Consolas" w:cs="Consolas"/>
+          <w:sz w:val="15"/>
+          <w:noProof/>
+        </w:rPr>
+        <w:t># ============================================================================</w:t>
+      </w:r>
+    </w:p>
+    <w:p>
+      <w:pPr>
+        <w:spacing w:before="0" w:after="0" w:line="240" w:lineRule="auto"/>
+      </w:pPr>
+      <w:r>
+        <w:rPr>
+          <w:rFonts w:ascii="Consolas" w:hAnsi="Consolas" w:eastAsia="Consolas" w:cs="Consolas"/>
+          <w:sz w:val="15"/>
+          <w:noProof/>
+        </w:rPr>
+        <w:t># STEP 8 - exact label-shuffling (permutation) test</w:t>
+      </w:r>
+    </w:p>
+    <w:p>
+      <w:pPr>
+        <w:spacing w:before="0" w:after="0" w:line="240" w:lineRule="auto"/>
+      </w:pPr>
+      <w:r>
+        <w:rPr>
+          <w:rFonts w:ascii="Consolas" w:hAnsi="Consolas" w:eastAsia="Consolas" w:cs="Consolas"/>
+          <w:sz w:val="15"/>
+          <w:noProof/>
+        </w:rPr>
+        <w:t># ============================================================================</w:t>
+      </w:r>
+    </w:p>
+    <w:p>
+      <w:pPr>
+        <w:spacing w:before="0" w:after="0" w:line="240" w:lineRule="auto"/>
+      </w:pPr>
+      <w:r>
+        <w:rPr>
+          <w:rFonts w:ascii="Consolas" w:hAnsi="Consolas" w:eastAsia="Consolas" w:cs="Consolas"/>
+          <w:sz w:val="15"/>
+          <w:noProof/>
+        </w:rPr>
+        <w:t># Question: could an accuracy this high appear by chance, given that only 12</w:t>
+      </w:r>
+    </w:p>
+    <w:p>
+      <w:pPr>
+        <w:spacing w:before="0" w:after="0" w:line="240" w:lineRule="auto"/>
+      </w:pPr>
+      <w:r>
+        <w:rPr>
+          <w:rFonts w:ascii="Consolas" w:hAnsi="Consolas" w:eastAsia="Consolas" w:cs="Consolas"/>
+          <w:sz w:val="15"/>
+          <w:noProof/>
+        </w:rPr>
+        <w:t># sites were measured? Every one of the 924 ways of calling 6 of the 12 sites</w:t>
+      </w:r>
+    </w:p>
+    <w:p>
+      <w:pPr>
+        <w:spacing w:before="0" w:after="0" w:line="240" w:lineRule="auto"/>
+      </w:pPr>
+      <w:r>
+        <w:rPr>
+          <w:rFonts w:ascii="Consolas" w:hAnsi="Consolas" w:eastAsia="Consolas" w:cs="Consolas"/>
+          <w:sz w:val="15"/>
+          <w:noProof/>
+        </w:rPr>
+        <w:t># "EV" (and the other 6 "NV") is tried; for each, the complete cross-validation</w:t>
+      </w:r>
+    </w:p>
+    <w:p>
+      <w:pPr>
+        <w:spacing w:before="0" w:after="0" w:line="240" w:lineRule="auto"/>
+      </w:pPr>
+      <w:r>
+        <w:rPr>
+          <w:rFonts w:ascii="Consolas" w:hAnsi="Consolas" w:eastAsia="Consolas" w:cs="Consolas"/>
+          <w:sz w:val="15"/>
+          <w:noProof/>
+        </w:rPr>
+        <w:t># of STEP 5 is repeated (new folds, new models). The real labeling is one of the</w:t>
+      </w:r>
+    </w:p>
+    <w:p>
+      <w:pPr>
+        <w:spacing w:before="0" w:after="0" w:line="240" w:lineRule="auto"/>
+      </w:pPr>
+      <w:r>
+        <w:rPr>
+          <w:rFonts w:ascii="Consolas" w:hAnsi="Consolas" w:eastAsia="Consolas" w:cs="Consolas"/>
+          <w:sz w:val="15"/>
+          <w:noProof/>
+        </w:rPr>
+        <w:t># 924. p = (number of labelings with accuracy &gt;= real accuracy) / 924.</w:t>
+      </w:r>
+    </w:p>
+    <w:p>
+      <w:pPr>
+        <w:spacing w:before="0" w:after="0" w:line="240" w:lineRule="auto"/>
+      </w:pPr>
+      <w:r>
+        <w:rPr>
+          <w:rFonts w:ascii="Consolas" w:hAnsi="Consolas" w:eastAsia="Consolas" w:cs="Consolas"/>
+          <w:sz w:val="15"/>
+          <w:noProof/>
+        </w:rPr>
+        <w:t># The smallest possible p with 6 + 6 sites is 1/924 = 0.0011 (or 2/924 = 0.0022</w:t>
+      </w:r>
+    </w:p>
+    <w:p>
+      <w:pPr>
+        <w:spacing w:before="0" w:after="0" w:line="240" w:lineRule="auto"/>
+      </w:pPr>
+      <w:r>
+        <w:rPr>
+          <w:rFonts w:ascii="Consolas" w:hAnsi="Consolas" w:eastAsia="Consolas" w:cs="Consolas"/>
+          <w:sz w:val="15"/>
+          <w:noProof/>
+        </w:rPr>
+        <w:t># if the mirror labeling, EV&lt;-&gt;NV swapped, scores the same).</w:t>
+      </w:r>
+    </w:p>
+    <w:p>
+      <w:pPr>
+        <w:spacing w:before="0" w:after="0" w:line="240" w:lineRule="auto"/>
+      </w:pPr>
+      <w:r>
+        <w:rPr>
+          <w:rFonts w:ascii="Consolas" w:hAnsi="Consolas" w:eastAsia="Consolas" w:cs="Consolas"/>
+          <w:sz w:val="15"/>
+          <w:noProof/>
+        </w:rPr>
+        <w:t>site_ids = np.array(sorted(set(sites)))</w:t>
+      </w:r>
+    </w:p>
+    <w:p>
+      <w:pPr>
+        <w:spacing w:before="0" w:after="0" w:line="240" w:lineRule="auto"/>
+      </w:pPr>
+      <w:r>
+        <w:rPr>
+          <w:rFonts w:ascii="Consolas" w:hAnsi="Consolas" w:eastAsia="Consolas" w:cs="Consolas"/>
+          <w:sz w:val="15"/>
+          <w:noProof/>
+        </w:rPr>
+        <w:t>perm_rows = []</w:t>
+      </w:r>
+    </w:p>
+    <w:p>
+      <w:pPr>
+        <w:spacing w:before="0" w:after="0" w:line="240" w:lineRule="auto"/>
+      </w:pPr>
+      <w:r>
+        <w:rPr>
+          <w:rFonts w:ascii="Consolas" w:hAnsi="Consolas" w:eastAsia="Consolas" w:cs="Consolas"/>
+          <w:sz w:val="15"/>
+          <w:noProof/>
+        </w:rPr>
+        <w:t>if N_PERM_MODE == 'exact':</w:t>
+      </w:r>
+    </w:p>
+    <w:p>
+      <w:pPr>
+        <w:spacing w:before="0" w:after="0" w:line="240" w:lineRule="auto"/>
+      </w:pPr>
+      <w:r>
+        <w:rPr>
+          <w:rFonts w:ascii="Consolas" w:hAnsi="Consolas" w:eastAsia="Consolas" w:cs="Consolas"/>
+          <w:sz w:val="15"/>
+          <w:noProof/>
+        </w:rPr>
+        <w:t xml:space="preserve">    report('\nSTEP 8 - exact permutation test (924 site labelings x 2 models x 2 regions)')</w:t>
+      </w:r>
+    </w:p>
+    <w:p>
+      <w:pPr>
+        <w:spacing w:before="0" w:after="0" w:line="240" w:lineRule="auto"/>
+      </w:pPr>
+      <w:r>
+        <w:rPr>
+          <w:rFonts w:ascii="Consolas" w:hAnsi="Consolas" w:eastAsia="Consolas" w:cs="Consolas"/>
+          <w:sz w:val="15"/>
+          <w:noProof/>
+        </w:rPr>
+        <w:t xml:space="preserve">    labelings = list(combinations(range(len(site_ids)), 6))</w:t>
+      </w:r>
+    </w:p>
+    <w:p>
+      <w:pPr>
+        <w:spacing w:before="0" w:after="0" w:line="240" w:lineRule="auto"/>
+      </w:pPr>
+      <w:r>
+        <w:rPr>
+          <w:rFonts w:ascii="Consolas" w:hAnsi="Consolas" w:eastAsia="Consolas" w:cs="Consolas"/>
+          <w:sz w:val="15"/>
+          <w:noProof/>
+        </w:rPr>
+        <w:t xml:space="preserve">    fig5, axs5 = plt.subplots(2, 2, figsize=(9, 7))</w:t>
+      </w:r>
+    </w:p>
+    <w:p>
+      <w:pPr>
+        <w:spacing w:before="0" w:after="0" w:line="240" w:lineRule="auto"/>
+      </w:pPr>
+      <w:r>
+        <w:rPr>
+          <w:rFonts w:ascii="Consolas" w:hAnsi="Consolas" w:eastAsia="Consolas" w:cs="Consolas"/>
+          <w:sz w:val="15"/>
+          <w:noProof/>
+        </w:rPr>
+        <w:t xml:space="preserve">    letters = iter('abcd')</w:t>
+      </w:r>
+    </w:p>
+    <w:p>
+      <w:pPr>
+        <w:spacing w:before="0" w:after="0" w:line="240" w:lineRule="auto"/>
+      </w:pPr>
+      <w:r>
+        <w:rPr>
+          <w:rFonts w:ascii="Consolas" w:hAnsi="Consolas" w:eastAsia="Consolas" w:cs="Consolas"/>
+          <w:sz w:val="15"/>
+          <w:noProof/>
+        </w:rPr>
+        <w:t xml:space="preserve">    for row, w in enumerate(['fingerprint', 'ch']):</w:t>
+      </w:r>
+    </w:p>
+    <w:p>
+      <w:pPr>
+        <w:spacing w:before="0" w:after="0" w:line="240" w:lineRule="auto"/>
+      </w:pPr>
+      <w:r>
+        <w:rPr>
+          <w:rFonts w:ascii="Consolas" w:hAnsi="Consolas" w:eastAsia="Consolas" w:cs="Consolas"/>
+          <w:sz w:val="15"/>
+          <w:noProof/>
+        </w:rPr>
+        <w:t xml:space="preserve">        X = data[w]</w:t>
+      </w:r>
+    </w:p>
+    <w:p>
+      <w:pPr>
+        <w:spacing w:before="0" w:after="0" w:line="240" w:lineRule="auto"/>
+      </w:pPr>
+      <w:r>
+        <w:rPr>
+          <w:rFonts w:ascii="Consolas" w:hAnsi="Consolas" w:eastAsia="Consolas" w:cs="Consolas"/>
+          <w:sz w:val="15"/>
+          <w:noProof/>
+        </w:rPr>
+        <w:t xml:space="preserve">        T_all = PCA(n_components=N_COMP, svd_solver='full').fit_transform(X)</w:t>
+      </w:r>
+    </w:p>
+    <w:p>
+      <w:pPr>
+        <w:spacing w:before="0" w:after="0" w:line="240" w:lineRule="auto"/>
+      </w:pPr>
+      <w:r>
+        <w:rPr>
+          <w:rFonts w:ascii="Consolas" w:hAnsi="Consolas" w:eastAsia="Consolas" w:cs="Consolas"/>
+          <w:sz w:val="15"/>
+          <w:noProof/>
+        </w:rPr>
+        <w:t xml:space="preserve">        accs = {'PCA-LDA': [], 'PLS-DA': []}</w:t>
+      </w:r>
+    </w:p>
+    <w:p>
+      <w:pPr>
+        <w:spacing w:before="0" w:after="0" w:line="240" w:lineRule="auto"/>
+      </w:pPr>
+      <w:r>
+        <w:rPr>
+          <w:rFonts w:ascii="Consolas" w:hAnsi="Consolas" w:eastAsia="Consolas" w:cs="Consolas"/>
+          <w:sz w:val="15"/>
+          <w:noProof/>
+        </w:rPr>
+        <w:t xml:space="preserve">        for k, ev_sites in enumerate(labelings):</w:t>
+      </w:r>
+    </w:p>
+    <w:p>
+      <w:pPr>
+        <w:spacing w:before="0" w:after="0" w:line="240" w:lineRule="auto"/>
+      </w:pPr>
+      <w:r>
+        <w:rPr>
+          <w:rFonts w:ascii="Consolas" w:hAnsi="Consolas" w:eastAsia="Consolas" w:cs="Consolas"/>
+          <w:sz w:val="15"/>
+          <w:noProof/>
+        </w:rPr>
+        <w:t xml:space="preserve">            lab_site = dict(zip(site_ids, [0 if i in ev_sites else 1 for i in range(len(site_ids))]))</w:t>
+      </w:r>
+    </w:p>
+    <w:p>
+      <w:pPr>
+        <w:spacing w:before="0" w:after="0" w:line="240" w:lineRule="auto"/>
+      </w:pPr>
+      <w:r>
+        <w:rPr>
+          <w:rFonts w:ascii="Consolas" w:hAnsi="Consolas" w:eastAsia="Consolas" w:cs="Consolas"/>
+          <w:sz w:val="15"/>
+          <w:noProof/>
+        </w:rPr>
+        <w:t xml:space="preserve">            yp = np.array([lab_site[s] for s in sites])</w:t>
+      </w:r>
+    </w:p>
+    <w:p>
+      <w:pPr>
+        <w:spacing w:before="0" w:after="0" w:line="240" w:lineRule="auto"/>
+      </w:pPr>
+      <w:r>
+        <w:rPr>
+          <w:rFonts w:ascii="Consolas" w:hAnsi="Consolas" w:eastAsia="Consolas" w:cs="Consolas"/>
+          <w:sz w:val="15"/>
+          <w:noProof/>
+        </w:rPr>
+        <w:t xml:space="preserve">            fp = list(StratifiedGroupKFold(n_splits=5, shuffle=True, random_state=CV_SEED)</w:t>
+      </w:r>
+    </w:p>
+    <w:p>
+      <w:pPr>
+        <w:spacing w:before="0" w:after="0" w:line="240" w:lineRule="auto"/>
+      </w:pPr>
+      <w:r>
+        <w:rPr>
+          <w:rFonts w:ascii="Consolas" w:hAnsi="Consolas" w:eastAsia="Consolas" w:cs="Consolas"/>
+          <w:sz w:val="15"/>
+          <w:noProof/>
+        </w:rPr>
+        <w:t xml:space="preserve">                      .split(np.zeros(len(yp)), yp, sites))</w:t>
+      </w:r>
+    </w:p>
+    <w:p>
+      <w:pPr>
+        <w:spacing w:before="0" w:after="0" w:line="240" w:lineRule="auto"/>
+      </w:pPr>
+      <w:r>
+        <w:rPr>
+          <w:rFonts w:ascii="Consolas" w:hAnsi="Consolas" w:eastAsia="Consolas" w:cs="Consolas"/>
+          <w:sz w:val="15"/>
+          <w:noProof/>
+        </w:rPr>
+        <w:t xml:space="preserve">            accs['PCA-LDA'].append((cv_pca_lda(X, labels=yp, folds_=fp, T=T_all) == yp).mean() * 100)</w:t>
+      </w:r>
+    </w:p>
+    <w:p>
+      <w:pPr>
+        <w:spacing w:before="0" w:after="0" w:line="240" w:lineRule="auto"/>
+      </w:pPr>
+      <w:r>
+        <w:rPr>
+          <w:rFonts w:ascii="Consolas" w:hAnsi="Consolas" w:eastAsia="Consolas" w:cs="Consolas"/>
+          <w:sz w:val="15"/>
+          <w:noProof/>
+        </w:rPr>
+        <w:t xml:space="preserve">            accs['PLS-DA'].append((cv_plsda(X, labels=yp, folds_=fp) == yp).mean() * 100)</w:t>
+      </w:r>
+    </w:p>
+    <w:p>
+      <w:pPr>
+        <w:spacing w:before="0" w:after="0" w:line="240" w:lineRule="auto"/>
+      </w:pPr>
+      <w:r>
+        <w:rPr>
+          <w:rFonts w:ascii="Consolas" w:hAnsi="Consolas" w:eastAsia="Consolas" w:cs="Consolas"/>
+          <w:sz w:val="15"/>
+          <w:noProof/>
+        </w:rPr>
+        <w:t xml:space="preserve">            if (k + 1) % 100 == 0:</w:t>
+      </w:r>
+    </w:p>
+    <w:p>
+      <w:pPr>
+        <w:spacing w:before="0" w:after="0" w:line="240" w:lineRule="auto"/>
+      </w:pPr>
+      <w:r>
+        <w:rPr>
+          <w:rFonts w:ascii="Consolas" w:hAnsi="Consolas" w:eastAsia="Consolas" w:cs="Consolas"/>
+          <w:sz w:val="15"/>
+          <w:noProof/>
+        </w:rPr>
+        <w:t xml:space="preserve">                print(f'  {w}: {k + 1}/{len(labelings)} labelings done')</w:t>
+      </w:r>
+    </w:p>
+    <w:p>
+      <w:pPr>
+        <w:spacing w:before="0" w:after="0" w:line="240" w:lineRule="auto"/>
+      </w:pPr>
+      <w:r>
+        <w:rPr>
+          <w:rFonts w:ascii="Consolas" w:hAnsi="Consolas" w:eastAsia="Consolas" w:cs="Consolas"/>
+          <w:sz w:val="15"/>
+          <w:noProof/>
+        </w:rPr>
+        <w:t xml:space="preserve">        for col, model in enumerate(['PCA-LDA', 'PLS-DA']):</w:t>
+      </w:r>
+    </w:p>
+    <w:p>
+      <w:pPr>
+        <w:spacing w:before="0" w:after="0" w:line="240" w:lineRule="auto"/>
+      </w:pPr>
+      <w:r>
+        <w:rPr>
+          <w:rFonts w:ascii="Consolas" w:hAnsi="Consolas" w:eastAsia="Consolas" w:cs="Consolas"/>
+          <w:sz w:val="15"/>
+          <w:noProof/>
+        </w:rPr>
+        <w:t xml:space="preserve">            a = np.array(accs[model])</w:t>
+      </w:r>
+    </w:p>
+    <w:p>
+      <w:pPr>
+        <w:spacing w:before="0" w:after="0" w:line="240" w:lineRule="auto"/>
+      </w:pPr>
+      <w:r>
+        <w:rPr>
+          <w:rFonts w:ascii="Consolas" w:hAnsi="Consolas" w:eastAsia="Consolas" w:cs="Consolas"/>
+          <w:sz w:val="15"/>
+          <w:noProof/>
+        </w:rPr>
+        <w:t xml:space="preserve">            obs = RES[w]['cv'][model]['acc']</w:t>
+      </w:r>
+    </w:p>
+    <w:p>
+      <w:pPr>
+        <w:spacing w:before="0" w:after="0" w:line="240" w:lineRule="auto"/>
+      </w:pPr>
+      <w:r>
+        <w:rPr>
+          <w:rFonts w:ascii="Consolas" w:hAnsi="Consolas" w:eastAsia="Consolas" w:cs="Consolas"/>
+          <w:sz w:val="15"/>
+          <w:noProof/>
+        </w:rPr>
+        <w:t xml:space="preserve">            p_perm = np.mean(a &gt;= obs - 1e-9)</w:t>
+      </w:r>
+    </w:p>
+    <w:p>
+      <w:pPr>
+        <w:spacing w:before="0" w:after="0" w:line="240" w:lineRule="auto"/>
+      </w:pPr>
+      <w:r>
+        <w:rPr>
+          <w:rFonts w:ascii="Consolas" w:hAnsi="Consolas" w:eastAsia="Consolas" w:cs="Consolas"/>
+          <w:sz w:val="15"/>
+          <w:noProof/>
+        </w:rPr>
+        <w:t xml:space="preserve">            RES[w].setdefault('perm', {})[model] = {'p': p_perm, 'median': np.median(a),</w:t>
+      </w:r>
+    </w:p>
+    <w:p>
+      <w:pPr>
+        <w:spacing w:before="0" w:after="0" w:line="240" w:lineRule="auto"/>
+      </w:pPr>
+      <w:r>
+        <w:rPr>
+          <w:rFonts w:ascii="Consolas" w:hAnsi="Consolas" w:eastAsia="Consolas" w:cs="Consolas"/>
+          <w:sz w:val="15"/>
+          <w:noProof/>
+        </w:rPr>
+        <w:t xml:space="preserve">                                                    'p95': np.percentile(a, 95), 'n': len(a)}</w:t>
+      </w:r>
+    </w:p>
+    <w:p>
+      <w:pPr>
+        <w:spacing w:before="0" w:after="0" w:line="240" w:lineRule="auto"/>
+      </w:pPr>
+      <w:r>
+        <w:rPr>
+          <w:rFonts w:ascii="Consolas" w:hAnsi="Consolas" w:eastAsia="Consolas" w:cs="Consolas"/>
+          <w:sz w:val="15"/>
+          <w:noProof/>
+        </w:rPr>
+        <w:t xml:space="preserve">            perm_rows.append({'Region': w, 'Model': model, 'Real accuracy (%)': round(obs, 1),</w:t>
+      </w:r>
+    </w:p>
+    <w:p>
+      <w:pPr>
+        <w:spacing w:before="0" w:after="0" w:line="240" w:lineRule="auto"/>
+      </w:pPr>
+      <w:r>
+        <w:rPr>
+          <w:rFonts w:ascii="Consolas" w:hAnsi="Consolas" w:eastAsia="Consolas" w:cs="Consolas"/>
+          <w:sz w:val="15"/>
+          <w:noProof/>
+        </w:rPr>
+        <w:t xml:space="preserve">                              'Shuffled: median (%)': round(np.median(a), 1),</w:t>
+      </w:r>
+    </w:p>
+    <w:p>
+      <w:pPr>
+        <w:spacing w:before="0" w:after="0" w:line="240" w:lineRule="auto"/>
+      </w:pPr>
+      <w:r>
+        <w:rPr>
+          <w:rFonts w:ascii="Consolas" w:hAnsi="Consolas" w:eastAsia="Consolas" w:cs="Consolas"/>
+          <w:sz w:val="15"/>
+          <w:noProof/>
+        </w:rPr>
+        <w:t xml:space="preserve">                              'Shuffled: 95th percentile (%)': round(np.percentile(a, 95), 1),</w:t>
+      </w:r>
+    </w:p>
+    <w:p>
+      <w:pPr>
+        <w:spacing w:before="0" w:after="0" w:line="240" w:lineRule="auto"/>
+      </w:pPr>
+      <w:r>
+        <w:rPr>
+          <w:rFonts w:ascii="Consolas" w:hAnsi="Consolas" w:eastAsia="Consolas" w:cs="Consolas"/>
+          <w:sz w:val="15"/>
+          <w:noProof/>
+        </w:rPr>
+        <w:t xml:space="preserve">                              'Shuffled: maximum (%)': round(a.max(), 1),</w:t>
+      </w:r>
+    </w:p>
+    <w:p>
+      <w:pPr>
+        <w:spacing w:before="0" w:after="0" w:line="240" w:lineRule="auto"/>
+      </w:pPr>
+      <w:r>
+        <w:rPr>
+          <w:rFonts w:ascii="Consolas" w:hAnsi="Consolas" w:eastAsia="Consolas" w:cs="Consolas"/>
+          <w:sz w:val="15"/>
+          <w:noProof/>
+        </w:rPr>
+        <w:t xml:space="preserve">                              'Labelings &gt;= real': int(np.sum(a &gt;= obs - 1e-9)),</w:t>
+      </w:r>
+    </w:p>
+    <w:p>
+      <w:pPr>
+        <w:spacing w:before="0" w:after="0" w:line="240" w:lineRule="auto"/>
+      </w:pPr>
+      <w:r>
+        <w:rPr>
+          <w:rFonts w:ascii="Consolas" w:hAnsi="Consolas" w:eastAsia="Consolas" w:cs="Consolas"/>
+          <w:sz w:val="15"/>
+          <w:noProof/>
+        </w:rPr>
+        <w:t xml:space="preserve">                              'Labelings tested': len(a), 'p (exact)': round(p_perm, 4)})</w:t>
+      </w:r>
+    </w:p>
+    <w:p>
+      <w:pPr>
+        <w:spacing w:before="0" w:after="0" w:line="240" w:lineRule="auto"/>
+      </w:pPr>
+      <w:r>
+        <w:rPr>
+          <w:rFonts w:ascii="Consolas" w:hAnsi="Consolas" w:eastAsia="Consolas" w:cs="Consolas"/>
+          <w:sz w:val="15"/>
+          <w:noProof/>
+        </w:rPr>
+        <w:t xml:space="preserve">            report(f'  {w:11s} {model}: real {obs:.1f} %; shuffled median {np.median(a):.1f} %, '</w:t>
+      </w:r>
+    </w:p>
+    <w:p>
+      <w:pPr>
+        <w:spacing w:before="0" w:after="0" w:line="240" w:lineRule="auto"/>
+      </w:pPr>
+      <w:r>
+        <w:rPr>
+          <w:rFonts w:ascii="Consolas" w:hAnsi="Consolas" w:eastAsia="Consolas" w:cs="Consolas"/>
+          <w:sz w:val="15"/>
+          <w:noProof/>
+        </w:rPr>
+        <w:t xml:space="preserve">                   f'95th percentile {np.percentile(a, 95):.1f} %, max {a.max():.1f} %; '</w:t>
+      </w:r>
+    </w:p>
+    <w:p>
+      <w:pPr>
+        <w:spacing w:before="0" w:after="0" w:line="240" w:lineRule="auto"/>
+      </w:pPr>
+      <w:r>
+        <w:rPr>
+          <w:rFonts w:ascii="Consolas" w:hAnsi="Consolas" w:eastAsia="Consolas" w:cs="Consolas"/>
+          <w:sz w:val="15"/>
+          <w:noProof/>
+        </w:rPr>
+        <w:t xml:space="preserve">                   f'{np.sum(a &gt;= obs - 1e-9)} of {len(a)} labelings &gt;= real -&gt; p = {p_perm:.4f}')</w:t>
+      </w:r>
+    </w:p>
+    <w:p>
+      <w:pPr>
+        <w:spacing w:before="0" w:after="0" w:line="240" w:lineRule="auto"/>
+      </w:pPr>
+      <w:r>
+        <w:rPr>
+          <w:rFonts w:ascii="Consolas" w:hAnsi="Consolas" w:eastAsia="Consolas" w:cs="Consolas"/>
+          <w:sz w:val="15"/>
+          <w:noProof/>
+        </w:rPr>
+        <w:t xml:space="preserve">            ax = axs5[row, col]</w:t>
+      </w:r>
+    </w:p>
+    <w:p>
+      <w:pPr>
+        <w:spacing w:before="0" w:after="0" w:line="240" w:lineRule="auto"/>
+      </w:pPr>
+      <w:r>
+        <w:rPr>
+          <w:rFonts w:ascii="Consolas" w:hAnsi="Consolas" w:eastAsia="Consolas" w:cs="Consolas"/>
+          <w:sz w:val="15"/>
+          <w:noProof/>
+        </w:rPr>
+        <w:t xml:space="preserve">            ax.hist(a, bins=np.arange(0, 102.5, 2.5), color='0.6', edgecolor='white')</w:t>
+      </w:r>
+    </w:p>
+    <w:p>
+      <w:pPr>
+        <w:spacing w:before="0" w:after="0" w:line="240" w:lineRule="auto"/>
+      </w:pPr>
+      <w:r>
+        <w:rPr>
+          <w:rFonts w:ascii="Consolas" w:hAnsi="Consolas" w:eastAsia="Consolas" w:cs="Consolas"/>
+          <w:sz w:val="15"/>
+          <w:noProof/>
+        </w:rPr>
+        <w:t xml:space="preserve">            ax.axvline(obs, color='#B5541C', lw=2)</w:t>
+      </w:r>
+    </w:p>
+    <w:p>
+      <w:pPr>
+        <w:spacing w:before="0" w:after="0" w:line="240" w:lineRule="auto"/>
+      </w:pPr>
+      <w:r>
+        <w:rPr>
+          <w:rFonts w:ascii="Consolas" w:hAnsi="Consolas" w:eastAsia="Consolas" w:cs="Consolas"/>
+          <w:sz w:val="15"/>
+          <w:noProof/>
+        </w:rPr>
+        <w:t xml:space="preserve">            ax.text(obs - 1, ax.get_ylim()[1] * 0.92, f'real\n{obs:.1f}%', ha='right', va='top',</w:t>
+      </w:r>
+    </w:p>
+    <w:p>
+      <w:pPr>
+        <w:spacing w:before="0" w:after="0" w:line="240" w:lineRule="auto"/>
+      </w:pPr>
+      <w:r>
+        <w:rPr>
+          <w:rFonts w:ascii="Consolas" w:hAnsi="Consolas" w:eastAsia="Consolas" w:cs="Consolas"/>
+          <w:sz w:val="15"/>
+          <w:noProof/>
+        </w:rPr>
+        <w:t xml:space="preserve">                    color='#B5541C', fontsize=10)</w:t>
+      </w:r>
+    </w:p>
+    <w:p>
+      <w:pPr>
+        <w:spacing w:before="0" w:after="0" w:line="240" w:lineRule="auto"/>
+      </w:pPr>
+      <w:r>
+        <w:rPr>
+          <w:rFonts w:ascii="Consolas" w:hAnsi="Consolas" w:eastAsia="Consolas" w:cs="Consolas"/>
+          <w:sz w:val="15"/>
+          <w:noProof/>
+        </w:rPr>
+        <w:t xml:space="preserve">            ax.set_xlim(0, 100)</w:t>
+      </w:r>
+    </w:p>
+    <w:p>
+      <w:pPr>
+        <w:spacing w:before="0" w:after="0" w:line="240" w:lineRule="auto"/>
+      </w:pPr>
+      <w:r>
+        <w:rPr>
+          <w:rFonts w:ascii="Consolas" w:hAnsi="Consolas" w:eastAsia="Consolas" w:cs="Consolas"/>
+          <w:sz w:val="15"/>
+          <w:noProof/>
+        </w:rPr>
+        <w:t xml:space="preserve">            ax.set_xlabel('Cross-validated accuracy (%)')</w:t>
+      </w:r>
+    </w:p>
+    <w:p>
+      <w:pPr>
+        <w:spacing w:before="0" w:after="0" w:line="240" w:lineRule="auto"/>
+      </w:pPr>
+      <w:r>
+        <w:rPr>
+          <w:rFonts w:ascii="Consolas" w:hAnsi="Consolas" w:eastAsia="Consolas" w:cs="Consolas"/>
+          <w:sz w:val="15"/>
+          <w:noProof/>
+        </w:rPr>
+        <w:t xml:space="preserve">            ax.set_ylabel('Number of site labelings')</w:t>
+      </w:r>
+    </w:p>
+    <w:p>
+      <w:pPr>
+        <w:spacing w:before="0" w:after="0" w:line="240" w:lineRule="auto"/>
+      </w:pPr>
+      <w:r>
+        <w:rPr>
+          <w:rFonts w:ascii="Consolas" w:hAnsi="Consolas" w:eastAsia="Consolas" w:cs="Consolas"/>
+          <w:sz w:val="15"/>
+          <w:noProof/>
+        </w:rPr>
+        <w:t xml:space="preserve">            ax.set_title(f'{model} - {"Fingerprint" if w == "fingerprint" else "CH-stretching"}'</w:t>
+      </w:r>
+    </w:p>
+    <w:p>
+      <w:pPr>
+        <w:spacing w:before="0" w:after="0" w:line="240" w:lineRule="auto"/>
+      </w:pPr>
+      <w:r>
+        <w:rPr>
+          <w:rFonts w:ascii="Consolas" w:hAnsi="Consolas" w:eastAsia="Consolas" w:cs="Consolas"/>
+          <w:sz w:val="15"/>
+          <w:noProof/>
+        </w:rPr>
+        <w:t xml:space="preserve">                         f'\np = {p_perm:.4f} ({len(a)} labelings)', fontsize=11)</w:t>
+      </w:r>
+    </w:p>
+    <w:p>
+      <w:pPr>
+        <w:spacing w:before="0" w:after="0" w:line="240" w:lineRule="auto"/>
+      </w:pPr>
+      <w:r>
+        <w:rPr>
+          <w:rFonts w:ascii="Consolas" w:hAnsi="Consolas" w:eastAsia="Consolas" w:cs="Consolas"/>
+          <w:sz w:val="15"/>
+          <w:noProof/>
+        </w:rPr>
+        <w:t xml:space="preserve">            ax.text(-0.18, 1.08, f'({next(letters)})', transform=ax.transAxes, fontsize=14,</w:t>
+      </w:r>
+    </w:p>
+    <w:p>
+      <w:pPr>
+        <w:spacing w:before="0" w:after="0" w:line="240" w:lineRule="auto"/>
+      </w:pPr>
+      <w:r>
+        <w:rPr>
+          <w:rFonts w:ascii="Consolas" w:hAnsi="Consolas" w:eastAsia="Consolas" w:cs="Consolas"/>
+          <w:sz w:val="15"/>
+          <w:noProof/>
+        </w:rPr>
+        <w:t xml:space="preserve">                    va='bottom')</w:t>
+      </w:r>
+    </w:p>
+    <w:p>
+      <w:pPr>
+        <w:spacing w:before="0" w:after="0" w:line="240" w:lineRule="auto"/>
+      </w:pPr>
+      <w:r>
+        <w:rPr>
+          <w:rFonts w:ascii="Consolas" w:hAnsi="Consolas" w:eastAsia="Consolas" w:cs="Consolas"/>
+          <w:sz w:val="15"/>
+          <w:noProof/>
+        </w:rPr>
+        <w:t xml:space="preserve">    fig5.tight_layout()</w:t>
+      </w:r>
+    </w:p>
+    <w:p>
+      <w:pPr>
+        <w:spacing w:before="0" w:after="0" w:line="240" w:lineRule="auto"/>
+      </w:pPr>
+      <w:r>
+        <w:rPr>
+          <w:rFonts w:ascii="Consolas" w:hAnsi="Consolas" w:eastAsia="Consolas" w:cs="Consolas"/>
+          <w:sz w:val="15"/>
+          <w:noProof/>
+        </w:rPr>
+        <w:t xml:space="preserve">    save_figure(fig5, 'Fig_Permutation')</w:t>
+      </w:r>
+    </w:p>
+    <w:p>
+      <w:pPr>
+        <w:spacing w:before="0" w:after="0" w:line="240" w:lineRule="auto"/>
+      </w:pPr>
+      <w:r>
+        <w:rPr>
+          <w:rFonts w:ascii="Consolas" w:hAnsi="Consolas" w:eastAsia="Consolas" w:cs="Consolas"/>
+          <w:sz w:val="15"/>
+          <w:noProof/>
+        </w:rPr>
+        <w:t xml:space="preserve">    pd.DataFrame(perm_rows).to_csv(OUTPUT_DIR / 'Permutation_test.csv', index=False)</w:t>
+      </w:r>
+    </w:p>
+    <w:p>
+      <w:pPr>
+        <w:spacing w:before="0" w:after="0" w:line="240" w:lineRule="auto"/>
+      </w:pPr>
+      <w:r>
+        <w:rPr>
+          <w:rFonts w:ascii="Consolas" w:hAnsi="Consolas" w:eastAsia="Consolas" w:cs="Consolas"/>
+          <w:sz w:val="15"/>
+          <w:noProof/>
+        </w:rPr>
+        <w:t>else:</w:t>
+      </w:r>
+    </w:p>
+    <w:p>
+      <w:pPr>
+        <w:spacing w:before="0" w:after="0" w:line="240" w:lineRule="auto"/>
+      </w:pPr>
+      <w:r>
+        <w:rPr>
+          <w:rFonts w:ascii="Consolas" w:hAnsi="Consolas" w:eastAsia="Consolas" w:cs="Consolas"/>
+          <w:sz w:val="15"/>
+          <w:noProof/>
+        </w:rPr>
+        <w:t xml:space="preserve">    report('\nSTEP 8 - permutation test skipped (N_PERM_MODE = "skip")')</w:t>
+      </w:r>
+    </w:p>
+    <w:p>
+      <w:pPr>
+        <w:spacing w:before="0" w:after="0" w:line="240" w:lineRule="auto"/>
+      </w:pPr>
+      <w:r>
+        <w:rPr>
+          <w:rFonts w:ascii="Consolas" w:hAnsi="Consolas" w:eastAsia="Consolas" w:cs="Consolas"/>
+          <w:sz w:val="15"/>
+          <w:noProof/>
+        </w:rPr>
+      </w:r>
+    </w:p>
+    <w:p>
+      <w:pPr>
+        <w:spacing w:before="0" w:after="0" w:line="240" w:lineRule="auto"/>
+      </w:pPr>
+      <w:r>
+        <w:rPr>
+          <w:rFonts w:ascii="Consolas" w:hAnsi="Consolas" w:eastAsia="Consolas" w:cs="Consolas"/>
+          <w:sz w:val="15"/>
+          <w:noProof/>
+        </w:rPr>
+      </w:r>
+    </w:p>
+    <w:p>
+      <w:pPr>
+        <w:spacing w:before="0" w:after="0" w:line="240" w:lineRule="auto"/>
+      </w:pPr>
+      <w:r>
+        <w:rPr>
+          <w:rFonts w:ascii="Consolas" w:hAnsi="Consolas" w:eastAsia="Consolas" w:cs="Consolas"/>
+          <w:sz w:val="15"/>
+          <w:noProof/>
+        </w:rPr>
+        <w:t># ============================================================================</w:t>
+      </w:r>
+    </w:p>
+    <w:p>
+      <w:pPr>
+        <w:spacing w:before="0" w:after="0" w:line="240" w:lineRule="auto"/>
+      </w:pPr>
+      <w:r>
+        <w:rPr>
+          <w:rFonts w:ascii="Consolas" w:hAnsi="Consolas" w:eastAsia="Consolas" w:cs="Consolas"/>
+          <w:sz w:val="15"/>
+          <w:noProof/>
+        </w:rPr>
+        <w:t># STEP 9 - the results in words (every number comes from this run)</w:t>
+      </w:r>
+    </w:p>
+    <w:p>
+      <w:pPr>
+        <w:spacing w:before="0" w:after="0" w:line="240" w:lineRule="auto"/>
+      </w:pPr>
+      <w:r>
+        <w:rPr>
+          <w:rFonts w:ascii="Consolas" w:hAnsi="Consolas" w:eastAsia="Consolas" w:cs="Consolas"/>
+          <w:sz w:val="15"/>
+          <w:noProof/>
+        </w:rPr>
+        <w:t># ============================================================================</w:t>
+      </w:r>
+    </w:p>
+    <w:p>
+      <w:pPr>
+        <w:spacing w:before="0" w:after="0" w:line="240" w:lineRule="auto"/>
+      </w:pPr>
+      <w:r>
+        <w:rPr>
+          <w:rFonts w:ascii="Consolas" w:hAnsi="Consolas" w:eastAsia="Consolas" w:cs="Consolas"/>
+          <w:sz w:val="15"/>
+          <w:noProof/>
+        </w:rPr>
+        <w:t>def region_name(w):</w:t>
+      </w:r>
+    </w:p>
+    <w:p>
+      <w:pPr>
+        <w:spacing w:before="0" w:after="0" w:line="240" w:lineRule="auto"/>
+      </w:pPr>
+      <w:r>
+        <w:rPr>
+          <w:rFonts w:ascii="Consolas" w:hAnsi="Consolas" w:eastAsia="Consolas" w:cs="Consolas"/>
+          <w:sz w:val="15"/>
+          <w:noProof/>
+        </w:rPr>
+        <w:t xml:space="preserve">    return 'fingerprint region (250-1790 cm-1)' if w == 'fingerprint' else \</w:t>
+      </w:r>
+    </w:p>
+    <w:p>
+      <w:pPr>
+        <w:spacing w:before="0" w:after="0" w:line="240" w:lineRule="auto"/>
+      </w:pPr>
+      <w:r>
+        <w:rPr>
+          <w:rFonts w:ascii="Consolas" w:hAnsi="Consolas" w:eastAsia="Consolas" w:cs="Consolas"/>
+          <w:sz w:val="15"/>
+          <w:noProof/>
+        </w:rPr>
+        <w:t xml:space="preserve">        'CH-stretching region (2760-3095 cm-1)'</w:t>
+      </w:r>
+    </w:p>
+    <w:p>
+      <w:pPr>
+        <w:spacing w:before="0" w:after="0" w:line="240" w:lineRule="auto"/>
+      </w:pPr>
+      <w:r>
+        <w:rPr>
+          <w:rFonts w:ascii="Consolas" w:hAnsi="Consolas" w:eastAsia="Consolas" w:cs="Consolas"/>
+          <w:sz w:val="15"/>
+          <w:noProof/>
+        </w:rPr>
+      </w:r>
+    </w:p>
+    <w:p>
+      <w:pPr>
+        <w:spacing w:before="0" w:after="0" w:line="240" w:lineRule="auto"/>
+      </w:pPr>
+      <w:r>
+        <w:rPr>
+          <w:rFonts w:ascii="Consolas" w:hAnsi="Consolas" w:eastAsia="Consolas" w:cs="Consolas"/>
+          <w:sz w:val="15"/>
+          <w:noProof/>
+        </w:rPr>
+      </w:r>
+    </w:p>
+    <w:p>
+      <w:pPr>
+        <w:spacing w:before="0" w:after="0" w:line="240" w:lineRule="auto"/>
+      </w:pPr>
+      <w:r>
+        <w:rPr>
+          <w:rFonts w:ascii="Consolas" w:hAnsi="Consolas" w:eastAsia="Consolas" w:cs="Consolas"/>
+          <w:sz w:val="15"/>
+          <w:noProof/>
+        </w:rPr>
+        <w:t>txt = ['RESULTS - Acacia EVs vs NVs on Ag/SiNWs (generated by Acacia_PCA_LDA_Explained.py)',</w:t>
+      </w:r>
+    </w:p>
+    <w:p>
+      <w:pPr>
+        <w:spacing w:before="0" w:after="0" w:line="240" w:lineRule="auto"/>
+      </w:pPr>
+      <w:r>
+        <w:rPr>
+          <w:rFonts w:ascii="Consolas" w:hAnsi="Consolas" w:eastAsia="Consolas" w:cs="Consolas"/>
+          <w:sz w:val="15"/>
+          <w:noProof/>
+        </w:rPr>
+        <w:t xml:space="preserve">       '=' * 78, '',</w:t>
+      </w:r>
+    </w:p>
+    <w:p>
+      <w:pPr>
+        <w:spacing w:before="0" w:after="0" w:line="240" w:lineRule="auto"/>
+      </w:pPr>
+      <w:r>
+        <w:rPr>
+          <w:rFonts w:ascii="Consolas" w:hAnsi="Consolas" w:eastAsia="Consolas" w:cs="Consolas"/>
+          <w:sz w:val="15"/>
+          <w:noProof/>
+        </w:rPr>
+        <w:t xml:space="preserve">       f'Data: {np.sum(y == 0)} EV and {np.sum(y == 1)} NV SERS spectra, 6 measurement sites per '</w:t>
+      </w:r>
+    </w:p>
+    <w:p>
+      <w:pPr>
+        <w:spacing w:before="0" w:after="0" w:line="240" w:lineRule="auto"/>
+      </w:pPr>
+      <w:r>
+        <w:rPr>
+          <w:rFonts w:ascii="Consolas" w:hAnsi="Consolas" w:eastAsia="Consolas" w:cs="Consolas"/>
+          <w:sz w:val="15"/>
+          <w:noProof/>
+        </w:rPr>
+        <w:t xml:space="preserve">       f'group, 20 spectra per site. Pre-processing: cosmic-ray removal, 2 cm-1 grid, '</w:t>
+      </w:r>
+    </w:p>
+    <w:p>
+      <w:pPr>
+        <w:spacing w:before="0" w:after="0" w:line="240" w:lineRule="auto"/>
+      </w:pPr>
+      <w:r>
+        <w:rPr>
+          <w:rFonts w:ascii="Consolas" w:hAnsi="Consolas" w:eastAsia="Consolas" w:cs="Consolas"/>
+          <w:sz w:val="15"/>
+          <w:noProof/>
+        </w:rPr>
+        <w:t xml:space="preserve">       f'Savitzky-Golay (11 pts, 3rd order), ALS baseline, SNV.', '']</w:t>
+      </w:r>
+    </w:p>
+    <w:p>
+      <w:pPr>
+        <w:spacing w:before="0" w:after="0" w:line="240" w:lineRule="auto"/>
+      </w:pPr>
+      <w:r>
+        <w:rPr>
+          <w:rFonts w:ascii="Consolas" w:hAnsi="Consolas" w:eastAsia="Consolas" w:cs="Consolas"/>
+          <w:sz w:val="15"/>
+          <w:noProof/>
+        </w:rPr>
+        <w:t>for w in ['fingerprint', 'ch']:</w:t>
+      </w:r>
+    </w:p>
+    <w:p>
+      <w:pPr>
+        <w:spacing w:before="0" w:after="0" w:line="240" w:lineRule="auto"/>
+      </w:pPr>
+      <w:r>
+        <w:rPr>
+          <w:rFonts w:ascii="Consolas" w:hAnsi="Consolas" w:eastAsia="Consolas" w:cs="Consolas"/>
+          <w:sz w:val="15"/>
+          <w:noProof/>
+        </w:rPr>
+        <w:t xml:space="preserve">    r = RES[w]</w:t>
+      </w:r>
+    </w:p>
+    <w:p>
+      <w:pPr>
+        <w:spacing w:before="0" w:after="0" w:line="240" w:lineRule="auto"/>
+      </w:pPr>
+      <w:r>
+        <w:rPr>
+          <w:rFonts w:ascii="Consolas" w:hAnsi="Consolas" w:eastAsia="Consolas" w:cs="Consolas"/>
+          <w:sz w:val="15"/>
+          <w:noProof/>
+        </w:rPr>
+        <w:t xml:space="preserve">    v = r['var']</w:t>
+      </w:r>
+    </w:p>
+    <w:p>
+      <w:pPr>
+        <w:spacing w:before="0" w:after="0" w:line="240" w:lineRule="auto"/>
+      </w:pPr>
+      <w:r>
+        <w:rPr>
+          <w:rFonts w:ascii="Consolas" w:hAnsi="Consolas" w:eastAsia="Consolas" w:cs="Consolas"/>
+          <w:sz w:val="15"/>
+          <w:noProof/>
+        </w:rPr>
+        <w:t xml:space="preserve">    pc1_side = GROUPS[0] if r['pc1_mean'][0] &gt; 0 else GROUPS[1]</w:t>
+      </w:r>
+    </w:p>
+    <w:p>
+      <w:pPr>
+        <w:spacing w:before="0" w:after="0" w:line="240" w:lineRule="auto"/>
+      </w:pPr>
+      <w:r>
+        <w:rPr>
+          <w:rFonts w:ascii="Consolas" w:hAnsi="Consolas" w:eastAsia="Consolas" w:cs="Consolas"/>
+          <w:sz w:val="15"/>
+          <w:noProof/>
+        </w:rPr>
+        <w:t xml:space="preserve">    txt += [f'--- {region_name(w).upper()} ---', '',</w:t>
+      </w:r>
+    </w:p>
+    <w:p>
+      <w:pPr>
+        <w:spacing w:before="0" w:after="0" w:line="240" w:lineRule="auto"/>
+      </w:pPr>
+      <w:r>
+        <w:rPr>
+          <w:rFonts w:ascii="Consolas" w:hAnsi="Consolas" w:eastAsia="Consolas" w:cs="Consolas"/>
+          <w:sz w:val="15"/>
+          <w:noProof/>
+        </w:rPr>
+        <w:t xml:space="preserve">            f'1. Unsupervised PCA. PC1 and PC2 explain {v[0]:.1f}% and {v[1]:.1f}% of the variance '</w:t>
+      </w:r>
+    </w:p>
+    <w:p>
+      <w:pPr>
+        <w:spacing w:before="0" w:after="0" w:line="240" w:lineRule="auto"/>
+      </w:pPr>
+      <w:r>
+        <w:rPr>
+          <w:rFonts w:ascii="Consolas" w:hAnsi="Consolas" w:eastAsia="Consolas" w:cs="Consolas"/>
+          <w:sz w:val="15"/>
+          <w:noProof/>
+        </w:rPr>
+        <w:t xml:space="preserve">            f'(PC1-PC5: {v[:N_COMP].sum():.1f}%). The groups separate mainly along PC1 '</w:t>
+      </w:r>
+    </w:p>
+    <w:p>
+      <w:pPr>
+        <w:spacing w:before="0" w:after="0" w:line="240" w:lineRule="auto"/>
+      </w:pPr>
+      <w:r>
+        <w:rPr>
+          <w:rFonts w:ascii="Consolas" w:hAnsi="Consolas" w:eastAsia="Consolas" w:cs="Consolas"/>
+          <w:sz w:val="15"/>
+          <w:noProof/>
+        </w:rPr>
+        <w:t xml:space="preserve">            f'(mean PC1 score: EVs {r["pc1_mean"][0]:+.2f}, NVs {r["pc1_mean"][1]:+.2f}), '</w:t>
+      </w:r>
+    </w:p>
+    <w:p>
+      <w:pPr>
+        <w:spacing w:before="0" w:after="0" w:line="240" w:lineRule="auto"/>
+      </w:pPr>
+      <w:r>
+        <w:rPr>
+          <w:rFonts w:ascii="Consolas" w:hAnsi="Consolas" w:eastAsia="Consolas" w:cs="Consolas"/>
+          <w:sz w:val="15"/>
+          <w:noProof/>
+        </w:rPr>
+        <w:t xml:space="preserve">            f'although the labels were not used.',</w:t>
+      </w:r>
+    </w:p>
+    <w:p>
+      <w:pPr>
+        <w:spacing w:before="0" w:after="0" w:line="240" w:lineRule="auto"/>
+      </w:pPr>
+      <w:r>
+        <w:rPr>
+          <w:rFonts w:ascii="Consolas" w:hAnsi="Consolas" w:eastAsia="Consolas" w:cs="Consolas"/>
+          <w:sz w:val="15"/>
+          <w:noProof/>
+        </w:rPr>
+        <w:t xml:space="preserve">            '   PC1 loading, main bands (cm-1; relatively stronger in): ' +</w:t>
+      </w:r>
+    </w:p>
+    <w:p>
+      <w:pPr>
+        <w:spacing w:before="0" w:after="0" w:line="240" w:lineRule="auto"/>
+      </w:pPr>
+      <w:r>
+        <w:rPr>
+          <w:rFonts w:ascii="Consolas" w:hAnsi="Consolas" w:eastAsia="Consolas" w:cs="Consolas"/>
+          <w:sz w:val="15"/>
+          <w:noProof/>
+        </w:rPr>
+        <w:t xml:space="preserve">            ', '.join(f'{wn:.0f} ({pc1_side if val &gt; 0 else ({GROUPS[0], GROUPS[1]} - {pc1_side}).pop()})'</w:t>
+      </w:r>
+    </w:p>
+    <w:p>
+      <w:pPr>
+        <w:spacing w:before="0" w:after="0" w:line="240" w:lineRule="auto"/>
+      </w:pPr>
+      <w:r>
+        <w:rPr>
+          <w:rFonts w:ascii="Consolas" w:hAnsi="Consolas" w:eastAsia="Consolas" w:cs="Consolas"/>
+          <w:sz w:val="15"/>
+          <w:noProof/>
+        </w:rPr>
+        <w:t xml:space="preserve">                      for wn, val in r['load_bands']) + '.',</w:t>
+      </w:r>
+    </w:p>
+    <w:p>
+      <w:pPr>
+        <w:spacing w:before="0" w:after="0" w:line="240" w:lineRule="auto"/>
+      </w:pPr>
+      <w:r>
+        <w:rPr>
+          <w:rFonts w:ascii="Consolas" w:hAnsi="Consolas" w:eastAsia="Consolas" w:cs="Consolas"/>
+          <w:sz w:val="15"/>
+          <w:noProof/>
+        </w:rPr>
+        <w:t xml:space="preserve">            '',</w:t>
+      </w:r>
+    </w:p>
+    <w:p>
+      <w:pPr>
+        <w:spacing w:before="0" w:after="0" w:line="240" w:lineRule="auto"/>
+      </w:pPr>
+      <w:r>
+        <w:rPr>
+          <w:rFonts w:ascii="Consolas" w:hAnsi="Consolas" w:eastAsia="Consolas" w:cs="Consolas"/>
+          <w:sz w:val="15"/>
+          <w:noProof/>
+        </w:rPr>
+        <w:t xml:space="preserve">            f'2. Difference spectrum NV - EV (site means, +/- 2 SE): the difference exceeds 2 SE '</w:t>
+      </w:r>
+    </w:p>
+    <w:p>
+      <w:pPr>
+        <w:spacing w:before="0" w:after="0" w:line="240" w:lineRule="auto"/>
+      </w:pPr>
+      <w:r>
+        <w:rPr>
+          <w:rFonts w:ascii="Consolas" w:hAnsi="Consolas" w:eastAsia="Consolas" w:cs="Consolas"/>
+          <w:sz w:val="15"/>
+          <w:noProof/>
+        </w:rPr>
+        <w:t xml:space="preserve">            f'at {r["diff_sig_frac"]:.0f}% of the wavenumbers. Largest consistent differences: ' +</w:t>
+      </w:r>
+    </w:p>
+    <w:p>
+      <w:pPr>
+        <w:spacing w:before="0" w:after="0" w:line="240" w:lineRule="auto"/>
+      </w:pPr>
+      <w:r>
+        <w:rPr>
+          <w:rFonts w:ascii="Consolas" w:hAnsi="Consolas" w:eastAsia="Consolas" w:cs="Consolas"/>
+          <w:sz w:val="15"/>
+          <w:noProof/>
+        </w:rPr>
+        <w:t xml:space="preserve">            ', '.join(f'{wn:.0f} ({"NVs" if val &gt; 0 else "EVs"} higher)'</w:t>
+      </w:r>
+    </w:p>
+    <w:p>
+      <w:pPr>
+        <w:spacing w:before="0" w:after="0" w:line="240" w:lineRule="auto"/>
+      </w:pPr>
+      <w:r>
+        <w:rPr>
+          <w:rFonts w:ascii="Consolas" w:hAnsi="Consolas" w:eastAsia="Consolas" w:cs="Consolas"/>
+          <w:sz w:val="15"/>
+          <w:noProof/>
+        </w:rPr>
+        <w:t xml:space="preserve">                      for wn, val in r['diff_bands']) + '.',</w:t>
+      </w:r>
+    </w:p>
+    <w:p>
+      <w:pPr>
+        <w:spacing w:before="0" w:after="0" w:line="240" w:lineRule="auto"/>
+      </w:pPr>
+      <w:r>
+        <w:rPr>
+          <w:rFonts w:ascii="Consolas" w:hAnsi="Consolas" w:eastAsia="Consolas" w:cs="Consolas"/>
+          <w:sz w:val="15"/>
+          <w:noProof/>
+        </w:rPr>
+        <w:t xml:space="preserve">            '   (Relative intensities after SNV normalisation, not absolute amounts.)', '',</w:t>
+      </w:r>
+    </w:p>
+    <w:p>
+      <w:pPr>
+        <w:spacing w:before="0" w:after="0" w:line="240" w:lineRule="auto"/>
+      </w:pPr>
+      <w:r>
+        <w:rPr>
+          <w:rFonts w:ascii="Consolas" w:hAnsi="Consolas" w:eastAsia="Consolas" w:cs="Consolas"/>
+          <w:sz w:val="15"/>
+          <w:noProof/>
+        </w:rPr>
+        <w:t xml:space="preserve">            f'3. PCA-LDA (5 PCs), displayed on all spectra: median canonical variable 1 '</w:t>
+      </w:r>
+    </w:p>
+    <w:p>
+      <w:pPr>
+        <w:spacing w:before="0" w:after="0" w:line="240" w:lineRule="auto"/>
+      </w:pPr>
+      <w:r>
+        <w:rPr>
+          <w:rFonts w:ascii="Consolas" w:hAnsi="Consolas" w:eastAsia="Consolas" w:cs="Consolas"/>
+          <w:sz w:val="15"/>
+          <w:noProof/>
+        </w:rPr>
+        <w:t xml:space="preserve">            f'{r["ld_median"][0]:+.2f} (EVs) vs {r["ld_median"][1]:+.2f} (NVs); Welch t-test on '</w:t>
+      </w:r>
+    </w:p>
+    <w:p>
+      <w:pPr>
+        <w:spacing w:before="0" w:after="0" w:line="240" w:lineRule="auto"/>
+      </w:pPr>
+      <w:r>
+        <w:rPr>
+          <w:rFonts w:ascii="Consolas" w:hAnsi="Consolas" w:eastAsia="Consolas" w:cs="Consolas"/>
+          <w:sz w:val="15"/>
+          <w:noProof/>
+        </w:rPr>
+        <w:t xml:space="preserve">            f'the 6 + 6 site means p = {r["p_ld1"]:.1e}. Descriptive only (LDA fitted on the same '</w:t>
+      </w:r>
+    </w:p>
+    <w:p>
+      <w:pPr>
+        <w:spacing w:before="0" w:after="0" w:line="240" w:lineRule="auto"/>
+      </w:pPr>
+      <w:r>
+        <w:rPr>
+          <w:rFonts w:ascii="Consolas" w:hAnsi="Consolas" w:eastAsia="Consolas" w:cs="Consolas"/>
+          <w:sz w:val="15"/>
+          <w:noProof/>
+        </w:rPr>
+        <w:t xml:space="preserve">            f'spectra).', '',</w:t>
+      </w:r>
+    </w:p>
+    <w:p>
+      <w:pPr>
+        <w:spacing w:before="0" w:after="0" w:line="240" w:lineRule="auto"/>
+      </w:pPr>
+      <w:r>
+        <w:rPr>
+          <w:rFonts w:ascii="Consolas" w:hAnsi="Consolas" w:eastAsia="Consolas" w:cs="Consolas"/>
+          <w:sz w:val="15"/>
+          <w:noProof/>
+        </w:rPr>
+        <w:t xml:space="preserve">            '4. Classification of new sites (5-fold cross-validation, whole sites left out):']</w:t>
+      </w:r>
+    </w:p>
+    <w:p>
+      <w:pPr>
+        <w:spacing w:before="0" w:after="0" w:line="240" w:lineRule="auto"/>
+      </w:pPr>
+      <w:r>
+        <w:rPr>
+          <w:rFonts w:ascii="Consolas" w:hAnsi="Consolas" w:eastAsia="Consolas" w:cs="Consolas"/>
+          <w:sz w:val="15"/>
+          <w:noProof/>
+        </w:rPr>
+        <w:t xml:space="preserve">    for model in ['PCA-LDA', 'PLS-DA']:</w:t>
+      </w:r>
+    </w:p>
+    <w:p>
+      <w:pPr>
+        <w:spacing w:before="0" w:after="0" w:line="240" w:lineRule="auto"/>
+      </w:pPr>
+      <w:r>
+        <w:rPr>
+          <w:rFonts w:ascii="Consolas" w:hAnsi="Consolas" w:eastAsia="Consolas" w:cs="Consolas"/>
+          <w:sz w:val="15"/>
+          <w:noProof/>
+        </w:rPr>
+        <w:t xml:space="preserve">        c = r['cv'][model]</w:t>
+      </w:r>
+    </w:p>
+    <w:p>
+      <w:pPr>
+        <w:spacing w:before="0" w:after="0" w:line="240" w:lineRule="auto"/>
+      </w:pPr>
+      <w:r>
+        <w:rPr>
+          <w:rFonts w:ascii="Consolas" w:hAnsi="Consolas" w:eastAsia="Consolas" w:cs="Consolas"/>
+          <w:sz w:val="15"/>
+          <w:noProof/>
+        </w:rPr>
+        <w:t xml:space="preserve">        txt.append(f'   {model}: accuracy {c["acc"]:.1f}% ({c["cm"][0, 0] + c["cm"][1, 1]}/'</w:t>
+      </w:r>
+    </w:p>
+    <w:p>
+      <w:pPr>
+        <w:spacing w:before="0" w:after="0" w:line="240" w:lineRule="auto"/>
+      </w:pPr>
+      <w:r>
+        <w:rPr>
+          <w:rFonts w:ascii="Consolas" w:hAnsi="Consolas" w:eastAsia="Consolas" w:cs="Consolas"/>
+          <w:sz w:val="15"/>
+          <w:noProof/>
+        </w:rPr>
+        <w:t xml:space="preserve">                   f'{c["cm"].sum()} spectra), sensitivity (NV) {c["sens"]:.1f}%, specificity (EV) '</w:t>
+      </w:r>
+    </w:p>
+    <w:p>
+      <w:pPr>
+        <w:spacing w:before="0" w:after="0" w:line="240" w:lineRule="auto"/>
+      </w:pPr>
+      <w:r>
+        <w:rPr>
+          <w:rFonts w:ascii="Consolas" w:hAnsi="Consolas" w:eastAsia="Consolas" w:cs="Consolas"/>
+          <w:sz w:val="15"/>
+          <w:noProof/>
+        </w:rPr>
+        <w:t xml:space="preserve">                   f'{c["spec"]:.1f}%; EVs {c["cm"][0, 0]}/120, NVs {c["cm"][1, 1]}/120 correct.')</w:t>
+      </w:r>
+    </w:p>
+    <w:p>
+      <w:pPr>
+        <w:spacing w:before="0" w:after="0" w:line="240" w:lineRule="auto"/>
+      </w:pPr>
+      <w:r>
+        <w:rPr>
+          <w:rFonts w:ascii="Consolas" w:hAnsi="Consolas" w:eastAsia="Consolas" w:cs="Consolas"/>
+          <w:sz w:val="15"/>
+          <w:noProof/>
+        </w:rPr>
+        <w:t xml:space="preserve">    txt.append(f'   Stricter check (PCA re-fitted inside each training fold): PCA-LDA '</w:t>
+      </w:r>
+    </w:p>
+    <w:p>
+      <w:pPr>
+        <w:spacing w:before="0" w:after="0" w:line="240" w:lineRule="auto"/>
+      </w:pPr>
+      <w:r>
+        <w:rPr>
+          <w:rFonts w:ascii="Consolas" w:hAnsi="Consolas" w:eastAsia="Consolas" w:cs="Consolas"/>
+          <w:sz w:val="15"/>
+          <w:noProof/>
+        </w:rPr>
+        <w:t xml:space="preserve">               f'{r["strict"]:.1f}%.')</w:t>
+      </w:r>
+    </w:p>
+    <w:p>
+      <w:pPr>
+        <w:spacing w:before="0" w:after="0" w:line="240" w:lineRule="auto"/>
+      </w:pPr>
+      <w:r>
+        <w:rPr>
+          <w:rFonts w:ascii="Consolas" w:hAnsi="Consolas" w:eastAsia="Consolas" w:cs="Consolas"/>
+          <w:sz w:val="15"/>
+          <w:noProof/>
+        </w:rPr>
+        <w:t xml:space="preserve">    if 'perm' in r:</w:t>
+      </w:r>
+    </w:p>
+    <w:p>
+      <w:pPr>
+        <w:spacing w:before="0" w:after="0" w:line="240" w:lineRule="auto"/>
+      </w:pPr>
+      <w:r>
+        <w:rPr>
+          <w:rFonts w:ascii="Consolas" w:hAnsi="Consolas" w:eastAsia="Consolas" w:cs="Consolas"/>
+          <w:sz w:val="15"/>
+          <w:noProof/>
+        </w:rPr>
+        <w:t xml:space="preserve">        txt += ['', '5. Exact permutation test (all 924 assignments of 6 of the 12 sites to "EV"):']</w:t>
+      </w:r>
+    </w:p>
+    <w:p>
+      <w:pPr>
+        <w:spacing w:before="0" w:after="0" w:line="240" w:lineRule="auto"/>
+      </w:pPr>
+      <w:r>
+        <w:rPr>
+          <w:rFonts w:ascii="Consolas" w:hAnsi="Consolas" w:eastAsia="Consolas" w:cs="Consolas"/>
+          <w:sz w:val="15"/>
+          <w:noProof/>
+        </w:rPr>
+        <w:t xml:space="preserve">        for model in ['PCA-LDA', 'PLS-DA']:</w:t>
+      </w:r>
+    </w:p>
+    <w:p>
+      <w:pPr>
+        <w:spacing w:before="0" w:after="0" w:line="240" w:lineRule="auto"/>
+      </w:pPr>
+      <w:r>
+        <w:rPr>
+          <w:rFonts w:ascii="Consolas" w:hAnsi="Consolas" w:eastAsia="Consolas" w:cs="Consolas"/>
+          <w:sz w:val="15"/>
+          <w:noProof/>
+        </w:rPr>
+        <w:t xml:space="preserve">            q = r['perm'][model]</w:t>
+      </w:r>
+    </w:p>
+    <w:p>
+      <w:pPr>
+        <w:spacing w:before="0" w:after="0" w:line="240" w:lineRule="auto"/>
+      </w:pPr>
+      <w:r>
+        <w:rPr>
+          <w:rFonts w:ascii="Consolas" w:hAnsi="Consolas" w:eastAsia="Consolas" w:cs="Consolas"/>
+          <w:sz w:val="15"/>
+          <w:noProof/>
+        </w:rPr>
+        <w:t xml:space="preserve">            txt.append(f'   {model}: shuffled labels give a median accuracy of {q["median"]:.1f}% '</w:t>
+      </w:r>
+    </w:p>
+    <w:p>
+      <w:pPr>
+        <w:spacing w:before="0" w:after="0" w:line="240" w:lineRule="auto"/>
+      </w:pPr>
+      <w:r>
+        <w:rPr>
+          <w:rFonts w:ascii="Consolas" w:hAnsi="Consolas" w:eastAsia="Consolas" w:cs="Consolas"/>
+          <w:sz w:val="15"/>
+          <w:noProof/>
+        </w:rPr>
+        <w:t xml:space="preserve">                       f'(95th percentile {q["p95"]:.1f}%); p = {q["p"]:.4f}.')</w:t>
+      </w:r>
+    </w:p>
+    <w:p>
+      <w:pPr>
+        <w:spacing w:before="0" w:after="0" w:line="240" w:lineRule="auto"/>
+      </w:pPr>
+      <w:r>
+        <w:rPr>
+          <w:rFonts w:ascii="Consolas" w:hAnsi="Consolas" w:eastAsia="Consolas" w:cs="Consolas"/>
+          <w:sz w:val="15"/>
+          <w:noProof/>
+        </w:rPr>
+        <w:t xml:space="preserve">    txt.append('')</w:t>
+      </w:r>
+    </w:p>
+    <w:p>
+      <w:pPr>
+        <w:spacing w:before="0" w:after="0" w:line="240" w:lineRule="auto"/>
+      </w:pPr>
+      <w:r>
+        <w:rPr>
+          <w:rFonts w:ascii="Consolas" w:hAnsi="Consolas" w:eastAsia="Consolas" w:cs="Consolas"/>
+          <w:sz w:val="15"/>
+          <w:noProof/>
+        </w:rPr>
+        <w:t>txt += ['--- WHAT THESE RESULTS DO AND DO NOT SHOW ---',</w:t>
+      </w:r>
+    </w:p>
+    <w:p>
+      <w:pPr>
+        <w:spacing w:before="0" w:after="0" w:line="240" w:lineRule="auto"/>
+      </w:pPr>
+      <w:r>
+        <w:rPr>
+          <w:rFonts w:ascii="Consolas" w:hAnsi="Consolas" w:eastAsia="Consolas" w:cs="Consolas"/>
+          <w:sz w:val="15"/>
+          <w:noProof/>
+        </w:rPr>
+        <w:t xml:space="preserve">        '* The EV and NV spectra differ reproducibly: a model trained on some sites classifies the '</w:t>
+      </w:r>
+    </w:p>
+    <w:p>
+      <w:pPr>
+        <w:spacing w:before="0" w:after="0" w:line="240" w:lineRule="auto"/>
+      </w:pPr>
+      <w:r>
+        <w:rPr>
+          <w:rFonts w:ascii="Consolas" w:hAnsi="Consolas" w:eastAsia="Consolas" w:cs="Consolas"/>
+          <w:sz w:val="15"/>
+          <w:noProof/>
+        </w:rPr>
+        <w:t xml:space="preserve">        'spectra of sites it has never seen with the accuracies above, far above the accuracies '</w:t>
+      </w:r>
+    </w:p>
+    <w:p>
+      <w:pPr>
+        <w:spacing w:before="0" w:after="0" w:line="240" w:lineRule="auto"/>
+      </w:pPr>
+      <w:r>
+        <w:rPr>
+          <w:rFonts w:ascii="Consolas" w:hAnsi="Consolas" w:eastAsia="Consolas" w:cs="Consolas"/>
+          <w:sz w:val="15"/>
+          <w:noProof/>
+        </w:rPr>
+        <w:t xml:space="preserve">        'obtained with shuffled labels.',</w:t>
+      </w:r>
+    </w:p>
+    <w:p>
+      <w:pPr>
+        <w:spacing w:before="0" w:after="0" w:line="240" w:lineRule="auto"/>
+      </w:pPr>
+      <w:r>
+        <w:rPr>
+          <w:rFonts w:ascii="Consolas" w:hAnsi="Consolas" w:eastAsia="Consolas" w:cs="Consolas"/>
+          <w:sz w:val="15"/>
+          <w:noProof/>
+        </w:rPr>
+        <w:t xml:space="preserve">        '* The independent unit is the measurement site (6 per group), not the spectrum (120 per '</w:t>
+      </w:r>
+    </w:p>
+    <w:p>
+      <w:pPr>
+        <w:spacing w:before="0" w:after="0" w:line="240" w:lineRule="auto"/>
+      </w:pPr>
+      <w:r>
+        <w:rPr>
+          <w:rFonts w:ascii="Consolas" w:hAnsi="Consolas" w:eastAsia="Consolas" w:cs="Consolas"/>
+          <w:sz w:val="15"/>
+          <w:noProof/>
+        </w:rPr>
+        <w:t xml:space="preserve">        'group). With 6 + 6 sites the smallest possible permutation p is 2/924 = 0.0022 (the real '</w:t>
+      </w:r>
+    </w:p>
+    <w:p>
+      <w:pPr>
+        <w:spacing w:before="0" w:after="0" w:line="240" w:lineRule="auto"/>
+      </w:pPr>
+      <w:r>
+        <w:rPr>
+          <w:rFonts w:ascii="Consolas" w:hAnsi="Consolas" w:eastAsia="Consolas" w:cs="Consolas"/>
+          <w:sz w:val="15"/>
+          <w:noProof/>
+        </w:rPr>
+        <w:t xml:space="preserve">        'labeling and its EV&lt;-&gt;NV mirror image give the same accuracy); p = 0.0022 means that no '</w:t>
+      </w:r>
+    </w:p>
+    <w:p>
+      <w:pPr>
+        <w:spacing w:before="0" w:after="0" w:line="240" w:lineRule="auto"/>
+      </w:pPr>
+      <w:r>
+        <w:rPr>
+          <w:rFonts w:ascii="Consolas" w:hAnsi="Consolas" w:eastAsia="Consolas" w:cs="Consolas"/>
+          <w:sz w:val="15"/>
+          <w:noProof/>
+        </w:rPr>
+        <w:t xml:space="preserve">        'other way of splitting the 12 sites reaches the real accuracy.',</w:t>
+      </w:r>
+    </w:p>
+    <w:p>
+      <w:pPr>
+        <w:spacing w:before="0" w:after="0" w:line="240" w:lineRule="auto"/>
+      </w:pPr>
+      <w:r>
+        <w:rPr>
+          <w:rFonts w:ascii="Consolas" w:hAnsi="Consolas" w:eastAsia="Consolas" w:cs="Consolas"/>
+          <w:sz w:val="15"/>
+          <w:noProof/>
+        </w:rPr>
+        <w:t xml:space="preserve">        '* If all EV spectra come from one preparation and all NV spectra from another, the '</w:t>
+      </w:r>
+    </w:p>
+    <w:p>
+      <w:pPr>
+        <w:spacing w:before="0" w:after="0" w:line="240" w:lineRule="auto"/>
+      </w:pPr>
+      <w:r>
+        <w:rPr>
+          <w:rFonts w:ascii="Consolas" w:hAnsi="Consolas" w:eastAsia="Consolas" w:cs="Consolas"/>
+          <w:sz w:val="15"/>
+          <w:noProof/>
+        </w:rPr>
+        <w:t xml:space="preserve">        'comparison cannot separate EV-vs-NV biology from preparation or measurement-session '</w:t>
+      </w:r>
+    </w:p>
+    <w:p>
+      <w:pPr>
+        <w:spacing w:before="0" w:after="0" w:line="240" w:lineRule="auto"/>
+      </w:pPr>
+      <w:r>
+        <w:rPr>
+          <w:rFonts w:ascii="Consolas" w:hAnsi="Consolas" w:eastAsia="Consolas" w:cs="Consolas"/>
+          <w:sz w:val="15"/>
+          <w:noProof/>
+        </w:rPr>
+        <w:t xml:space="preserve">        'effects; independent replicate preparations would address this.',</w:t>
+      </w:r>
+    </w:p>
+    <w:p>
+      <w:pPr>
+        <w:spacing w:before="0" w:after="0" w:line="240" w:lineRule="auto"/>
+      </w:pPr>
+      <w:r>
+        <w:rPr>
+          <w:rFonts w:ascii="Consolas" w:hAnsi="Consolas" w:eastAsia="Consolas" w:cs="Consolas"/>
+          <w:sz w:val="15"/>
+          <w:noProof/>
+        </w:rPr>
+        <w:t xml:space="preserve">        '* After SNV, band intensities are relative (composition), not absolute amounts.']</w:t>
+      </w:r>
+    </w:p>
+    <w:p>
+      <w:pPr>
+        <w:spacing w:before="0" w:after="0" w:line="240" w:lineRule="auto"/>
+      </w:pPr>
+      <w:r>
+        <w:rPr>
+          <w:rFonts w:ascii="Consolas" w:hAnsi="Consolas" w:eastAsia="Consolas" w:cs="Consolas"/>
+          <w:sz w:val="15"/>
+          <w:noProof/>
+        </w:rPr>
+        <w:t>(OUTPUT_DIR / 'RESULTS_for_manuscript.txt').write_text('\n'.join(txt) + '\n', encoding='utf-8')</w:t>
+      </w:r>
+    </w:p>
+    <w:p>
+      <w:pPr>
+        <w:spacing w:before="0" w:after="0" w:line="240" w:lineRule="auto"/>
+      </w:pPr>
+      <w:r>
+        <w:rPr>
+          <w:rFonts w:ascii="Consolas" w:hAnsi="Consolas" w:eastAsia="Consolas" w:cs="Consolas"/>
+          <w:sz w:val="15"/>
+          <w:noProof/>
+        </w:rPr>
+        <w:t>print('\n' + '\n'.join(txt))</w:t>
+      </w:r>
+    </w:p>
+    <w:p>
+      <w:pPr>
+        <w:spacing w:before="0" w:after="0" w:line="240" w:lineRule="auto"/>
+      </w:pPr>
+      <w:r>
+        <w:rPr>
+          <w:rFonts w:ascii="Consolas" w:hAnsi="Consolas" w:eastAsia="Consolas" w:cs="Consolas"/>
+          <w:sz w:val="15"/>
+          <w:noProof/>
+        </w:rPr>
       </w:r>
     </w:p>
     <w:p>

</xml_diff>